<commit_message>
docs(marketing): refresh x pack for w25
</commit_message>
<xml_diff>
--- a/marketing/x/playbook/wcdraft-x-playbook.docx
+++ b/marketing/x/playbook/wcdraft-x-playbook.docx
@@ -53,7 +53,7 @@
           <w:color w:val="2ECF92"/>
           <w:sz w:val="28"/>
         </w:rPr>
-        <w:t>Week 2026-W24</w:t>
+        <w:t>Week 2026-W25</w:t>
       </w:r>
     </w:p>
     <w:p>
@@ -66,7 +66,7 @@
           <w:color w:val="5D6B64"/>
           <w:sz w:val="21"/>
         </w:rPr>
-        <w:t>Generated 2026-06-14  ·  organic-only operator guide</w:t>
+        <w:t>Generated 2026-06-15  ·  organic-only operator guide</w:t>
       </w:r>
     </w:p>
     <w:p>
@@ -519,7 +519,7 @@
           <w:color w:val="2ECF92"/>
           <w:sz w:val="34"/>
         </w:rPr>
-        <w:t>This week's posts (W24)</w:t>
+        <w:t>This week's posts (W25)</w:t>
       </w:r>
     </w:p>
     <w:p>
@@ -533,7 +533,7 @@
           <w:color w:val="5D6B64"/>
           <w:sz w:val="21"/>
         </w:rPr>
-        <w:t>43 ready-to-paste posts, grouped by day. Pick the strongest 3–5 per day — you don't post them all. Copy one block, paste into the composer, schedule.</w:t>
+        <w:t>42 ready-to-paste posts, grouped by day. Pick the strongest 3–5 per day — you don't post them all. Copy one block, paste into the composer, schedule.</w:t>
       </w:r>
     </w:p>
     <w:p>
@@ -585,6 +585,317 @@
           <w:color w:val="16211D"/>
           <w:sz w:val="19"/>
         </w:rPr>
+        <w:t>Players from the same nation build Synergy — a live preview shows your XI's connections as you draft. Filter by position and search by name — in the draft. https://www.wcdraft.com/play</w:t>
+      </w:r>
+    </w:p>
+    <w:p>
+      <w:pPr>
+        <w:spacing w:before="40" w:after="200"/>
+      </w:pPr>
+      <w:r>
+        <w:rPr>
+          <w:rFonts w:ascii="Calibri" w:hAnsi="Calibri"/>
+          <w:b/>
+          <w:color w:val="F5B62A"/>
+          <w:sz w:val="17"/>
+        </w:rPr>
+        <w:t>179/280 chars</w:t>
+      </w:r>
+    </w:p>
+    <w:p>
+      <w:pPr>
+        <w:spacing w:before="160" w:after="40"/>
+      </w:pPr>
+      <w:r>
+        <w:rPr>
+          <w:rFonts w:ascii="Calibri" w:hAnsi="Calibri"/>
+          <w:b/>
+          <w:color w:val="5D6B64"/>
+          <w:sz w:val="18"/>
+        </w:rPr>
+        <w:t>Monday · 2 · daily challenge</w:t>
+      </w:r>
+    </w:p>
+    <w:p>
+      <w:pPr>
+        <w:spacing w:before="0" w:after="0" w:line="283" w:lineRule="auto"/>
+        <w:shd w:val="clear" w:color="auto" w:fill="F3F7F4"/>
+        <w:pBdr>
+          <w:top w:val="single" w:sz="8" w:space="8" w:color="CFE7DB"/>
+          <w:bottom w:val="single" w:sz="8" w:space="8" w:color="CFE7DB"/>
+          <w:left w:val="single" w:sz="8" w:space="8" w:color="CFE7DB"/>
+          <w:right w:val="single" w:sz="8" w:space="8" w:color="CFE7DB"/>
+        </w:pBdr>
+      </w:pPr>
+      <w:r>
+        <w:rPr>
+          <w:rFonts w:ascii="Consolas" w:hAnsi="Consolas"/>
+          <w:b w:val="0"/>
+          <w:color w:val="16211D"/>
+          <w:sz w:val="19"/>
+        </w:rPr>
+        <w:t>Group G/H openers are the cue: Belgium v Egypt and Spain v Cape Verde. Pick a 2026 squad, draft from memory, reveal after sim. https://www.wcdraft.com/play</w:t>
+      </w:r>
+    </w:p>
+    <w:p>
+      <w:pPr>
+        <w:spacing w:before="40" w:after="200"/>
+      </w:pPr>
+      <w:r>
+        <w:rPr>
+          <w:rFonts w:ascii="Calibri" w:hAnsi="Calibri"/>
+          <w:b/>
+          <w:color w:val="F5B62A"/>
+          <w:sz w:val="17"/>
+        </w:rPr>
+        <w:t>150/280 chars</w:t>
+      </w:r>
+    </w:p>
+    <w:p>
+      <w:pPr>
+        <w:spacing w:before="160" w:after="40"/>
+      </w:pPr>
+      <w:r>
+        <w:rPr>
+          <w:rFonts w:ascii="Calibri" w:hAnsi="Calibri"/>
+          <w:b/>
+          <w:color w:val="5D6B64"/>
+          <w:sz w:val="18"/>
+        </w:rPr>
+        <w:t>Monday · 3 · factoid</w:t>
+      </w:r>
+    </w:p>
+    <w:p>
+      <w:pPr>
+        <w:spacing w:before="0" w:after="0" w:line="283" w:lineRule="auto"/>
+        <w:shd w:val="clear" w:color="auto" w:fill="F3F7F4"/>
+        <w:pBdr>
+          <w:top w:val="single" w:sz="8" w:space="8" w:color="CFE7DB"/>
+          <w:bottom w:val="single" w:sz="8" w:space="8" w:color="CFE7DB"/>
+          <w:left w:val="single" w:sz="8" w:space="8" w:color="CFE7DB"/>
+          <w:right w:val="single" w:sz="8" w:space="8" w:color="CFE7DB"/>
+        </w:pBdr>
+      </w:pPr>
+      <w:r>
+        <w:rPr>
+          <w:rFonts w:ascii="Consolas" w:hAnsi="Consolas"/>
+          <w:b w:val="0"/>
+          <w:color w:val="16211D"/>
+          <w:sz w:val="19"/>
+        </w:rPr>
+        <w:t>Rate players on their whole career, or just that tournament. Rivaldo (BRA), 2002: a midfielder with 7 appearances that World Cup — in the wcdraft pool. https://www.wcdraft.com/play</w:t>
+      </w:r>
+    </w:p>
+    <w:p>
+      <w:pPr>
+        <w:spacing w:before="40" w:after="200"/>
+      </w:pPr>
+      <w:r>
+        <w:rPr>
+          <w:rFonts w:ascii="Calibri" w:hAnsi="Calibri"/>
+          <w:b/>
+          <w:color w:val="F5B62A"/>
+          <w:sz w:val="17"/>
+        </w:rPr>
+        <w:t>175/280 chars</w:t>
+      </w:r>
+    </w:p>
+    <w:p>
+      <w:pPr>
+        <w:spacing w:before="160" w:after="40"/>
+      </w:pPr>
+      <w:r>
+        <w:rPr>
+          <w:rFonts w:ascii="Calibri" w:hAnsi="Calibri"/>
+          <w:b/>
+          <w:color w:val="5D6B64"/>
+          <w:sz w:val="18"/>
+        </w:rPr>
+        <w:t>Monday · 4 · feature pitch</w:t>
+      </w:r>
+    </w:p>
+    <w:p>
+      <w:pPr>
+        <w:spacing w:before="0" w:after="0" w:line="283" w:lineRule="auto"/>
+        <w:shd w:val="clear" w:color="auto" w:fill="F3F7F4"/>
+        <w:pBdr>
+          <w:top w:val="single" w:sz="8" w:space="8" w:color="CFE7DB"/>
+          <w:bottom w:val="single" w:sz="8" w:space="8" w:color="CFE7DB"/>
+          <w:left w:val="single" w:sz="8" w:space="8" w:color="CFE7DB"/>
+          <w:right w:val="single" w:sz="8" w:space="8" w:color="CFE7DB"/>
+        </w:pBdr>
+      </w:pPr>
+      <w:r>
+        <w:rPr>
+          <w:rFonts w:ascii="Consolas" w:hAnsi="Consolas"/>
+          <w:b w:val="0"/>
+          <w:color w:val="16211D"/>
+          <w:sz w:val="19"/>
+        </w:rPr>
+        <w:t>Your XI plays the real 2026 World Cup bracket — 8 matches through the knockouts — in a calibrated match simulation. A perfect run is 8-0. https://www.wcdraft.com/play</w:t>
+      </w:r>
+    </w:p>
+    <w:p>
+      <w:pPr>
+        <w:spacing w:before="40" w:after="200"/>
+      </w:pPr>
+      <w:r>
+        <w:rPr>
+          <w:rFonts w:ascii="Calibri" w:hAnsi="Calibri"/>
+          <w:b/>
+          <w:color w:val="F5B62A"/>
+          <w:sz w:val="17"/>
+        </w:rPr>
+        <w:t>161/280 chars</w:t>
+      </w:r>
+    </w:p>
+    <w:p>
+      <w:pPr>
+        <w:spacing w:before="160" w:after="40"/>
+      </w:pPr>
+      <w:r>
+        <w:rPr>
+          <w:rFonts w:ascii="Calibri" w:hAnsi="Calibri"/>
+          <w:b/>
+          <w:color w:val="5D6B64"/>
+          <w:sz w:val="18"/>
+        </w:rPr>
+        <w:t>Monday · 5 · daily challenge</w:t>
+      </w:r>
+    </w:p>
+    <w:p>
+      <w:pPr>
+        <w:spacing w:before="0" w:after="0" w:line="283" w:lineRule="auto"/>
+        <w:shd w:val="clear" w:color="auto" w:fill="F3F7F4"/>
+        <w:pBdr>
+          <w:top w:val="single" w:sz="8" w:space="8" w:color="CFE7DB"/>
+          <w:bottom w:val="single" w:sz="8" w:space="8" w:color="CFE7DB"/>
+          <w:left w:val="single" w:sz="8" w:space="8" w:color="CFE7DB"/>
+          <w:right w:val="single" w:sz="8" w:space="8" w:color="CFE7DB"/>
+        </w:pBdr>
+      </w:pPr>
+      <w:r>
+        <w:rPr>
+          <w:rFonts w:ascii="Consolas" w:hAnsi="Consolas"/>
+          <w:b w:val="0"/>
+          <w:color w:val="16211D"/>
+          <w:sz w:val="19"/>
+        </w:rPr>
+        <w:t>Argentina 1978 just rolled. One pick — who makes your all-time XI? Two ways to value a player: Career or Current. https://www.wcdraft.com/play</w:t>
+      </w:r>
+    </w:p>
+    <w:p>
+      <w:pPr>
+        <w:spacing w:before="40" w:after="200"/>
+      </w:pPr>
+      <w:r>
+        <w:rPr>
+          <w:rFonts w:ascii="Calibri" w:hAnsi="Calibri"/>
+          <w:b/>
+          <w:color w:val="F5B62A"/>
+          <w:sz w:val="17"/>
+        </w:rPr>
+        <w:t>137/280 chars</w:t>
+      </w:r>
+    </w:p>
+    <w:p>
+      <w:pPr>
+        <w:spacing w:before="160" w:after="40"/>
+      </w:pPr>
+      <w:r>
+        <w:rPr>
+          <w:rFonts w:ascii="Calibri" w:hAnsi="Calibri"/>
+          <w:b/>
+          <w:color w:val="5D6B64"/>
+          <w:sz w:val="18"/>
+        </w:rPr>
+        <w:t>Monday · 6 · factoid</w:t>
+      </w:r>
+    </w:p>
+    <w:p>
+      <w:pPr>
+        <w:spacing w:before="0" w:after="0" w:line="283" w:lineRule="auto"/>
+        <w:shd w:val="clear" w:color="auto" w:fill="F3F7F4"/>
+        <w:pBdr>
+          <w:top w:val="single" w:sz="8" w:space="8" w:color="CFE7DB"/>
+          <w:bottom w:val="single" w:sz="8" w:space="8" w:color="CFE7DB"/>
+          <w:left w:val="single" w:sz="8" w:space="8" w:color="CFE7DB"/>
+          <w:right w:val="single" w:sz="8" w:space="8" w:color="CFE7DB"/>
+        </w:pBdr>
+      </w:pPr>
+      <w:r>
+        <w:rPr>
+          <w:rFonts w:ascii="Consolas" w:hAnsi="Consolas"/>
+          <w:b w:val="0"/>
+          <w:color w:val="16211D"/>
+          <w:sz w:val="19"/>
+        </w:rPr>
+        <w:t>Two ways to draft: by squad, or by position. Raúl (ESP), 1998: a forward with 3 appearances that World Cup — in the wcdraft pool. https://www.wcdraft.com/play</w:t>
+      </w:r>
+    </w:p>
+    <w:p>
+      <w:pPr>
+        <w:spacing w:before="40" w:after="200"/>
+      </w:pPr>
+      <w:r>
+        <w:rPr>
+          <w:rFonts w:ascii="Calibri" w:hAnsi="Calibri"/>
+          <w:b/>
+          <w:color w:val="F5B62A"/>
+          <w:sz w:val="17"/>
+        </w:rPr>
+        <w:t>153/280 chars</w:t>
+      </w:r>
+    </w:p>
+    <w:p>
+      <w:pPr>
+        <w:spacing w:before="220" w:after="100"/>
+        <w:pBdr>
+          <w:left w:val="single" w:sz="18" w:space="6" w:color="F5B62A"/>
+        </w:pBdr>
+      </w:pPr>
+      <w:r>
+        <w:rPr>
+          <w:rFonts w:ascii="Calibri" w:hAnsi="Calibri"/>
+          <w:b/>
+          <w:color w:val="16211D"/>
+          <w:sz w:val="25"/>
+        </w:rPr>
+        <w:t>Tuesday</w:t>
+      </w:r>
+    </w:p>
+    <w:p>
+      <w:pPr>
+        <w:spacing w:before="160" w:after="40"/>
+      </w:pPr>
+      <w:r>
+        <w:rPr>
+          <w:rFonts w:ascii="Calibri" w:hAnsi="Calibri"/>
+          <w:b/>
+          <w:color w:val="5D6B64"/>
+          <w:sz w:val="18"/>
+        </w:rPr>
+        <w:t>Tuesday · 1 · feature pitch</w:t>
+      </w:r>
+    </w:p>
+    <w:p>
+      <w:pPr>
+        <w:spacing w:before="0" w:after="0" w:line="283" w:lineRule="auto"/>
+        <w:shd w:val="clear" w:color="auto" w:fill="F3F7F4"/>
+        <w:pBdr>
+          <w:top w:val="single" w:sz="8" w:space="8" w:color="CFE7DB"/>
+          <w:bottom w:val="single" w:sz="8" w:space="8" w:color="CFE7DB"/>
+          <w:left w:val="single" w:sz="8" w:space="8" w:color="CFE7DB"/>
+          <w:right w:val="single" w:sz="8" w:space="8" w:color="CFE7DB"/>
+        </w:pBdr>
+      </w:pPr>
+      <w:r>
+        <w:rPr>
+          <w:rFonts w:ascii="Consolas" w:hAnsi="Consolas"/>
+          <w:b w:val="0"/>
+          <w:color w:val="16211D"/>
+          <w:sz w:val="19"/>
+        </w:rPr>
         <w:t>Filter the rolled squad by position and search players by name, right inside the draft. https://www.wcdraft.com/play</w:t>
       </w:r>
     </w:p>
@@ -613,7 +924,7 @@
           <w:color w:val="5D6B64"/>
           <w:sz w:val="18"/>
         </w:rPr>
-        <w:t>Monday · 2 · daily challenge</w:t>
+        <w:t>Tuesday · 2 · daily challenge</w:t>
       </w:r>
     </w:p>
     <w:p>
@@ -634,7 +945,7 @@
           <w:color w:val="16211D"/>
           <w:sz w:val="19"/>
         </w:rPr>
-        <w:t>Today's spin: Belgium 2014. Who's your pick? Four era presets: All-time, Post-2000, Post-2010, Modern. https://www.wcdraft.com/play</w:t>
+        <w:t>Group I opens today: France v Senegal, Iraq v Norway. Spin one of those squad-years and see if your XI survives all 8 matches. https://www.wcdraft.com/play</w:t>
       </w:r>
     </w:p>
     <w:p>
@@ -648,7 +959,7 @@
           <w:color w:val="F5B62A"/>
           <w:sz w:val="17"/>
         </w:rPr>
-        <w:t>126/280 chars</w:t>
+        <w:t>150/280 chars</w:t>
       </w:r>
     </w:p>
     <w:p>
@@ -662,7 +973,7 @@
           <w:color w:val="5D6B64"/>
           <w:sz w:val="18"/>
         </w:rPr>
-        <w:t>Monday · 3 · factoid</w:t>
+        <w:t>Tuesday · 3 · factoid</w:t>
       </w:r>
     </w:p>
     <w:p>
@@ -683,7 +994,7 @@
           <w:color w:val="16211D"/>
           <w:sz w:val="19"/>
         </w:rPr>
-        <w:t>No app store, no install — just open it and draft. Ramos (ESP) — a wcdraft all-time legend from the 2018 World Cup squad: a defender you can draft into your all-time XI. https://www.wcdraft.com/play</w:t>
+        <w:t>Draft across 1930–2026, or narrow to one era. Ramos (ESP) — a wcdraft all-time legend from the 2018 World Cup squad: a defender you can draft into your all-time XI. https://www.wcdraft.com/play</w:t>
       </w:r>
     </w:p>
     <w:p>
@@ -697,7 +1008,7 @@
           <w:color w:val="F5B62A"/>
           <w:sz w:val="17"/>
         </w:rPr>
-        <w:t>193/280 chars</w:t>
+        <w:t>188/280 chars</w:t>
       </w:r>
     </w:p>
     <w:p>
@@ -711,7 +1022,7 @@
           <w:color w:val="5D6B64"/>
           <w:sz w:val="18"/>
         </w:rPr>
-        <w:t>Monday · 4 · feature pitch</w:t>
+        <w:t>Tuesday · 4 · feature pitch</w:t>
       </w:r>
     </w:p>
     <w:p>
@@ -732,7 +1043,367 @@
           <w:color w:val="16211D"/>
           <w:sz w:val="19"/>
         </w:rPr>
-        <w:t>Seventeen spins, one pick on each: sixteen players for your XI and bench, plus one manager. https://www.wcdraft.com/play</w:t>
+        <w:t>wcdraft is free and runs entirely in your browser — no app, no download, no account needed to play. Four era presets: All-time, Post-2000, Post-2010, Modern. https://www.wcdraft.com/play</w:t>
+      </w:r>
+    </w:p>
+    <w:p>
+      <w:pPr>
+        <w:spacing w:before="40" w:after="200"/>
+      </w:pPr>
+      <w:r>
+        <w:rPr>
+          <w:rFonts w:ascii="Calibri" w:hAnsi="Calibri"/>
+          <w:b/>
+          <w:color w:val="F5B62A"/>
+          <w:sz w:val="17"/>
+        </w:rPr>
+        <w:t>181/280 chars</w:t>
+      </w:r>
+    </w:p>
+    <w:p>
+      <w:pPr>
+        <w:spacing w:before="160" w:after="40"/>
+      </w:pPr>
+      <w:r>
+        <w:rPr>
+          <w:rFonts w:ascii="Calibri" w:hAnsi="Calibri"/>
+          <w:b/>
+          <w:color w:val="5D6B64"/>
+          <w:sz w:val="18"/>
+        </w:rPr>
+        <w:t>Tuesday · 5 · daily challenge</w:t>
+      </w:r>
+    </w:p>
+    <w:p>
+      <w:pPr>
+        <w:spacing w:before="0" w:after="0" w:line="283" w:lineRule="auto"/>
+        <w:shd w:val="clear" w:color="auto" w:fill="F3F7F4"/>
+        <w:pBdr>
+          <w:top w:val="single" w:sz="8" w:space="8" w:color="CFE7DB"/>
+          <w:bottom w:val="single" w:sz="8" w:space="8" w:color="CFE7DB"/>
+          <w:left w:val="single" w:sz="8" w:space="8" w:color="CFE7DB"/>
+          <w:right w:val="single" w:sz="8" w:space="8" w:color="CFE7DB"/>
+        </w:pBdr>
+      </w:pPr>
+      <w:r>
+        <w:rPr>
+          <w:rFonts w:ascii="Consolas" w:hAnsi="Consolas"/>
+          <w:b w:val="0"/>
+          <w:color w:val="16211D"/>
+          <w:sz w:val="19"/>
+        </w:rPr>
+        <w:t>Run the real 2026 bracket — 8 matches, a perfect run is 8-0. Today's seed: Mexico 1994 — spin it and pick. https://www.wcdraft.com/play</w:t>
+      </w:r>
+    </w:p>
+    <w:p>
+      <w:pPr>
+        <w:spacing w:before="40" w:after="200"/>
+      </w:pPr>
+      <w:r>
+        <w:rPr>
+          <w:rFonts w:ascii="Calibri" w:hAnsi="Calibri"/>
+          <w:b/>
+          <w:color w:val="F5B62A"/>
+          <w:sz w:val="17"/>
+        </w:rPr>
+        <w:t>130/280 chars</w:t>
+      </w:r>
+    </w:p>
+    <w:p>
+      <w:pPr>
+        <w:spacing w:before="160" w:after="40"/>
+      </w:pPr>
+      <w:r>
+        <w:rPr>
+          <w:rFonts w:ascii="Calibri" w:hAnsi="Calibri"/>
+          <w:b/>
+          <w:color w:val="5D6B64"/>
+          <w:sz w:val="18"/>
+        </w:rPr>
+        <w:t>Tuesday · 6 · factoid</w:t>
+      </w:r>
+    </w:p>
+    <w:p>
+      <w:pPr>
+        <w:spacing w:before="0" w:after="0" w:line="283" w:lineRule="auto"/>
+        <w:shd w:val="clear" w:color="auto" w:fill="F3F7F4"/>
+        <w:pBdr>
+          <w:top w:val="single" w:sz="8" w:space="8" w:color="CFE7DB"/>
+          <w:bottom w:val="single" w:sz="8" w:space="8" w:color="CFE7DB"/>
+          <w:left w:val="single" w:sz="8" w:space="8" w:color="CFE7DB"/>
+          <w:right w:val="single" w:sz="8" w:space="8" w:color="CFE7DB"/>
+        </w:pBdr>
+      </w:pPr>
+      <w:r>
+        <w:rPr>
+          <w:rFonts w:ascii="Consolas" w:hAnsi="Consolas"/>
+          <w:b w:val="0"/>
+          <w:color w:val="16211D"/>
+          <w:sz w:val="19"/>
+        </w:rPr>
+        <w:t>All-time or Modern — you choose the era you draft from. Yamal (ESP): the 2026 World Cup forward, draftable in wcdraft. https://www.wcdraft.com/play</w:t>
+      </w:r>
+    </w:p>
+    <w:p>
+      <w:pPr>
+        <w:spacing w:before="40" w:after="200"/>
+      </w:pPr>
+      <w:r>
+        <w:rPr>
+          <w:rFonts w:ascii="Calibri" w:hAnsi="Calibri"/>
+          <w:b/>
+          <w:color w:val="F5B62A"/>
+          <w:sz w:val="17"/>
+        </w:rPr>
+        <w:t>142/280 chars</w:t>
+      </w:r>
+    </w:p>
+    <w:p>
+      <w:pPr>
+        <w:spacing w:before="220" w:after="100"/>
+        <w:pBdr>
+          <w:left w:val="single" w:sz="18" w:space="6" w:color="F5B62A"/>
+        </w:pBdr>
+      </w:pPr>
+      <w:r>
+        <w:rPr>
+          <w:rFonts w:ascii="Calibri" w:hAnsi="Calibri"/>
+          <w:b/>
+          <w:color w:val="16211D"/>
+          <w:sz w:val="25"/>
+        </w:rPr>
+        <w:t>Wednesday</w:t>
+      </w:r>
+    </w:p>
+    <w:p>
+      <w:pPr>
+        <w:spacing w:before="160" w:after="40"/>
+      </w:pPr>
+      <w:r>
+        <w:rPr>
+          <w:rFonts w:ascii="Calibri" w:hAnsi="Calibri"/>
+          <w:b/>
+          <w:color w:val="5D6B64"/>
+          <w:sz w:val="18"/>
+        </w:rPr>
+        <w:t>Wednesday · 1 · feature pitch</w:t>
+      </w:r>
+    </w:p>
+    <w:p>
+      <w:pPr>
+        <w:spacing w:before="0" w:after="0" w:line="283" w:lineRule="auto"/>
+        <w:shd w:val="clear" w:color="auto" w:fill="F3F7F4"/>
+        <w:pBdr>
+          <w:top w:val="single" w:sz="8" w:space="8" w:color="CFE7DB"/>
+          <w:bottom w:val="single" w:sz="8" w:space="8" w:color="CFE7DB"/>
+          <w:left w:val="single" w:sz="8" w:space="8" w:color="CFE7DB"/>
+          <w:right w:val="single" w:sz="8" w:space="8" w:color="CFE7DB"/>
+        </w:pBdr>
+      </w:pPr>
+      <w:r>
+        <w:rPr>
+          <w:rFonts w:ascii="Consolas" w:hAnsi="Consolas"/>
+          <w:b w:val="0"/>
+          <w:color w:val="16211D"/>
+          <w:sz w:val="19"/>
+        </w:rPr>
+        <w:t>Filter the rolled squad by position and search players by name, right inside the draft. Managers are a pick here — one of your 17 spins. https://www.wcdraft.com/play</w:t>
+      </w:r>
+    </w:p>
+    <w:p>
+      <w:pPr>
+        <w:spacing w:before="40" w:after="200"/>
+      </w:pPr>
+      <w:r>
+        <w:rPr>
+          <w:rFonts w:ascii="Calibri" w:hAnsi="Calibri"/>
+          <w:b/>
+          <w:color w:val="F5B62A"/>
+          <w:sz w:val="17"/>
+        </w:rPr>
+        <w:t>160/280 chars</w:t>
+      </w:r>
+    </w:p>
+    <w:p>
+      <w:pPr>
+        <w:spacing w:before="160" w:after="40"/>
+      </w:pPr>
+      <w:r>
+        <w:rPr>
+          <w:rFonts w:ascii="Calibri" w:hAnsi="Calibri"/>
+          <w:b/>
+          <w:color w:val="5D6B64"/>
+          <w:sz w:val="18"/>
+        </w:rPr>
+        <w:t>Wednesday · 2 · daily challenge</w:t>
+      </w:r>
+    </w:p>
+    <w:p>
+      <w:pPr>
+        <w:spacing w:before="0" w:after="0" w:line="283" w:lineRule="auto"/>
+        <w:shd w:val="clear" w:color="auto" w:fill="F3F7F4"/>
+        <w:pBdr>
+          <w:top w:val="single" w:sz="8" w:space="8" w:color="CFE7DB"/>
+          <w:bottom w:val="single" w:sz="8" w:space="8" w:color="CFE7DB"/>
+          <w:left w:val="single" w:sz="8" w:space="8" w:color="CFE7DB"/>
+          <w:right w:val="single" w:sz="8" w:space="8" w:color="CFE7DB"/>
+        </w:pBdr>
+      </w:pPr>
+      <w:r>
+        <w:rPr>
+          <w:rFonts w:ascii="Consolas" w:hAnsi="Consolas"/>
+          <w:b w:val="0"/>
+          <w:color w:val="16211D"/>
+          <w:sz w:val="19"/>
+        </w:rPr>
+        <w:t>Group K opens today: Portugal, DR Congo, Uzbekistan, Colombia. Pick a side, then build the XI across eras. https://www.wcdraft.com/play</w:t>
+      </w:r>
+    </w:p>
+    <w:p>
+      <w:pPr>
+        <w:spacing w:before="40" w:after="200"/>
+      </w:pPr>
+      <w:r>
+        <w:rPr>
+          <w:rFonts w:ascii="Calibri" w:hAnsi="Calibri"/>
+          <w:b/>
+          <w:color w:val="F5B62A"/>
+          <w:sz w:val="17"/>
+        </w:rPr>
+        <w:t>130/280 chars</w:t>
+      </w:r>
+    </w:p>
+    <w:p>
+      <w:pPr>
+        <w:spacing w:before="160" w:after="40"/>
+      </w:pPr>
+      <w:r>
+        <w:rPr>
+          <w:rFonts w:ascii="Calibri" w:hAnsi="Calibri"/>
+          <w:b/>
+          <w:color w:val="5D6B64"/>
+          <w:sz w:val="18"/>
+        </w:rPr>
+        <w:t>Wednesday · 3 · factoid</w:t>
+      </w:r>
+    </w:p>
+    <w:p>
+      <w:pPr>
+        <w:spacing w:before="0" w:after="0" w:line="283" w:lineRule="auto"/>
+        <w:shd w:val="clear" w:color="auto" w:fill="F3F7F4"/>
+        <w:pBdr>
+          <w:top w:val="single" w:sz="8" w:space="8" w:color="CFE7DB"/>
+          <w:bottom w:val="single" w:sz="8" w:space="8" w:color="CFE7DB"/>
+          <w:left w:val="single" w:sz="8" w:space="8" w:color="CFE7DB"/>
+          <w:right w:val="single" w:sz="8" w:space="8" w:color="CFE7DB"/>
+        </w:pBdr>
+      </w:pPr>
+      <w:r>
+        <w:rPr>
+          <w:rFonts w:ascii="Consolas" w:hAnsi="Consolas"/>
+          <w:b w:val="0"/>
+          <w:color w:val="16211D"/>
+          <w:sz w:val="19"/>
+        </w:rPr>
+        <w:t>Position First: lock the slot, then spin for who fills it. Santos (BRA) — a wcdraft all-time legend from the 1962 World Cup squad: a defender you can draft into your all-time XI. https://www.wcdraft.com/play</w:t>
+      </w:r>
+    </w:p>
+    <w:p>
+      <w:pPr>
+        <w:spacing w:before="40" w:after="200"/>
+      </w:pPr>
+      <w:r>
+        <w:rPr>
+          <w:rFonts w:ascii="Calibri" w:hAnsi="Calibri"/>
+          <w:b/>
+          <w:color w:val="F5B62A"/>
+          <w:sz w:val="17"/>
+        </w:rPr>
+        <w:t>202/280 chars</w:t>
+      </w:r>
+    </w:p>
+    <w:p>
+      <w:pPr>
+        <w:spacing w:before="160" w:after="40"/>
+      </w:pPr>
+      <w:r>
+        <w:rPr>
+          <w:rFonts w:ascii="Calibri" w:hAnsi="Calibri"/>
+          <w:b/>
+          <w:color w:val="5D6B64"/>
+          <w:sz w:val="18"/>
+        </w:rPr>
+        <w:t>Wednesday · 4 · feature pitch</w:t>
+      </w:r>
+    </w:p>
+    <w:p>
+      <w:pPr>
+        <w:spacing w:before="0" w:after="0" w:line="283" w:lineRule="auto"/>
+        <w:shd w:val="clear" w:color="auto" w:fill="F3F7F4"/>
+        <w:pBdr>
+          <w:top w:val="single" w:sz="8" w:space="8" w:color="CFE7DB"/>
+          <w:bottom w:val="single" w:sz="8" w:space="8" w:color="CFE7DB"/>
+          <w:left w:val="single" w:sz="8" w:space="8" w:color="CFE7DB"/>
+          <w:right w:val="single" w:sz="8" w:space="8" w:color="CFE7DB"/>
+        </w:pBdr>
+      </w:pPr>
+      <w:r>
+        <w:rPr>
+          <w:rFonts w:ascii="Consolas" w:hAnsi="Consolas"/>
+          <w:b w:val="0"/>
+          <w:color w:val="16211D"/>
+          <w:sz w:val="19"/>
+        </w:rPr>
+        <w:t>Choose your era: All-time, Post-2000, Post-2010, or Modern — drafting across more than ninety years of World Cup squads (1930–2026). Free, in your browser. No download. https://www.wcdraft.com/play</w:t>
+      </w:r>
+    </w:p>
+    <w:p>
+      <w:pPr>
+        <w:spacing w:before="40" w:after="200"/>
+      </w:pPr>
+      <w:r>
+        <w:rPr>
+          <w:rFonts w:ascii="Calibri" w:hAnsi="Calibri"/>
+          <w:b/>
+          <w:color w:val="F5B62A"/>
+          <w:sz w:val="17"/>
+        </w:rPr>
+        <w:t>192/280 chars</w:t>
+      </w:r>
+    </w:p>
+    <w:p>
+      <w:pPr>
+        <w:spacing w:before="160" w:after="40"/>
+      </w:pPr>
+      <w:r>
+        <w:rPr>
+          <w:rFonts w:ascii="Calibri" w:hAnsi="Calibri"/>
+          <w:b/>
+          <w:color w:val="5D6B64"/>
+          <w:sz w:val="18"/>
+        </w:rPr>
+        <w:t>Wednesday · 5 · daily challenge</w:t>
+      </w:r>
+    </w:p>
+    <w:p>
+      <w:pPr>
+        <w:spacing w:before="0" w:after="0" w:line="283" w:lineRule="auto"/>
+        <w:shd w:val="clear" w:color="auto" w:fill="F3F7F4"/>
+        <w:pBdr>
+          <w:top w:val="single" w:sz="8" w:space="8" w:color="CFE7DB"/>
+          <w:bottom w:val="single" w:sz="8" w:space="8" w:color="CFE7DB"/>
+          <w:left w:val="single" w:sz="8" w:space="8" w:color="CFE7DB"/>
+          <w:right w:val="single" w:sz="8" w:space="8" w:color="CFE7DB"/>
+        </w:pBdr>
+      </w:pPr>
+      <w:r>
+        <w:rPr>
+          <w:rFonts w:ascii="Consolas" w:hAnsi="Consolas"/>
+          <w:b w:val="0"/>
+          <w:color w:val="16211D"/>
+          <w:sz w:val="19"/>
+        </w:rPr>
+        <w:t>Today's spin: Austria 1954. Who's your pick? Two ways to value a player: Career or Current. https://www.wcdraft.com/play</w:t>
       </w:r>
     </w:p>
     <w:p>
@@ -760,7 +1431,7 @@
           <w:color w:val="5D6B64"/>
           <w:sz w:val="18"/>
         </w:rPr>
-        <w:t>Monday · 5 · daily challenge</w:t>
+        <w:t>Wednesday · 6 · factoid</w:t>
       </w:r>
     </w:p>
     <w:p>
@@ -781,7 +1452,7 @@
           <w:color w:val="16211D"/>
           <w:sz w:val="19"/>
         </w:rPr>
-        <w:t>Today's spin: Ivory Coast 2006. Who's your pick? Free, in your browser. No download. https://www.wcdraft.com/play</w:t>
+        <w:t>Charlton (ENG) — a wcdraft all-time legend from the 1962 World Cup squad, 1 goal that tournament. Nation Synergy rewards a connected XI. https://www.wcdraft.com/play</w:t>
       </w:r>
     </w:p>
     <w:p>
@@ -795,7 +1466,24 @@
           <w:color w:val="F5B62A"/>
           <w:sz w:val="17"/>
         </w:rPr>
-        <w:t>108/280 chars</w:t>
+        <w:t>160/280 chars</w:t>
+      </w:r>
+    </w:p>
+    <w:p>
+      <w:pPr>
+        <w:spacing w:before="220" w:after="100"/>
+        <w:pBdr>
+          <w:left w:val="single" w:sz="18" w:space="6" w:color="F5B62A"/>
+        </w:pBdr>
+      </w:pPr>
+      <w:r>
+        <w:rPr>
+          <w:rFonts w:ascii="Calibri" w:hAnsi="Calibri"/>
+          <w:b/>
+          <w:color w:val="16211D"/>
+          <w:sz w:val="25"/>
+        </w:rPr>
+        <w:t>Thursday</w:t>
       </w:r>
     </w:p>
     <w:p>
@@ -809,7 +1497,7 @@
           <w:color w:val="5D6B64"/>
           <w:sz w:val="18"/>
         </w:rPr>
-        <w:t>Monday · 6 · factoid</w:t>
+        <w:t>Thursday · 1 · feature pitch</w:t>
       </w:r>
     </w:p>
     <w:p>
@@ -830,7 +1518,7 @@
           <w:color w:val="16211D"/>
           <w:sz w:val="19"/>
         </w:rPr>
-        <w:t>Memory mode hides the numbers until you simulate. Figueroa (CHL) — a wcdraft all-time legend from the 1966 World Cup squad: a defender you can draft into your all-time XI. https://www.wcdraft.com/play</w:t>
+        <w:t>The manager is one of your spins — a real pick that shapes the squad, not a footnote. https://www.wcdraft.com/play</w:t>
       </w:r>
     </w:p>
     <w:p>
@@ -844,24 +1532,7 @@
           <w:color w:val="F5B62A"/>
           <w:sz w:val="17"/>
         </w:rPr>
-        <w:t>195/280 chars</w:t>
-      </w:r>
-    </w:p>
-    <w:p>
-      <w:pPr>
-        <w:spacing w:before="220" w:after="100"/>
-        <w:pBdr>
-          <w:left w:val="single" w:sz="18" w:space="6" w:color="F5B62A"/>
-        </w:pBdr>
-      </w:pPr>
-      <w:r>
-        <w:rPr>
-          <w:rFonts w:ascii="Calibri" w:hAnsi="Calibri"/>
-          <w:b/>
-          <w:color w:val="16211D"/>
-          <w:sz w:val="25"/>
-        </w:rPr>
-        <w:t>Tuesday</w:t>
+        <w:t>109/280 chars</w:t>
       </w:r>
     </w:p>
     <w:p>
@@ -875,7 +1546,105 @@
           <w:color w:val="5D6B64"/>
           <w:sz w:val="18"/>
         </w:rPr>
-        <w:t>Tuesday · 1 · feature pitch</w:t>
+        <w:t>Thursday · 2 · daily challenge</w:t>
+      </w:r>
+    </w:p>
+    <w:p>
+      <w:pPr>
+        <w:spacing w:before="0" w:after="0" w:line="283" w:lineRule="auto"/>
+        <w:shd w:val="clear" w:color="auto" w:fill="F3F7F4"/>
+        <w:pBdr>
+          <w:top w:val="single" w:sz="8" w:space="8" w:color="CFE7DB"/>
+          <w:bottom w:val="single" w:sz="8" w:space="8" w:color="CFE7DB"/>
+          <w:left w:val="single" w:sz="8" w:space="8" w:color="CFE7DB"/>
+          <w:right w:val="single" w:sz="8" w:space="8" w:color="CFE7DB"/>
+        </w:pBdr>
+      </w:pPr>
+      <w:r>
+        <w:rPr>
+          <w:rFonts w:ascii="Consolas" w:hAnsi="Consolas"/>
+          <w:b w:val="0"/>
+          <w:color w:val="16211D"/>
+          <w:sz w:val="19"/>
+        </w:rPr>
+        <w:t>Matchday 2 starts: Mexico v South Korea, Canada v Qatar, Czechia v South Africa, Switzerland v Bosnia. Draft the side you're backing. https://www.wcdraft.com/play</w:t>
+      </w:r>
+    </w:p>
+    <w:p>
+      <w:pPr>
+        <w:spacing w:before="40" w:after="200"/>
+      </w:pPr>
+      <w:r>
+        <w:rPr>
+          <w:rFonts w:ascii="Calibri" w:hAnsi="Calibri"/>
+          <w:b/>
+          <w:color w:val="F5B62A"/>
+          <w:sz w:val="17"/>
+        </w:rPr>
+        <w:t>157/280 chars</w:t>
+      </w:r>
+    </w:p>
+    <w:p>
+      <w:pPr>
+        <w:spacing w:before="160" w:after="40"/>
+      </w:pPr>
+      <w:r>
+        <w:rPr>
+          <w:rFonts w:ascii="Calibri" w:hAnsi="Calibri"/>
+          <w:b/>
+          <w:color w:val="5D6B64"/>
+          <w:sz w:val="18"/>
+        </w:rPr>
+        <w:t>Thursday · 3 · factoid</w:t>
+      </w:r>
+    </w:p>
+    <w:p>
+      <w:pPr>
+        <w:spacing w:before="0" w:after="0" w:line="283" w:lineRule="auto"/>
+        <w:shd w:val="clear" w:color="auto" w:fill="F3F7F4"/>
+        <w:pBdr>
+          <w:top w:val="single" w:sz="8" w:space="8" w:color="CFE7DB"/>
+          <w:bottom w:val="single" w:sz="8" w:space="8" w:color="CFE7DB"/>
+          <w:left w:val="single" w:sz="8" w:space="8" w:color="CFE7DB"/>
+          <w:right w:val="single" w:sz="8" w:space="8" w:color="CFE7DB"/>
+        </w:pBdr>
+      </w:pPr>
+      <w:r>
+        <w:rPr>
+          <w:rFonts w:ascii="Consolas" w:hAnsi="Consolas"/>
+          <w:b w:val="0"/>
+          <w:color w:val="16211D"/>
+          <w:sz w:val="19"/>
+        </w:rPr>
+        <w:t>Casillas (ESP), 2006: a goalkeeper with 3 appearances that World Cup — in the wcdraft pool. No app store, no install — just open it and draft. https://www.wcdraft.com/play</w:t>
+      </w:r>
+    </w:p>
+    <w:p>
+      <w:pPr>
+        <w:spacing w:before="40" w:after="200"/>
+      </w:pPr>
+      <w:r>
+        <w:rPr>
+          <w:rFonts w:ascii="Calibri" w:hAnsi="Calibri"/>
+          <w:b/>
+          <w:color w:val="F5B62A"/>
+          <w:sz w:val="17"/>
+        </w:rPr>
+        <w:t>166/280 chars</w:t>
+      </w:r>
+    </w:p>
+    <w:p>
+      <w:pPr>
+        <w:spacing w:before="160" w:after="40"/>
+      </w:pPr>
+      <w:r>
+        <w:rPr>
+          <w:rFonts w:ascii="Calibri" w:hAnsi="Calibri"/>
+          <w:b/>
+          <w:color w:val="5D6B64"/>
+          <w:sz w:val="18"/>
+        </w:rPr>
+        <w:t>Thursday · 4 · feature pitch</w:t>
       </w:r>
     </w:p>
     <w:p>
@@ -924,7 +1693,7 @@
           <w:color w:val="5D6B64"/>
           <w:sz w:val="18"/>
         </w:rPr>
-        <w:t>Tuesday · 2 · daily challenge</w:t>
+        <w:t>Thursday · 5 · daily challenge</w:t>
       </w:r>
     </w:p>
     <w:p>
@@ -945,7 +1714,7 @@
           <w:color w:val="16211D"/>
           <w:sz w:val="19"/>
         </w:rPr>
-        <w:t>You draft a manager too. Most games don't let you. Today's seed: Brazil 2026 — spin it and pick. https://www.wcdraft.com/play</w:t>
+        <w:t>England 2014 just rolled. One pick — who makes your all-time XI? Same seed, same outcome: your run link is fully reproducible. https://www.wcdraft.com/play</w:t>
       </w:r>
     </w:p>
     <w:p>
@@ -959,7 +1728,7 @@
           <w:color w:val="F5B62A"/>
           <w:sz w:val="17"/>
         </w:rPr>
-        <w:t>120/280 chars</w:t>
+        <w:t>150/280 chars</w:t>
       </w:r>
     </w:p>
     <w:p>
@@ -973,7 +1742,7 @@
           <w:color w:val="5D6B64"/>
           <w:sz w:val="18"/>
         </w:rPr>
-        <w:t>Tuesday · 3 · factoid</w:t>
+        <w:t>Thursday · 6 · factoid</w:t>
       </w:r>
     </w:p>
     <w:p>
@@ -994,7 +1763,7 @@
           <w:color w:val="16211D"/>
           <w:sz w:val="19"/>
         </w:rPr>
-        <w:t>Classic, or Memory — ratings hidden until the reveal. Ronaldo (BRA): the 1994 World Cup forward, draftable in wcdraft. https://www.wcdraft.com/play</w:t>
+        <w:t>Two ways to draft: by squad, or by position. Eto'o (CMR) — a wcdraft all-time legend from the 2014 World Cup squad: a forward you can draft into your all-time XI. https://www.wcdraft.com/play</w:t>
       </w:r>
     </w:p>
     <w:p>
@@ -1008,7 +1777,24 @@
           <w:color w:val="F5B62A"/>
           <w:sz w:val="17"/>
         </w:rPr>
-        <w:t>142/280 chars</w:t>
+        <w:t>186/280 chars</w:t>
+      </w:r>
+    </w:p>
+    <w:p>
+      <w:pPr>
+        <w:spacing w:before="220" w:after="100"/>
+        <w:pBdr>
+          <w:left w:val="single" w:sz="18" w:space="6" w:color="F5B62A"/>
+        </w:pBdr>
+      </w:pPr>
+      <w:r>
+        <w:rPr>
+          <w:rFonts w:ascii="Calibri" w:hAnsi="Calibri"/>
+          <w:b/>
+          <w:color w:val="16211D"/>
+          <w:sz w:val="25"/>
+        </w:rPr>
+        <w:t>Friday</w:t>
       </w:r>
     </w:p>
     <w:p>
@@ -1022,7 +1808,7 @@
           <w:color w:val="5D6B64"/>
           <w:sz w:val="18"/>
         </w:rPr>
-        <w:t>Tuesday · 4 · feature pitch</w:t>
+        <w:t>Friday · 1 · feature pitch</w:t>
       </w:r>
     </w:p>
     <w:p>
@@ -1043,7 +1829,7 @@
           <w:color w:val="16211D"/>
           <w:sz w:val="19"/>
         </w:rPr>
-        <w:t>Your XI plays the real 2026 World Cup bracket — 8 matches through the knockouts — in a calibrated match simulation. A perfect run is 8-0. Career peak or current form — you pick the rating basis. https://www.wcdraft.com/play</w:t>
+        <w:t>Pick your draft order: Squad First, or Position First — commit a slot to fill before the squad is even revealed. Four era presets: All-time, Post-2000, Post-2010, Modern. https://www.wcdraft.com/play</w:t>
       </w:r>
     </w:p>
     <w:p>
@@ -1057,7 +1843,7 @@
           <w:color w:val="F5B62A"/>
           <w:sz w:val="17"/>
         </w:rPr>
-        <w:t>218/280 chars</w:t>
+        <w:t>194/280 chars</w:t>
       </w:r>
     </w:p>
     <w:p>
@@ -1071,7 +1857,7 @@
           <w:color w:val="5D6B64"/>
           <w:sz w:val="18"/>
         </w:rPr>
-        <w:t>Tuesday · 5 · daily challenge</w:t>
+        <w:t>Friday · 2 · daily challenge</w:t>
       </w:r>
     </w:p>
     <w:p>
@@ -1092,7 +1878,7 @@
           <w:color w:val="16211D"/>
           <w:sz w:val="19"/>
         </w:rPr>
-        <w:t>There's a season-keyed leaderboard — post your run. Today's seed: Argentina 1982 — spin it and pick. https://www.wcdraft.com/play</w:t>
+        <w:t>Friday slate: Scotland v Morocco, Brazil v Haiti. Build an all-time XI from one of those nations before kickoff, then let the bracket argue back. https://www.wcdraft.com/play</w:t>
       </w:r>
     </w:p>
     <w:p>
@@ -1106,7 +1892,7 @@
           <w:color w:val="F5B62A"/>
           <w:sz w:val="17"/>
         </w:rPr>
-        <w:t>124/280 chars</w:t>
+        <w:t>169/280 chars</w:t>
       </w:r>
     </w:p>
     <w:p>
@@ -1120,7 +1906,7 @@
           <w:color w:val="5D6B64"/>
           <w:sz w:val="18"/>
         </w:rPr>
-        <w:t>Tuesday · 6 · factoid</w:t>
+        <w:t>Friday · 3 · factoid</w:t>
       </w:r>
     </w:p>
     <w:p>
@@ -1141,7 +1927,7 @@
           <w:color w:val="16211D"/>
           <w:sz w:val="19"/>
         </w:rPr>
-        <w:t>Neuer (DEU) — a wcdraft all-time legend from the 2010 World Cup squad: a goalkeeper you can draft into your all-time XI. Free, in your browser. No download. https://www.wcdraft.com/play</w:t>
+        <w:t>Robben (NLD) — a wcdraft all-time legend from the 2006 World Cup squad, 1 goal that tournament. Draft across 1930–2026, or narrow to one era. https://www.wcdraft.com/play</w:t>
       </w:r>
     </w:p>
     <w:p>
@@ -1155,24 +1941,7 @@
           <w:color w:val="F5B62A"/>
           <w:sz w:val="17"/>
         </w:rPr>
-        <w:t>180/280 chars</w:t>
-      </w:r>
-    </w:p>
-    <w:p>
-      <w:pPr>
-        <w:spacing w:before="220" w:after="100"/>
-        <w:pBdr>
-          <w:left w:val="single" w:sz="18" w:space="6" w:color="F5B62A"/>
-        </w:pBdr>
-      </w:pPr>
-      <w:r>
-        <w:rPr>
-          <w:rFonts w:ascii="Calibri" w:hAnsi="Calibri"/>
-          <w:b/>
-          <w:color w:val="16211D"/>
-          <w:sz w:val="25"/>
-        </w:rPr>
-        <w:t>Wednesday</w:t>
+        <w:t>165/280 chars</w:t>
       </w:r>
     </w:p>
     <w:p>
@@ -1186,7 +1955,7 @@
           <w:color w:val="5D6B64"/>
           <w:sz w:val="18"/>
         </w:rPr>
-        <w:t>Wednesday · 1 · feature pitch</w:t>
+        <w:t>Friday · 4 · feature pitch</w:t>
       </w:r>
     </w:p>
     <w:p>
@@ -1207,7 +1976,7 @@
           <w:color w:val="16211D"/>
           <w:sz w:val="19"/>
         </w:rPr>
-        <w:t>Seventeen spins, one pick on each: sixteen players for your XI and bench, plus one manager. Every run has a shareable, replayable link. https://www.wcdraft.com/play</w:t>
+        <w:t>Choose your era: All-time, Post-2000, Post-2010, or Modern — drafting across more than ninety years of World Cup squads (1930–2026). https://www.wcdraft.com/play</w:t>
       </w:r>
     </w:p>
     <w:p>
@@ -1221,7 +1990,7 @@
           <w:color w:val="F5B62A"/>
           <w:sz w:val="17"/>
         </w:rPr>
-        <w:t>159/280 chars</w:t>
+        <w:t>156/280 chars</w:t>
       </w:r>
     </w:p>
     <w:p>
@@ -1235,7 +2004,7 @@
           <w:color w:val="5D6B64"/>
           <w:sz w:val="18"/>
         </w:rPr>
-        <w:t>Wednesday · 2 · daily challenge</w:t>
+        <w:t>Friday · 5 · daily challenge</w:t>
       </w:r>
     </w:p>
     <w:p>
@@ -1256,7 +2025,318 @@
           <w:color w:val="16211D"/>
           <w:sz w:val="19"/>
         </w:rPr>
-        <w:t>Today's spin: West Germany 1982. Who's your pick? Career peak or current form — you pick the rating basis. https://www.wcdraft.com/play</w:t>
+        <w:t>Seventeen spins. One pick each. Build the whole XI. Today's seed: Brazil 1994 — spin it and pick. https://www.wcdraft.com/play</w:t>
+      </w:r>
+    </w:p>
+    <w:p>
+      <w:pPr>
+        <w:spacing w:before="40" w:after="200"/>
+      </w:pPr>
+      <w:r>
+        <w:rPr>
+          <w:rFonts w:ascii="Calibri" w:hAnsi="Calibri"/>
+          <w:b/>
+          <w:color w:val="F5B62A"/>
+          <w:sz w:val="17"/>
+        </w:rPr>
+        <w:t>121/280 chars</w:t>
+      </w:r>
+    </w:p>
+    <w:p>
+      <w:pPr>
+        <w:spacing w:before="160" w:after="40"/>
+      </w:pPr>
+      <w:r>
+        <w:rPr>
+          <w:rFonts w:ascii="Calibri" w:hAnsi="Calibri"/>
+          <w:b/>
+          <w:color w:val="5D6B64"/>
+          <w:sz w:val="18"/>
+        </w:rPr>
+        <w:t>Friday · 6 · factoid</w:t>
+      </w:r>
+    </w:p>
+    <w:p>
+      <w:pPr>
+        <w:spacing w:before="0" w:after="0" w:line="283" w:lineRule="auto"/>
+        <w:shd w:val="clear" w:color="auto" w:fill="F3F7F4"/>
+        <w:pBdr>
+          <w:top w:val="single" w:sz="8" w:space="8" w:color="CFE7DB"/>
+          <w:bottom w:val="single" w:sz="8" w:space="8" w:color="CFE7DB"/>
+          <w:left w:val="single" w:sz="8" w:space="8" w:color="CFE7DB"/>
+          <w:right w:val="single" w:sz="8" w:space="8" w:color="CFE7DB"/>
+        </w:pBdr>
+      </w:pPr>
+      <w:r>
+        <w:rPr>
+          <w:rFonts w:ascii="Consolas" w:hAnsi="Consolas"/>
+          <w:b w:val="0"/>
+          <w:color w:val="16211D"/>
+          <w:sz w:val="19"/>
+        </w:rPr>
+        <w:t>There's a season-keyed leaderboard — post your run. Fontaine (FRA), 1958: a forward with 6 appearances that World Cup — in the wcdraft pool. https://www.wcdraft.com/play</w:t>
+      </w:r>
+    </w:p>
+    <w:p>
+      <w:pPr>
+        <w:spacing w:before="40" w:after="200"/>
+      </w:pPr>
+      <w:r>
+        <w:rPr>
+          <w:rFonts w:ascii="Calibri" w:hAnsi="Calibri"/>
+          <w:b/>
+          <w:color w:val="F5B62A"/>
+          <w:sz w:val="17"/>
+        </w:rPr>
+        <w:t>164/280 chars</w:t>
+      </w:r>
+    </w:p>
+    <w:p>
+      <w:pPr>
+        <w:spacing w:before="220" w:after="100"/>
+        <w:pBdr>
+          <w:left w:val="single" w:sz="18" w:space="6" w:color="F5B62A"/>
+        </w:pBdr>
+      </w:pPr>
+      <w:r>
+        <w:rPr>
+          <w:rFonts w:ascii="Calibri" w:hAnsi="Calibri"/>
+          <w:b/>
+          <w:color w:val="16211D"/>
+          <w:sz w:val="25"/>
+        </w:rPr>
+        <w:t>Saturday</w:t>
+      </w:r>
+    </w:p>
+    <w:p>
+      <w:pPr>
+        <w:spacing w:before="160" w:after="40"/>
+      </w:pPr>
+      <w:r>
+        <w:rPr>
+          <w:rFonts w:ascii="Calibri" w:hAnsi="Calibri"/>
+          <w:b/>
+          <w:color w:val="5D6B64"/>
+          <w:sz w:val="18"/>
+        </w:rPr>
+        <w:t>Saturday · 1 · feature pitch</w:t>
+      </w:r>
+    </w:p>
+    <w:p>
+      <w:pPr>
+        <w:spacing w:before="0" w:after="0" w:line="283" w:lineRule="auto"/>
+        <w:shd w:val="clear" w:color="auto" w:fill="F3F7F4"/>
+        <w:pBdr>
+          <w:top w:val="single" w:sz="8" w:space="8" w:color="CFE7DB"/>
+          <w:bottom w:val="single" w:sz="8" w:space="8" w:color="CFE7DB"/>
+          <w:left w:val="single" w:sz="8" w:space="8" w:color="CFE7DB"/>
+          <w:right w:val="single" w:sz="8" w:space="8" w:color="CFE7DB"/>
+        </w:pBdr>
+      </w:pPr>
+      <w:r>
+        <w:rPr>
+          <w:rFonts w:ascii="Consolas" w:hAnsi="Consolas"/>
+          <w:b w:val="0"/>
+          <w:color w:val="16211D"/>
+          <w:sz w:val="19"/>
+        </w:rPr>
+        <w:t>Every run gets a shareable link that replays the exact same draft and result in any browser — same seed, same outcome. Same-nation picks build Synergy — watch it live as you draft. https://www.wcdraft.com/play</w:t>
+      </w:r>
+    </w:p>
+    <w:p>
+      <w:pPr>
+        <w:spacing w:before="40" w:after="200"/>
+      </w:pPr>
+      <w:r>
+        <w:rPr>
+          <w:rFonts w:ascii="Calibri" w:hAnsi="Calibri"/>
+          <w:b/>
+          <w:color w:val="F5B62A"/>
+          <w:sz w:val="17"/>
+        </w:rPr>
+        <w:t>204/280 chars</w:t>
+      </w:r>
+    </w:p>
+    <w:p>
+      <w:pPr>
+        <w:spacing w:before="160" w:after="40"/>
+      </w:pPr>
+      <w:r>
+        <w:rPr>
+          <w:rFonts w:ascii="Calibri" w:hAnsi="Calibri"/>
+          <w:b/>
+          <w:color w:val="5D6B64"/>
+          <w:sz w:val="18"/>
+        </w:rPr>
+        <w:t>Saturday · 2 · daily challenge</w:t>
+      </w:r>
+    </w:p>
+    <w:p>
+      <w:pPr>
+        <w:spacing w:before="0" w:after="0" w:line="283" w:lineRule="auto"/>
+        <w:shd w:val="clear" w:color="auto" w:fill="F3F7F4"/>
+        <w:pBdr>
+          <w:top w:val="single" w:sz="8" w:space="8" w:color="CFE7DB"/>
+          <w:bottom w:val="single" w:sz="8" w:space="8" w:color="CFE7DB"/>
+          <w:left w:val="single" w:sz="8" w:space="8" w:color="CFE7DB"/>
+          <w:right w:val="single" w:sz="8" w:space="8" w:color="CFE7DB"/>
+        </w:pBdr>
+      </w:pPr>
+      <w:r>
+        <w:rPr>
+          <w:rFonts w:ascii="Consolas" w:hAnsi="Consolas"/>
+          <w:b w:val="0"/>
+          <w:color w:val="16211D"/>
+          <w:sz w:val="19"/>
+        </w:rPr>
+        <w:t>Netherlands v Sweden, Tunisia v Japan today. Memory mode is the real test: pick by names, years and flags before the reveal. https://www.wcdraft.com/play</w:t>
+      </w:r>
+    </w:p>
+    <w:p>
+      <w:pPr>
+        <w:spacing w:before="40" w:after="200"/>
+      </w:pPr>
+      <w:r>
+        <w:rPr>
+          <w:rFonts w:ascii="Calibri" w:hAnsi="Calibri"/>
+          <w:b/>
+          <w:color w:val="F5B62A"/>
+          <w:sz w:val="17"/>
+        </w:rPr>
+        <w:t>148/280 chars</w:t>
+      </w:r>
+    </w:p>
+    <w:p>
+      <w:pPr>
+        <w:spacing w:before="160" w:after="40"/>
+      </w:pPr>
+      <w:r>
+        <w:rPr>
+          <w:rFonts w:ascii="Calibri" w:hAnsi="Calibri"/>
+          <w:b/>
+          <w:color w:val="5D6B64"/>
+          <w:sz w:val="18"/>
+        </w:rPr>
+        <w:t>Saturday · 3 · factoid</w:t>
+      </w:r>
+    </w:p>
+    <w:p>
+      <w:pPr>
+        <w:spacing w:before="0" w:after="0" w:line="283" w:lineRule="auto"/>
+        <w:shd w:val="clear" w:color="auto" w:fill="F3F7F4"/>
+        <w:pBdr>
+          <w:top w:val="single" w:sz="8" w:space="8" w:color="CFE7DB"/>
+          <w:bottom w:val="single" w:sz="8" w:space="8" w:color="CFE7DB"/>
+          <w:left w:val="single" w:sz="8" w:space="8" w:color="CFE7DB"/>
+          <w:right w:val="single" w:sz="8" w:space="8" w:color="CFE7DB"/>
+        </w:pBdr>
+      </w:pPr>
+      <w:r>
+        <w:rPr>
+          <w:rFonts w:ascii="Consolas" w:hAnsi="Consolas"/>
+          <w:b w:val="0"/>
+          <w:color w:val="16211D"/>
+          <w:sz w:val="19"/>
+        </w:rPr>
+        <w:t>Casillas (ESP), 2010: a goalkeeper with 7 appearances that World Cup — in the wcdraft pool. Managers are a pick here — one of your 17 spins. https://www.wcdraft.com/play</w:t>
+      </w:r>
+    </w:p>
+    <w:p>
+      <w:pPr>
+        <w:spacing w:before="40" w:after="200"/>
+      </w:pPr>
+      <w:r>
+        <w:rPr>
+          <w:rFonts w:ascii="Calibri" w:hAnsi="Calibri"/>
+          <w:b/>
+          <w:color w:val="F5B62A"/>
+          <w:sz w:val="17"/>
+        </w:rPr>
+        <w:t>164/280 chars</w:t>
+      </w:r>
+    </w:p>
+    <w:p>
+      <w:pPr>
+        <w:spacing w:before="160" w:after="40"/>
+      </w:pPr>
+      <w:r>
+        <w:rPr>
+          <w:rFonts w:ascii="Calibri" w:hAnsi="Calibri"/>
+          <w:b/>
+          <w:color w:val="5D6B64"/>
+          <w:sz w:val="18"/>
+        </w:rPr>
+        <w:t>Saturday · 4 · feature pitch</w:t>
+      </w:r>
+    </w:p>
+    <w:p>
+      <w:pPr>
+        <w:spacing w:before="0" w:after="0" w:line="283" w:lineRule="auto"/>
+        <w:shd w:val="clear" w:color="auto" w:fill="F3F7F4"/>
+        <w:pBdr>
+          <w:top w:val="single" w:sz="8" w:space="8" w:color="CFE7DB"/>
+          <w:bottom w:val="single" w:sz="8" w:space="8" w:color="CFE7DB"/>
+          <w:left w:val="single" w:sz="8" w:space="8" w:color="CFE7DB"/>
+          <w:right w:val="single" w:sz="8" w:space="8" w:color="CFE7DB"/>
+        </w:pBdr>
+      </w:pPr>
+      <w:r>
+        <w:rPr>
+          <w:rFonts w:ascii="Consolas" w:hAnsi="Consolas"/>
+          <w:b w:val="0"/>
+          <w:color w:val="16211D"/>
+          <w:sz w:val="19"/>
+        </w:rPr>
+        <w:t>Choose your era: All-time, Post-2000, Post-2010, or Modern — drafting across more than ninety years of World Cup squads (1930–2026). Every run has a shareable, replayable link. https://www.wcdraft.com/play</w:t>
+      </w:r>
+    </w:p>
+    <w:p>
+      <w:pPr>
+        <w:spacing w:before="40" w:after="200"/>
+      </w:pPr>
+      <w:r>
+        <w:rPr>
+          <w:rFonts w:ascii="Calibri" w:hAnsi="Calibri"/>
+          <w:b/>
+          <w:color w:val="F5B62A"/>
+          <w:sz w:val="17"/>
+        </w:rPr>
+        <w:t>200/280 chars</w:t>
+      </w:r>
+    </w:p>
+    <w:p>
+      <w:pPr>
+        <w:spacing w:before="160" w:after="40"/>
+      </w:pPr>
+      <w:r>
+        <w:rPr>
+          <w:rFonts w:ascii="Calibri" w:hAnsi="Calibri"/>
+          <w:b/>
+          <w:color w:val="5D6B64"/>
+          <w:sz w:val="18"/>
+        </w:rPr>
+        <w:t>Saturday · 5 · daily challenge</w:t>
+      </w:r>
+    </w:p>
+    <w:p>
+      <w:pPr>
+        <w:spacing w:before="0" w:after="0" w:line="283" w:lineRule="auto"/>
+        <w:shd w:val="clear" w:color="auto" w:fill="F3F7F4"/>
+        <w:pBdr>
+          <w:top w:val="single" w:sz="8" w:space="8" w:color="CFE7DB"/>
+          <w:bottom w:val="single" w:sz="8" w:space="8" w:color="CFE7DB"/>
+          <w:left w:val="single" w:sz="8" w:space="8" w:color="CFE7DB"/>
+          <w:right w:val="single" w:sz="8" w:space="8" w:color="CFE7DB"/>
+        </w:pBdr>
+      </w:pPr>
+      <w:r>
+        <w:rPr>
+          <w:rFonts w:ascii="Consolas" w:hAnsi="Consolas"/>
+          <w:b w:val="0"/>
+          <w:color w:val="16211D"/>
+          <w:sz w:val="19"/>
+        </w:rPr>
+        <w:t>Run the real 2026 bracket — 8 matches, a perfect run is 8-0. Today's seed: Brazil 1958 — spin it and pick. https://www.wcdraft.com/play</w:t>
       </w:r>
     </w:p>
     <w:p>
@@ -1284,7 +2364,7 @@
           <w:color w:val="5D6B64"/>
           <w:sz w:val="18"/>
         </w:rPr>
-        <w:t>Wednesday · 3 · factoid</w:t>
+        <w:t>Saturday · 6 · factoid</w:t>
       </w:r>
     </w:p>
     <w:p>
@@ -1305,7 +2385,7 @@
           <w:color w:val="16211D"/>
           <w:sz w:val="19"/>
         </w:rPr>
-        <w:t>Same-nation picks build Synergy — watch it live as you draft. Kaká (BRA) — a wcdraft all-time legend from the 2010 World Cup squad: a midfielder you can draft into your all-time XI. https://www.wcdraft.com/play</w:t>
+        <w:t>Albert (HUN), 1966: a midfielder with 4 appearances that World Cup — in the wcdraft pool. Seventeen spins. One pick each. Build the whole XI. https://www.wcdraft.com/play</w:t>
       </w:r>
     </w:p>
     <w:p>
@@ -1319,1087 +2399,7 @@
           <w:color w:val="F5B62A"/>
           <w:sz w:val="17"/>
         </w:rPr>
-        <w:t>205/280 chars</w:t>
-      </w:r>
-    </w:p>
-    <w:p>
-      <w:pPr>
-        <w:spacing w:before="160" w:after="40"/>
-      </w:pPr>
-      <w:r>
-        <w:rPr>
-          <w:rFonts w:ascii="Calibri" w:hAnsi="Calibri"/>
-          <w:b/>
-          <w:color w:val="5D6B64"/>
-          <w:sz w:val="18"/>
-        </w:rPr>
-        <w:t>Wednesday · 4 · feature pitch</w:t>
-      </w:r>
-    </w:p>
-    <w:p>
-      <w:pPr>
-        <w:spacing w:before="0" w:after="0" w:line="283" w:lineRule="auto"/>
-        <w:shd w:val="clear" w:color="auto" w:fill="F3F7F4"/>
-        <w:pBdr>
-          <w:top w:val="single" w:sz="8" w:space="8" w:color="CFE7DB"/>
-          <w:bottom w:val="single" w:sz="8" w:space="8" w:color="CFE7DB"/>
-          <w:left w:val="single" w:sz="8" w:space="8" w:color="CFE7DB"/>
-          <w:right w:val="single" w:sz="8" w:space="8" w:color="CFE7DB"/>
-        </w:pBdr>
-      </w:pPr>
-      <w:r>
-        <w:rPr>
-          <w:rFonts w:ascii="Consolas" w:hAnsi="Consolas"/>
-          <w:b w:val="0"/>
-          <w:color w:val="16211D"/>
-          <w:sz w:val="19"/>
-        </w:rPr>
-        <w:t>Players from the same nation build Synergy — a live preview shows your XI's connections as you draft. https://www.wcdraft.com/play</w:t>
-      </w:r>
-    </w:p>
-    <w:p>
-      <w:pPr>
-        <w:spacing w:before="40" w:after="200"/>
-      </w:pPr>
-      <w:r>
-        <w:rPr>
-          <w:rFonts w:ascii="Calibri" w:hAnsi="Calibri"/>
-          <w:b/>
-          <w:color w:val="F5B62A"/>
-          <w:sz w:val="17"/>
-        </w:rPr>
-        <w:t>125/280 chars</w:t>
-      </w:r>
-    </w:p>
-    <w:p>
-      <w:pPr>
-        <w:spacing w:before="160" w:after="40"/>
-      </w:pPr>
-      <w:r>
-        <w:rPr>
-          <w:rFonts w:ascii="Calibri" w:hAnsi="Calibri"/>
-          <w:b/>
-          <w:color w:val="5D6B64"/>
-          <w:sz w:val="18"/>
-        </w:rPr>
-        <w:t>Wednesday · 5 · daily challenge</w:t>
-      </w:r>
-    </w:p>
-    <w:p>
-      <w:pPr>
-        <w:spacing w:before="0" w:after="0" w:line="283" w:lineRule="auto"/>
-        <w:shd w:val="clear" w:color="auto" w:fill="F3F7F4"/>
-        <w:pBdr>
-          <w:top w:val="single" w:sz="8" w:space="8" w:color="CFE7DB"/>
-          <w:bottom w:val="single" w:sz="8" w:space="8" w:color="CFE7DB"/>
-          <w:left w:val="single" w:sz="8" w:space="8" w:color="CFE7DB"/>
-          <w:right w:val="single" w:sz="8" w:space="8" w:color="CFE7DB"/>
-        </w:pBdr>
-      </w:pPr>
-      <w:r>
-        <w:rPr>
-          <w:rFonts w:ascii="Consolas" w:hAnsi="Consolas"/>
-          <w:b w:val="0"/>
-          <w:color w:val="16211D"/>
-          <w:sz w:val="19"/>
-        </w:rPr>
-        <w:t>Two modes: ratings on the table, or draft from memory. Today's seed: Senegal 2026 — spin it and pick. https://www.wcdraft.com/play</w:t>
-      </w:r>
-    </w:p>
-    <w:p>
-      <w:pPr>
-        <w:spacing w:before="40" w:after="200"/>
-      </w:pPr>
-      <w:r>
-        <w:rPr>
-          <w:rFonts w:ascii="Calibri" w:hAnsi="Calibri"/>
-          <w:b/>
-          <w:color w:val="F5B62A"/>
-          <w:sz w:val="17"/>
-        </w:rPr>
-        <w:t>125/280 chars</w:t>
-      </w:r>
-    </w:p>
-    <w:p>
-      <w:pPr>
-        <w:spacing w:before="160" w:after="40"/>
-      </w:pPr>
-      <w:r>
-        <w:rPr>
-          <w:rFonts w:ascii="Calibri" w:hAnsi="Calibri"/>
-          <w:b/>
-          <w:color w:val="5D6B64"/>
-          <w:sz w:val="18"/>
-        </w:rPr>
-        <w:t>Wednesday · 6 · factoid</w:t>
-      </w:r>
-    </w:p>
-    <w:p>
-      <w:pPr>
-        <w:spacing w:before="0" w:after="0" w:line="283" w:lineRule="auto"/>
-        <w:shd w:val="clear" w:color="auto" w:fill="F3F7F4"/>
-        <w:pBdr>
-          <w:top w:val="single" w:sz="8" w:space="8" w:color="CFE7DB"/>
-          <w:bottom w:val="single" w:sz="8" w:space="8" w:color="CFE7DB"/>
-          <w:left w:val="single" w:sz="8" w:space="8" w:color="CFE7DB"/>
-          <w:right w:val="single" w:sz="8" w:space="8" w:color="CFE7DB"/>
-        </w:pBdr>
-      </w:pPr>
-      <w:r>
-        <w:rPr>
-          <w:rFonts w:ascii="Consolas" w:hAnsi="Consolas"/>
-          <w:b w:val="0"/>
-          <w:color w:val="16211D"/>
-          <w:sz w:val="19"/>
-        </w:rPr>
-        <w:t>Neuer (DEU) — a wcdraft all-time legend from the 2026 World Cup squad: a goalkeeper you can draft into your all-time XI. Classic, or Memory — ratings hidden until the reveal. https://www.wcdraft.com/play</w:t>
-      </w:r>
-    </w:p>
-    <w:p>
-      <w:pPr>
-        <w:spacing w:before="40" w:after="200"/>
-      </w:pPr>
-      <w:r>
-        <w:rPr>
-          <w:rFonts w:ascii="Calibri" w:hAnsi="Calibri"/>
-          <w:b/>
-          <w:color w:val="F5B62A"/>
-          <w:sz w:val="17"/>
-        </w:rPr>
-        <w:t>198/280 chars</w:t>
-      </w:r>
-    </w:p>
-    <w:p>
-      <w:pPr>
-        <w:spacing w:before="220" w:after="100"/>
-        <w:pBdr>
-          <w:left w:val="single" w:sz="18" w:space="6" w:color="F5B62A"/>
-        </w:pBdr>
-      </w:pPr>
-      <w:r>
-        <w:rPr>
-          <w:rFonts w:ascii="Calibri" w:hAnsi="Calibri"/>
-          <w:b/>
-          <w:color w:val="16211D"/>
-          <w:sz w:val="25"/>
-        </w:rPr>
-        <w:t>Thursday</w:t>
-      </w:r>
-    </w:p>
-    <w:p>
-      <w:pPr>
-        <w:spacing w:before="160" w:after="40"/>
-      </w:pPr>
-      <w:r>
-        <w:rPr>
-          <w:rFonts w:ascii="Calibri" w:hAnsi="Calibri"/>
-          <w:b/>
-          <w:color w:val="5D6B64"/>
-          <w:sz w:val="18"/>
-        </w:rPr>
-        <w:t>Thursday · 1 · feature pitch</w:t>
-      </w:r>
-    </w:p>
-    <w:p>
-      <w:pPr>
-        <w:spacing w:before="0" w:after="0" w:line="283" w:lineRule="auto"/>
-        <w:shd w:val="clear" w:color="auto" w:fill="F3F7F4"/>
-        <w:pBdr>
-          <w:top w:val="single" w:sz="8" w:space="8" w:color="CFE7DB"/>
-          <w:bottom w:val="single" w:sz="8" w:space="8" w:color="CFE7DB"/>
-          <w:left w:val="single" w:sz="8" w:space="8" w:color="CFE7DB"/>
-          <w:right w:val="single" w:sz="8" w:space="8" w:color="CFE7DB"/>
-        </w:pBdr>
-      </w:pPr>
-      <w:r>
-        <w:rPr>
-          <w:rFonts w:ascii="Consolas" w:hAnsi="Consolas"/>
-          <w:b w:val="0"/>
-          <w:color w:val="16211D"/>
-          <w:sz w:val="19"/>
-        </w:rPr>
-        <w:t>wcdraft is free and runs entirely in your browser — no app, no download, no account needed to play. Career peak or current form — you pick the rating basis. https://www.wcdraft.com/play</w:t>
-      </w:r>
-    </w:p>
-    <w:p>
-      <w:pPr>
-        <w:spacing w:before="40" w:after="200"/>
-      </w:pPr>
-      <w:r>
-        <w:rPr>
-          <w:rFonts w:ascii="Calibri" w:hAnsi="Calibri"/>
-          <w:b/>
-          <w:color w:val="F5B62A"/>
-          <w:sz w:val="17"/>
-        </w:rPr>
-        <w:t>180/280 chars</w:t>
-      </w:r>
-    </w:p>
-    <w:p>
-      <w:pPr>
-        <w:spacing w:before="160" w:after="40"/>
-      </w:pPr>
-      <w:r>
-        <w:rPr>
-          <w:rFonts w:ascii="Calibri" w:hAnsi="Calibri"/>
-          <w:b/>
-          <w:color w:val="5D6B64"/>
-          <w:sz w:val="18"/>
-        </w:rPr>
-        <w:t>Thursday · 2 · daily challenge</w:t>
-      </w:r>
-    </w:p>
-    <w:p>
-      <w:pPr>
-        <w:spacing w:before="0" w:after="0" w:line="283" w:lineRule="auto"/>
-        <w:shd w:val="clear" w:color="auto" w:fill="F3F7F4"/>
-        <w:pBdr>
-          <w:top w:val="single" w:sz="8" w:space="8" w:color="CFE7DB"/>
-          <w:bottom w:val="single" w:sz="8" w:space="8" w:color="CFE7DB"/>
-          <w:left w:val="single" w:sz="8" w:space="8" w:color="CFE7DB"/>
-          <w:right w:val="single" w:sz="8" w:space="8" w:color="CFE7DB"/>
-        </w:pBdr>
-      </w:pPr>
-      <w:r>
-        <w:rPr>
-          <w:rFonts w:ascii="Consolas" w:hAnsi="Consolas"/>
-          <w:b w:val="0"/>
-          <w:color w:val="16211D"/>
-          <w:sz w:val="19"/>
-        </w:rPr>
-        <w:t>Today's spin: Argentina 1982. Who's your pick? Nation Synergy rewards a connected XI. https://www.wcdraft.com/play</w:t>
-      </w:r>
-    </w:p>
-    <w:p>
-      <w:pPr>
-        <w:spacing w:before="40" w:after="200"/>
-      </w:pPr>
-      <w:r>
-        <w:rPr>
-          <w:rFonts w:ascii="Calibri" w:hAnsi="Calibri"/>
-          <w:b/>
-          <w:color w:val="F5B62A"/>
-          <w:sz w:val="17"/>
-        </w:rPr>
-        <w:t>109/280 chars</w:t>
-      </w:r>
-    </w:p>
-    <w:p>
-      <w:pPr>
-        <w:spacing w:before="160" w:after="40"/>
-      </w:pPr>
-      <w:r>
-        <w:rPr>
-          <w:rFonts w:ascii="Calibri" w:hAnsi="Calibri"/>
-          <w:b/>
-          <w:color w:val="5D6B64"/>
-          <w:sz w:val="18"/>
-        </w:rPr>
-        <w:t>Thursday · 3 · factoid</w:t>
-      </w:r>
-    </w:p>
-    <w:p>
-      <w:pPr>
-        <w:spacing w:before="0" w:after="0" w:line="283" w:lineRule="auto"/>
-        <w:shd w:val="clear" w:color="auto" w:fill="F3F7F4"/>
-        <w:pBdr>
-          <w:top w:val="single" w:sz="8" w:space="8" w:color="CFE7DB"/>
-          <w:bottom w:val="single" w:sz="8" w:space="8" w:color="CFE7DB"/>
-          <w:left w:val="single" w:sz="8" w:space="8" w:color="CFE7DB"/>
-          <w:right w:val="single" w:sz="8" w:space="8" w:color="CFE7DB"/>
-        </w:pBdr>
-      </w:pPr>
-      <w:r>
-        <w:rPr>
-          <w:rFonts w:ascii="Consolas" w:hAnsi="Consolas"/>
-          <w:b w:val="0"/>
-          <w:color w:val="16211D"/>
-          <w:sz w:val="19"/>
-        </w:rPr>
-        <w:t>You draft a manager too. Most games don't let you. Ronaldo (PRT) — a wcdraft all-time legend from the 2010 World Cup squad, 1 goal that tournament. https://www.wcdraft.com/play</w:t>
-      </w:r>
-    </w:p>
-    <w:p>
-      <w:pPr>
-        <w:spacing w:before="40" w:after="200"/>
-      </w:pPr>
-      <w:r>
-        <w:rPr>
-          <w:rFonts w:ascii="Calibri" w:hAnsi="Calibri"/>
-          <w:b/>
-          <w:color w:val="F5B62A"/>
-          <w:sz w:val="17"/>
-        </w:rPr>
-        <w:t>171/280 chars</w:t>
-      </w:r>
-    </w:p>
-    <w:p>
-      <w:pPr>
-        <w:spacing w:before="160" w:after="40"/>
-      </w:pPr>
-      <w:r>
-        <w:rPr>
-          <w:rFonts w:ascii="Calibri" w:hAnsi="Calibri"/>
-          <w:b/>
-          <w:color w:val="5D6B64"/>
-          <w:sz w:val="18"/>
-        </w:rPr>
-        <w:t>Thursday · 4 · feature pitch</w:t>
-      </w:r>
-    </w:p>
-    <w:p>
-      <w:pPr>
-        <w:spacing w:before="0" w:after="0" w:line="283" w:lineRule="auto"/>
-        <w:shd w:val="clear" w:color="auto" w:fill="F3F7F4"/>
-        <w:pBdr>
-          <w:top w:val="single" w:sz="8" w:space="8" w:color="CFE7DB"/>
-          <w:bottom w:val="single" w:sz="8" w:space="8" w:color="CFE7DB"/>
-          <w:left w:val="single" w:sz="8" w:space="8" w:color="CFE7DB"/>
-          <w:right w:val="single" w:sz="8" w:space="8" w:color="CFE7DB"/>
-        </w:pBdr>
-      </w:pPr>
-      <w:r>
-        <w:rPr>
-          <w:rFonts w:ascii="Consolas" w:hAnsi="Consolas"/>
-          <w:b w:val="0"/>
-          <w:color w:val="16211D"/>
-          <w:sz w:val="19"/>
-        </w:rPr>
-        <w:t>wcdraft is free and runs entirely in your browser — no app, no download, no account needed to play. https://www.wcdraft.com/play</w:t>
-      </w:r>
-    </w:p>
-    <w:p>
-      <w:pPr>
-        <w:spacing w:before="40" w:after="200"/>
-      </w:pPr>
-      <w:r>
-        <w:rPr>
-          <w:rFonts w:ascii="Calibri" w:hAnsi="Calibri"/>
-          <w:b/>
-          <w:color w:val="F5B62A"/>
-          <w:sz w:val="17"/>
-        </w:rPr>
-        <w:t>123/280 chars</w:t>
-      </w:r>
-    </w:p>
-    <w:p>
-      <w:pPr>
-        <w:spacing w:before="160" w:after="40"/>
-      </w:pPr>
-      <w:r>
-        <w:rPr>
-          <w:rFonts w:ascii="Calibri" w:hAnsi="Calibri"/>
-          <w:b/>
-          <w:color w:val="5D6B64"/>
-          <w:sz w:val="18"/>
-        </w:rPr>
-        <w:t>Thursday · 5 · daily challenge</w:t>
-      </w:r>
-    </w:p>
-    <w:p>
-      <w:pPr>
-        <w:spacing w:before="0" w:after="0" w:line="283" w:lineRule="auto"/>
-        <w:shd w:val="clear" w:color="auto" w:fill="F3F7F4"/>
-        <w:pBdr>
-          <w:top w:val="single" w:sz="8" w:space="8" w:color="CFE7DB"/>
-          <w:bottom w:val="single" w:sz="8" w:space="8" w:color="CFE7DB"/>
-          <w:left w:val="single" w:sz="8" w:space="8" w:color="CFE7DB"/>
-          <w:right w:val="single" w:sz="8" w:space="8" w:color="CFE7DB"/>
-        </w:pBdr>
-      </w:pPr>
-      <w:r>
-        <w:rPr>
-          <w:rFonts w:ascii="Consolas" w:hAnsi="Consolas"/>
-          <w:b w:val="0"/>
-          <w:color w:val="16211D"/>
-          <w:sz w:val="19"/>
-        </w:rPr>
-        <w:t>Today's spin: France 1958. Who's your pick? Submit your run to the leaderboard and rank up. https://www.wcdraft.com/play</w:t>
-      </w:r>
-    </w:p>
-    <w:p>
-      <w:pPr>
-        <w:spacing w:before="40" w:after="200"/>
-      </w:pPr>
-      <w:r>
-        <w:rPr>
-          <w:rFonts w:ascii="Calibri" w:hAnsi="Calibri"/>
-          <w:b/>
-          <w:color w:val="F5B62A"/>
-          <w:sz w:val="17"/>
-        </w:rPr>
-        <w:t>115/280 chars</w:t>
-      </w:r>
-    </w:p>
-    <w:p>
-      <w:pPr>
-        <w:spacing w:before="160" w:after="40"/>
-      </w:pPr>
-      <w:r>
-        <w:rPr>
-          <w:rFonts w:ascii="Calibri" w:hAnsi="Calibri"/>
-          <w:b/>
-          <w:color w:val="5D6B64"/>
-          <w:sz w:val="18"/>
-        </w:rPr>
-        <w:t>Thursday · 6 · factoid</w:t>
-      </w:r>
-    </w:p>
-    <w:p>
-      <w:pPr>
-        <w:spacing w:before="0" w:after="0" w:line="283" w:lineRule="auto"/>
-        <w:shd w:val="clear" w:color="auto" w:fill="F3F7F4"/>
-        <w:pBdr>
-          <w:top w:val="single" w:sz="8" w:space="8" w:color="CFE7DB"/>
-          <w:bottom w:val="single" w:sz="8" w:space="8" w:color="CFE7DB"/>
-          <w:left w:val="single" w:sz="8" w:space="8" w:color="CFE7DB"/>
-          <w:right w:val="single" w:sz="8" w:space="8" w:color="CFE7DB"/>
-        </w:pBdr>
-      </w:pPr>
-      <w:r>
-        <w:rPr>
-          <w:rFonts w:ascii="Consolas" w:hAnsi="Consolas"/>
-          <w:b w:val="0"/>
-          <w:color w:val="16211D"/>
-          <w:sz w:val="19"/>
-        </w:rPr>
-        <w:t>Classic, or Memory — ratings hidden until the reveal. Zico (BRA) — a wcdraft all-time legend from the 1978 World Cup squad, 1 goal that tournament. https://www.wcdraft.com/play</w:t>
-      </w:r>
-    </w:p>
-    <w:p>
-      <w:pPr>
-        <w:spacing w:before="40" w:after="200"/>
-      </w:pPr>
-      <w:r>
-        <w:rPr>
-          <w:rFonts w:ascii="Calibri" w:hAnsi="Calibri"/>
-          <w:b/>
-          <w:color w:val="F5B62A"/>
-          <w:sz w:val="17"/>
-        </w:rPr>
-        <w:t>171/280 chars</w:t>
-      </w:r>
-    </w:p>
-    <w:p>
-      <w:pPr>
-        <w:spacing w:before="220" w:after="100"/>
-        <w:pBdr>
-          <w:left w:val="single" w:sz="18" w:space="6" w:color="F5B62A"/>
-        </w:pBdr>
-      </w:pPr>
-      <w:r>
-        <w:rPr>
-          <w:rFonts w:ascii="Calibri" w:hAnsi="Calibri"/>
-          <w:b/>
-          <w:color w:val="16211D"/>
-          <w:sz w:val="25"/>
-        </w:rPr>
-        <w:t>Friday</w:t>
-      </w:r>
-    </w:p>
-    <w:p>
-      <w:pPr>
-        <w:spacing w:before="160" w:after="40"/>
-      </w:pPr>
-      <w:r>
-        <w:rPr>
-          <w:rFonts w:ascii="Calibri" w:hAnsi="Calibri"/>
-          <w:b/>
-          <w:color w:val="5D6B64"/>
-          <w:sz w:val="18"/>
-        </w:rPr>
-        <w:t>Friday · 1 · feature pitch</w:t>
-      </w:r>
-    </w:p>
-    <w:p>
-      <w:pPr>
-        <w:spacing w:before="0" w:after="0" w:line="283" w:lineRule="auto"/>
-        <w:shd w:val="clear" w:color="auto" w:fill="F3F7F4"/>
-        <w:pBdr>
-          <w:top w:val="single" w:sz="8" w:space="8" w:color="CFE7DB"/>
-          <w:bottom w:val="single" w:sz="8" w:space="8" w:color="CFE7DB"/>
-          <w:left w:val="single" w:sz="8" w:space="8" w:color="CFE7DB"/>
-          <w:right w:val="single" w:sz="8" w:space="8" w:color="CFE7DB"/>
-        </w:pBdr>
-      </w:pPr>
-      <w:r>
-        <w:rPr>
-          <w:rFonts w:ascii="Consolas" w:hAnsi="Consolas"/>
-          <w:b w:val="0"/>
-          <w:color w:val="16211D"/>
-          <w:sz w:val="19"/>
-        </w:rPr>
-        <w:t>Post your run to a season-keyed ranked leaderboard and see where your XI lands. Every run has a shareable, replayable link. https://www.wcdraft.com/play</w:t>
-      </w:r>
-    </w:p>
-    <w:p>
-      <w:pPr>
-        <w:spacing w:before="40" w:after="200"/>
-      </w:pPr>
-      <w:r>
-        <w:rPr>
-          <w:rFonts w:ascii="Calibri" w:hAnsi="Calibri"/>
-          <w:b/>
-          <w:color w:val="F5B62A"/>
-          <w:sz w:val="17"/>
-        </w:rPr>
-        <w:t>147/280 chars</w:t>
-      </w:r>
-    </w:p>
-    <w:p>
-      <w:pPr>
-        <w:spacing w:before="160" w:after="40"/>
-      </w:pPr>
-      <w:r>
-        <w:rPr>
-          <w:rFonts w:ascii="Calibri" w:hAnsi="Calibri"/>
-          <w:b/>
-          <w:color w:val="5D6B64"/>
-          <w:sz w:val="18"/>
-        </w:rPr>
-        <w:t>Friday · 2 · daily challenge</w:t>
-      </w:r>
-    </w:p>
-    <w:p>
-      <w:pPr>
-        <w:spacing w:before="0" w:after="0" w:line="283" w:lineRule="auto"/>
-        <w:shd w:val="clear" w:color="auto" w:fill="F3F7F4"/>
-        <w:pBdr>
-          <w:top w:val="single" w:sz="8" w:space="8" w:color="CFE7DB"/>
-          <w:bottom w:val="single" w:sz="8" w:space="8" w:color="CFE7DB"/>
-          <w:left w:val="single" w:sz="8" w:space="8" w:color="CFE7DB"/>
-          <w:right w:val="single" w:sz="8" w:space="8" w:color="CFE7DB"/>
-        </w:pBdr>
-      </w:pPr>
-      <w:r>
-        <w:rPr>
-          <w:rFonts w:ascii="Consolas" w:hAnsi="Consolas"/>
-          <w:b w:val="0"/>
-          <w:color w:val="16211D"/>
-          <w:sz w:val="19"/>
-        </w:rPr>
-        <w:t>France 1982 just rolled. One pick — who makes your all-time XI? Search the rolled squad by name, filter by position. https://www.wcdraft.com/play</w:t>
-      </w:r>
-    </w:p>
-    <w:p>
-      <w:pPr>
-        <w:spacing w:before="40" w:after="200"/>
-      </w:pPr>
-      <w:r>
-        <w:rPr>
-          <w:rFonts w:ascii="Calibri" w:hAnsi="Calibri"/>
-          <w:b/>
-          <w:color w:val="F5B62A"/>
-          <w:sz w:val="17"/>
-        </w:rPr>
-        <w:t>140/280 chars</w:t>
-      </w:r>
-    </w:p>
-    <w:p>
-      <w:pPr>
-        <w:spacing w:before="160" w:after="40"/>
-      </w:pPr>
-      <w:r>
-        <w:rPr>
-          <w:rFonts w:ascii="Calibri" w:hAnsi="Calibri"/>
-          <w:b/>
-          <w:color w:val="5D6B64"/>
-          <w:sz w:val="18"/>
-        </w:rPr>
-        <w:t>Friday · 3 · factoid</w:t>
-      </w:r>
-    </w:p>
-    <w:p>
-      <w:pPr>
-        <w:spacing w:before="0" w:after="0" w:line="283" w:lineRule="auto"/>
-        <w:shd w:val="clear" w:color="auto" w:fill="F3F7F4"/>
-        <w:pBdr>
-          <w:top w:val="single" w:sz="8" w:space="8" w:color="CFE7DB"/>
-          <w:bottom w:val="single" w:sz="8" w:space="8" w:color="CFE7DB"/>
-          <w:left w:val="single" w:sz="8" w:space="8" w:color="CFE7DB"/>
-          <w:right w:val="single" w:sz="8" w:space="8" w:color="CFE7DB"/>
-        </w:pBdr>
-      </w:pPr>
-      <w:r>
-        <w:rPr>
-          <w:rFonts w:ascii="Consolas" w:hAnsi="Consolas"/>
-          <w:b w:val="0"/>
-          <w:color w:val="16211D"/>
-          <w:sz w:val="19"/>
-        </w:rPr>
-        <w:t>Two ways to value a player: Career or Current. Müller (DEU) — a wcdraft all-time legend from the 1974 World Cup squad, 4 goals that tournament. https://www.wcdraft.com/play</w:t>
-      </w:r>
-    </w:p>
-    <w:p>
-      <w:pPr>
-        <w:spacing w:before="40" w:after="200"/>
-      </w:pPr>
-      <w:r>
-        <w:rPr>
-          <w:rFonts w:ascii="Calibri" w:hAnsi="Calibri"/>
-          <w:b/>
-          <w:color w:val="F5B62A"/>
-          <w:sz w:val="17"/>
-        </w:rPr>
-        <w:t>167/280 chars</w:t>
-      </w:r>
-    </w:p>
-    <w:p>
-      <w:pPr>
-        <w:spacing w:before="160" w:after="40"/>
-      </w:pPr>
-      <w:r>
-        <w:rPr>
-          <w:rFonts w:ascii="Calibri" w:hAnsi="Calibri"/>
-          <w:b/>
-          <w:color w:val="5D6B64"/>
-          <w:sz w:val="18"/>
-        </w:rPr>
-        <w:t>Friday · 4 · feature pitch</w:t>
-      </w:r>
-    </w:p>
-    <w:p>
-      <w:pPr>
-        <w:spacing w:before="0" w:after="0" w:line="283" w:lineRule="auto"/>
-        <w:shd w:val="clear" w:color="auto" w:fill="F3F7F4"/>
-        <w:pBdr>
-          <w:top w:val="single" w:sz="8" w:space="8" w:color="CFE7DB"/>
-          <w:bottom w:val="single" w:sz="8" w:space="8" w:color="CFE7DB"/>
-          <w:left w:val="single" w:sz="8" w:space="8" w:color="CFE7DB"/>
-          <w:right w:val="single" w:sz="8" w:space="8" w:color="CFE7DB"/>
-        </w:pBdr>
-      </w:pPr>
-      <w:r>
-        <w:rPr>
-          <w:rFonts w:ascii="Consolas" w:hAnsi="Consolas"/>
-          <w:b w:val="0"/>
-          <w:color w:val="16211D"/>
-          <w:sz w:val="19"/>
-        </w:rPr>
-        <w:t>Every run gets a shareable link that replays the exact same draft and result in any browser — same seed, same outcome. https://www.wcdraft.com/play</w:t>
-      </w:r>
-    </w:p>
-    <w:p>
-      <w:pPr>
-        <w:spacing w:before="40" w:after="200"/>
-      </w:pPr>
-      <w:r>
-        <w:rPr>
-          <w:rFonts w:ascii="Calibri" w:hAnsi="Calibri"/>
-          <w:b/>
-          <w:color w:val="F5B62A"/>
-          <w:sz w:val="17"/>
-        </w:rPr>
-        <w:t>142/280 chars</w:t>
-      </w:r>
-    </w:p>
-    <w:p>
-      <w:pPr>
-        <w:spacing w:before="160" w:after="40"/>
-      </w:pPr>
-      <w:r>
-        <w:rPr>
-          <w:rFonts w:ascii="Calibri" w:hAnsi="Calibri"/>
-          <w:b/>
-          <w:color w:val="5D6B64"/>
-          <w:sz w:val="18"/>
-        </w:rPr>
-        <w:t>Friday · 5 · daily challenge</w:t>
-      </w:r>
-    </w:p>
-    <w:p>
-      <w:pPr>
-        <w:spacing w:before="0" w:after="0" w:line="283" w:lineRule="auto"/>
-        <w:shd w:val="clear" w:color="auto" w:fill="F3F7F4"/>
-        <w:pBdr>
-          <w:top w:val="single" w:sz="8" w:space="8" w:color="CFE7DB"/>
-          <w:bottom w:val="single" w:sz="8" w:space="8" w:color="CFE7DB"/>
-          <w:left w:val="single" w:sz="8" w:space="8" w:color="CFE7DB"/>
-          <w:right w:val="single" w:sz="8" w:space="8" w:color="CFE7DB"/>
-        </w:pBdr>
-      </w:pPr>
-      <w:r>
-        <w:rPr>
-          <w:rFonts w:ascii="Consolas" w:hAnsi="Consolas"/>
-          <w:b w:val="0"/>
-          <w:color w:val="16211D"/>
-          <w:sz w:val="19"/>
-        </w:rPr>
-        <w:t>Position First: lock the slot, then spin for who fills it. Today's seed: Soviet Union 1966 — spin it and pick. https://www.wcdraft.com/play</w:t>
-      </w:r>
-    </w:p>
-    <w:p>
-      <w:pPr>
-        <w:spacing w:before="40" w:after="200"/>
-      </w:pPr>
-      <w:r>
-        <w:rPr>
-          <w:rFonts w:ascii="Calibri" w:hAnsi="Calibri"/>
-          <w:b/>
-          <w:color w:val="F5B62A"/>
-          <w:sz w:val="17"/>
-        </w:rPr>
-        <w:t>134/280 chars</w:t>
-      </w:r>
-    </w:p>
-    <w:p>
-      <w:pPr>
-        <w:spacing w:before="160" w:after="40"/>
-      </w:pPr>
-      <w:r>
-        <w:rPr>
-          <w:rFonts w:ascii="Calibri" w:hAnsi="Calibri"/>
-          <w:b/>
-          <w:color w:val="5D6B64"/>
-          <w:sz w:val="18"/>
-        </w:rPr>
-        <w:t>Friday · 6 · factoid</w:t>
-      </w:r>
-    </w:p>
-    <w:p>
-      <w:pPr>
-        <w:spacing w:before="0" w:after="0" w:line="283" w:lineRule="auto"/>
-        <w:shd w:val="clear" w:color="auto" w:fill="F3F7F4"/>
-        <w:pBdr>
-          <w:top w:val="single" w:sz="8" w:space="8" w:color="CFE7DB"/>
-          <w:bottom w:val="single" w:sz="8" w:space="8" w:color="CFE7DB"/>
-          <w:left w:val="single" w:sz="8" w:space="8" w:color="CFE7DB"/>
-          <w:right w:val="single" w:sz="8" w:space="8" w:color="CFE7DB"/>
-        </w:pBdr>
-      </w:pPr>
-      <w:r>
-        <w:rPr>
-          <w:rFonts w:ascii="Consolas" w:hAnsi="Consolas"/>
-          <w:b w:val="0"/>
-          <w:color w:val="16211D"/>
-          <w:sz w:val="19"/>
-        </w:rPr>
-        <w:t>Henry (FRA), 1998: a forward with 6 appearances that World Cup — in the wcdraft pool. Ranked board, keyed to the season. Climb it. https://www.wcdraft.com/play</w:t>
-      </w:r>
-    </w:p>
-    <w:p>
-      <w:pPr>
-        <w:spacing w:before="40" w:after="200"/>
-      </w:pPr>
-      <w:r>
-        <w:rPr>
-          <w:rFonts w:ascii="Calibri" w:hAnsi="Calibri"/>
-          <w:b/>
-          <w:color w:val="F5B62A"/>
-          <w:sz w:val="17"/>
-        </w:rPr>
-        <w:t>154/280 chars</w:t>
-      </w:r>
-    </w:p>
-    <w:p>
-      <w:pPr>
-        <w:spacing w:before="220" w:after="100"/>
-        <w:pBdr>
-          <w:left w:val="single" w:sz="18" w:space="6" w:color="F5B62A"/>
-        </w:pBdr>
-      </w:pPr>
-      <w:r>
-        <w:rPr>
-          <w:rFonts w:ascii="Calibri" w:hAnsi="Calibri"/>
-          <w:b/>
-          <w:color w:val="16211D"/>
-          <w:sz w:val="25"/>
-        </w:rPr>
-        <w:t>Saturday</w:t>
-      </w:r>
-    </w:p>
-    <w:p>
-      <w:pPr>
-        <w:spacing w:before="160" w:after="40"/>
-      </w:pPr>
-      <w:r>
-        <w:rPr>
-          <w:rFonts w:ascii="Calibri" w:hAnsi="Calibri"/>
-          <w:b/>
-          <w:color w:val="5D6B64"/>
-          <w:sz w:val="18"/>
-        </w:rPr>
-        <w:t>Saturday · 1 · feature pitch</w:t>
-      </w:r>
-    </w:p>
-    <w:p>
-      <w:pPr>
-        <w:spacing w:before="0" w:after="0" w:line="283" w:lineRule="auto"/>
-        <w:shd w:val="clear" w:color="auto" w:fill="F3F7F4"/>
-        <w:pBdr>
-          <w:top w:val="single" w:sz="8" w:space="8" w:color="CFE7DB"/>
-          <w:bottom w:val="single" w:sz="8" w:space="8" w:color="CFE7DB"/>
-          <w:left w:val="single" w:sz="8" w:space="8" w:color="CFE7DB"/>
-          <w:right w:val="single" w:sz="8" w:space="8" w:color="CFE7DB"/>
-        </w:pBdr>
-      </w:pPr>
-      <w:r>
-        <w:rPr>
-          <w:rFonts w:ascii="Consolas" w:hAnsi="Consolas"/>
-          <w:b w:val="0"/>
-          <w:color w:val="16211D"/>
-          <w:sz w:val="19"/>
-        </w:rPr>
-        <w:t>Pick your draft order: Squad First, or Position First — commit a slot to fill before the squad is even revealed. https://www.wcdraft.com/play</w:t>
-      </w:r>
-    </w:p>
-    <w:p>
-      <w:pPr>
-        <w:spacing w:before="40" w:after="200"/>
-      </w:pPr>
-      <w:r>
-        <w:rPr>
-          <w:rFonts w:ascii="Calibri" w:hAnsi="Calibri"/>
-          <w:b/>
-          <w:color w:val="F5B62A"/>
-          <w:sz w:val="17"/>
-        </w:rPr>
-        <w:t>136/280 chars</w:t>
-      </w:r>
-    </w:p>
-    <w:p>
-      <w:pPr>
-        <w:spacing w:before="160" w:after="40"/>
-      </w:pPr>
-      <w:r>
-        <w:rPr>
-          <w:rFonts w:ascii="Calibri" w:hAnsi="Calibri"/>
-          <w:b/>
-          <w:color w:val="5D6B64"/>
-          <w:sz w:val="18"/>
-        </w:rPr>
-        <w:t>Saturday · 2 · daily challenge</w:t>
-      </w:r>
-    </w:p>
-    <w:p>
-      <w:pPr>
-        <w:spacing w:before="0" w:after="0" w:line="283" w:lineRule="auto"/>
-        <w:shd w:val="clear" w:color="auto" w:fill="F3F7F4"/>
-        <w:pBdr>
-          <w:top w:val="single" w:sz="8" w:space="8" w:color="CFE7DB"/>
-          <w:bottom w:val="single" w:sz="8" w:space="8" w:color="CFE7DB"/>
-          <w:left w:val="single" w:sz="8" w:space="8" w:color="CFE7DB"/>
-          <w:right w:val="single" w:sz="8" w:space="8" w:color="CFE7DB"/>
-        </w:pBdr>
-      </w:pPr>
-      <w:r>
-        <w:rPr>
-          <w:rFonts w:ascii="Consolas" w:hAnsi="Consolas"/>
-          <w:b w:val="0"/>
-          <w:color w:val="16211D"/>
-          <w:sz w:val="19"/>
-        </w:rPr>
-        <w:t>Squad First or Position First — your call. Today's seed: Spain 2002 — spin it and pick. https://www.wcdraft.com/play</w:t>
-      </w:r>
-    </w:p>
-    <w:p>
-      <w:pPr>
-        <w:spacing w:before="40" w:after="200"/>
-      </w:pPr>
-      <w:r>
-        <w:rPr>
-          <w:rFonts w:ascii="Calibri" w:hAnsi="Calibri"/>
-          <w:b/>
-          <w:color w:val="F5B62A"/>
-          <w:sz w:val="17"/>
-        </w:rPr>
-        <w:t>111/280 chars</w:t>
-      </w:r>
-    </w:p>
-    <w:p>
-      <w:pPr>
-        <w:spacing w:before="160" w:after="40"/>
-      </w:pPr>
-      <w:r>
-        <w:rPr>
-          <w:rFonts w:ascii="Calibri" w:hAnsi="Calibri"/>
-          <w:b/>
-          <w:color w:val="5D6B64"/>
-          <w:sz w:val="18"/>
-        </w:rPr>
-        <w:t>Saturday · 3 · factoid</w:t>
-      </w:r>
-    </w:p>
-    <w:p>
-      <w:pPr>
-        <w:spacing w:before="0" w:after="0" w:line="283" w:lineRule="auto"/>
-        <w:shd w:val="clear" w:color="auto" w:fill="F3F7F4"/>
-        <w:pBdr>
-          <w:top w:val="single" w:sz="8" w:space="8" w:color="CFE7DB"/>
-          <w:bottom w:val="single" w:sz="8" w:space="8" w:color="CFE7DB"/>
-          <w:left w:val="single" w:sz="8" w:space="8" w:color="CFE7DB"/>
-          <w:right w:val="single" w:sz="8" w:space="8" w:color="CFE7DB"/>
-        </w:pBdr>
-      </w:pPr>
-      <w:r>
-        <w:rPr>
-          <w:rFonts w:ascii="Consolas" w:hAnsi="Consolas"/>
-          <w:b w:val="0"/>
-          <w:color w:val="16211D"/>
-          <w:sz w:val="19"/>
-        </w:rPr>
-        <w:t>Same-nation picks build Synergy — watch it live as you draft. Sindelar (AUT) — a wcdraft all-time legend from the 1934 World Cup squad, 1 goal that tournament. https://www.wcdraft.com/play</w:t>
-      </w:r>
-    </w:p>
-    <w:p>
-      <w:pPr>
-        <w:spacing w:before="40" w:after="200"/>
-      </w:pPr>
-      <w:r>
-        <w:rPr>
-          <w:rFonts w:ascii="Calibri" w:hAnsi="Calibri"/>
-          <w:b/>
-          <w:color w:val="F5B62A"/>
-          <w:sz w:val="17"/>
-        </w:rPr>
-        <w:t>183/280 chars</w:t>
-      </w:r>
-    </w:p>
-    <w:p>
-      <w:pPr>
-        <w:spacing w:before="160" w:after="40"/>
-      </w:pPr>
-      <w:r>
-        <w:rPr>
-          <w:rFonts w:ascii="Calibri" w:hAnsi="Calibri"/>
-          <w:b/>
-          <w:color w:val="5D6B64"/>
-          <w:sz w:val="18"/>
-        </w:rPr>
-        <w:t>Saturday · 4 · feature pitch</w:t>
-      </w:r>
-    </w:p>
-    <w:p>
-      <w:pPr>
-        <w:spacing w:before="0" w:after="0" w:line="283" w:lineRule="auto"/>
-        <w:shd w:val="clear" w:color="auto" w:fill="F3F7F4"/>
-        <w:pBdr>
-          <w:top w:val="single" w:sz="8" w:space="8" w:color="CFE7DB"/>
-          <w:bottom w:val="single" w:sz="8" w:space="8" w:color="CFE7DB"/>
-          <w:left w:val="single" w:sz="8" w:space="8" w:color="CFE7DB"/>
-          <w:right w:val="single" w:sz="8" w:space="8" w:color="CFE7DB"/>
-        </w:pBdr>
-      </w:pPr>
-      <w:r>
-        <w:rPr>
-          <w:rFonts w:ascii="Consolas" w:hAnsi="Consolas"/>
-          <w:b w:val="0"/>
-          <w:color w:val="16211D"/>
-          <w:sz w:val="19"/>
-        </w:rPr>
-        <w:t>Players from the same nation build Synergy — a live preview shows your XI's connections as you draft. Run the real 2026 bracket — 8 matches, a perfect run is 8-0. https://www.wcdraft.com/play</w:t>
-      </w:r>
-    </w:p>
-    <w:p>
-      <w:pPr>
-        <w:spacing w:before="40" w:after="200"/>
-      </w:pPr>
-      <w:r>
-        <w:rPr>
-          <w:rFonts w:ascii="Calibri" w:hAnsi="Calibri"/>
-          <w:b/>
-          <w:color w:val="F5B62A"/>
-          <w:sz w:val="17"/>
-        </w:rPr>
-        <w:t>186/280 chars</w:t>
-      </w:r>
-    </w:p>
-    <w:p>
-      <w:pPr>
-        <w:spacing w:before="160" w:after="40"/>
-      </w:pPr>
-      <w:r>
-        <w:rPr>
-          <w:rFonts w:ascii="Calibri" w:hAnsi="Calibri"/>
-          <w:b/>
-          <w:color w:val="5D6B64"/>
-          <w:sz w:val="18"/>
-        </w:rPr>
-        <w:t>Saturday · 5 · daily challenge</w:t>
-      </w:r>
-    </w:p>
-    <w:p>
-      <w:pPr>
-        <w:spacing w:before="0" w:after="0" w:line="283" w:lineRule="auto"/>
-        <w:shd w:val="clear" w:color="auto" w:fill="F3F7F4"/>
-        <w:pBdr>
-          <w:top w:val="single" w:sz="8" w:space="8" w:color="CFE7DB"/>
-          <w:bottom w:val="single" w:sz="8" w:space="8" w:color="CFE7DB"/>
-          <w:left w:val="single" w:sz="8" w:space="8" w:color="CFE7DB"/>
-          <w:right w:val="single" w:sz="8" w:space="8" w:color="CFE7DB"/>
-        </w:pBdr>
-      </w:pPr>
-      <w:r>
-        <w:rPr>
-          <w:rFonts w:ascii="Consolas" w:hAnsi="Consolas"/>
-          <w:b w:val="0"/>
-          <w:color w:val="16211D"/>
-          <w:sz w:val="19"/>
-        </w:rPr>
-        <w:t>Today's spin: West Germany 1978. Who's your pick? Draft across 1930–2026, or narrow to one era. https://www.wcdraft.com/play</w:t>
-      </w:r>
-    </w:p>
-    <w:p>
-      <w:pPr>
-        <w:spacing w:before="40" w:after="200"/>
-      </w:pPr>
-      <w:r>
-        <w:rPr>
-          <w:rFonts w:ascii="Calibri" w:hAnsi="Calibri"/>
-          <w:b/>
-          <w:color w:val="F5B62A"/>
-          <w:sz w:val="17"/>
-        </w:rPr>
-        <w:t>119/280 chars</w:t>
-      </w:r>
-    </w:p>
-    <w:p>
-      <w:pPr>
-        <w:spacing w:before="160" w:after="40"/>
-      </w:pPr>
-      <w:r>
-        <w:rPr>
-          <w:rFonts w:ascii="Calibri" w:hAnsi="Calibri"/>
-          <w:b/>
-          <w:color w:val="5D6B64"/>
-          <w:sz w:val="18"/>
-        </w:rPr>
-        <w:t>Saturday · 6 · factoid</w:t>
-      </w:r>
-    </w:p>
-    <w:p>
-      <w:pPr>
-        <w:spacing w:before="0" w:after="0" w:line="283" w:lineRule="auto"/>
-        <w:shd w:val="clear" w:color="auto" w:fill="F3F7F4"/>
-        <w:pBdr>
-          <w:top w:val="single" w:sz="8" w:space="8" w:color="CFE7DB"/>
-          <w:bottom w:val="single" w:sz="8" w:space="8" w:color="CFE7DB"/>
-          <w:left w:val="single" w:sz="8" w:space="8" w:color="CFE7DB"/>
-          <w:right w:val="single" w:sz="8" w:space="8" w:color="CFE7DB"/>
-        </w:pBdr>
-      </w:pPr>
-      <w:r>
-        <w:rPr>
-          <w:rFonts w:ascii="Consolas" w:hAnsi="Consolas"/>
-          <w:b w:val="0"/>
-          <w:color w:val="16211D"/>
-          <w:sz w:val="19"/>
-        </w:rPr>
-        <w:t>Memory mode hides the numbers until you simulate. Rivaldo (BRA), 1998: a midfielder with 7 appearances that World Cup — in the wcdraft pool. https://www.wcdraft.com/play</w:t>
-      </w:r>
-    </w:p>
-    <w:p>
-      <w:pPr>
-        <w:spacing w:before="40" w:after="200"/>
-      </w:pPr>
-      <w:r>
-        <w:rPr>
-          <w:rFonts w:ascii="Calibri" w:hAnsi="Calibri"/>
-          <w:b/>
-          <w:color w:val="F5B62A"/>
-          <w:sz w:val="17"/>
-        </w:rPr>
-        <w:t>164/280 chars</w:t>
+        <w:t>165/280 chars</w:t>
       </w:r>
     </w:p>
     <w:p>
@@ -2451,7 +2451,7 @@
           <w:color w:val="16211D"/>
           <w:sz w:val="19"/>
         </w:rPr>
-        <w:t>Every run gets a shareable link that replays the exact same draft and result in any browser — same seed, same outcome. Career peak or current form — you pick the rating basis. https://www.wcdraft.com/play</w:t>
+        <w:t>Post your run to a season-keyed ranked leaderboard and see where your XI lands. https://www.wcdraft.com/play</w:t>
       </w:r>
     </w:p>
     <w:p>
@@ -2465,7 +2465,7 @@
           <w:color w:val="F5B62A"/>
           <w:sz w:val="17"/>
         </w:rPr>
-        <w:t>199/280 chars</w:t>
+        <w:t>103/280 chars</w:t>
       </w:r>
     </w:p>
     <w:p>
@@ -2500,7 +2500,7 @@
           <w:color w:val="16211D"/>
           <w:sz w:val="19"/>
         </w:rPr>
-        <w:t>Classic, or Memory — ratings hidden until the reveal. Today's seed: Argentina 1982 — spin it and pick. https://www.wcdraft.com/play</w:t>
+        <w:t>Tomorrow's Group I double-header is France v Iraq and Norway v Senegal. Draft one of those nations tonight; reveal only after the sim. https://www.wcdraft.com/play</w:t>
       </w:r>
     </w:p>
     <w:p>
@@ -2514,7 +2514,7 @@
           <w:color w:val="F5B62A"/>
           <w:sz w:val="17"/>
         </w:rPr>
-        <w:t>126/280 chars</w:t>
+        <w:t>158/280 chars</w:t>
       </w:r>
     </w:p>
     <w:p>
@@ -2549,7 +2549,7 @@
           <w:color w:val="16211D"/>
           <w:sz w:val="19"/>
         </w:rPr>
-        <w:t>Ronaldo (BRA) — a wcdraft all-time legend from the 1998 World Cup squad, 4 goals that tournament. 17 spins, one pick each — 16 players and a manager. https://www.wcdraft.com/play</w:t>
+        <w:t>Classic, or Memory — ratings hidden until the reveal. Pirlo (ITA), 2010: a midfielder with 1 appearance that World Cup — in the wcdraft pool. https://www.wcdraft.com/play</w:t>
       </w:r>
     </w:p>
     <w:p>
@@ -2563,7 +2563,7 @@
           <w:color w:val="F5B62A"/>
           <w:sz w:val="17"/>
         </w:rPr>
-        <w:t>173/280 chars</w:t>
+        <w:t>165/280 chars</w:t>
       </w:r>
     </w:p>
     <w:p>
@@ -2598,7 +2598,7 @@
           <w:color w:val="16211D"/>
           <w:sz w:val="19"/>
         </w:rPr>
-        <w:t>Seventeen spins, one pick on each: sixteen players for your XI and bench, plus one manager. There's a season-keyed leaderboard — post your run. https://www.wcdraft.com/play</w:t>
+        <w:t>wcdraft is free and runs entirely in your browser — no app, no download, no account needed to play. Managers are a pick here — one of your 17 spins. https://www.wcdraft.com/play</w:t>
       </w:r>
     </w:p>
     <w:p>
@@ -2612,7 +2612,7 @@
           <w:color w:val="F5B62A"/>
           <w:sz w:val="17"/>
         </w:rPr>
-        <w:t>167/280 chars</w:t>
+        <w:t>172/280 chars</w:t>
       </w:r>
     </w:p>
     <w:p>
@@ -2647,7 +2647,7 @@
           <w:color w:val="16211D"/>
           <w:sz w:val="19"/>
         </w:rPr>
-        <w:t>Netherlands 1974 just rolled. One pick — who makes your all-time XI? 16 players + a manager, one spin at a time. https://www.wcdraft.com/play</w:t>
+        <w:t>England 1982 just rolled. One pick — who makes your all-time XI? No app store, no install — just open it and draft. https://www.wcdraft.com/play</w:t>
       </w:r>
     </w:p>
     <w:p>
@@ -2661,7 +2661,7 @@
           <w:color w:val="F5B62A"/>
           <w:sz w:val="17"/>
         </w:rPr>
-        <w:t>136/280 chars</w:t>
+        <w:t>139/280 chars</w:t>
       </w:r>
     </w:p>
     <w:p>
@@ -2696,7 +2696,7 @@
           <w:color w:val="16211D"/>
           <w:sz w:val="19"/>
         </w:rPr>
-        <w:t>There's a season-keyed leaderboard — post your run. Buffon (ITA) — a wcdraft all-time legend from the 1998 World Cup squad: a goalkeeper you can draft into your all-time XI. https://www.wcdraft.com/play</w:t>
+        <w:t>Nation Synergy rewards a connected XI. Drogba (CIV) — a wcdraft all-time legend from the 2014 World Cup squad: a forward you can draft into your all-time XI. https://www.wcdraft.com/play</w:t>
       </w:r>
     </w:p>
     <w:p>
@@ -2710,7 +2710,7 @@
           <w:color w:val="F5B62A"/>
           <w:sz w:val="17"/>
         </w:rPr>
-        <w:t>197/280 chars</w:t>
+        <w:t>181/280 chars</w:t>
       </w:r>
     </w:p>
     <w:p>
@@ -2742,63 +2742,6 @@
           <w:sz w:val="21"/>
         </w:rPr>
         <w:t>Post one only when you (or a player) have a genuinely strong real run. The record is computed from a real share token — never invented.</w:t>
-      </w:r>
-    </w:p>
-    <w:p>
-      <w:pPr>
-        <w:spacing w:before="160" w:after="40"/>
-      </w:pPr>
-      <w:r>
-        <w:rPr>
-          <w:rFonts w:ascii="Calibri" w:hAnsi="Calibri"/>
-          <w:b/>
-          <w:color w:val="5D6B64"/>
-          <w:sz w:val="18"/>
-        </w:rPr>
-        <w:t>Result spotlight · 1 · result spotlight</w:t>
-      </w:r>
-    </w:p>
-    <w:p>
-      <w:pPr>
-        <w:spacing w:before="0" w:after="0" w:line="283" w:lineRule="auto"/>
-        <w:shd w:val="clear" w:color="auto" w:fill="F3F7F4"/>
-        <w:pBdr>
-          <w:top w:val="single" w:sz="8" w:space="8" w:color="CFE7DB"/>
-          <w:bottom w:val="single" w:sz="8" w:space="8" w:color="CFE7DB"/>
-          <w:left w:val="single" w:sz="8" w:space="8" w:color="CFE7DB"/>
-          <w:right w:val="single" w:sz="8" w:space="8" w:color="CFE7DB"/>
-        </w:pBdr>
-      </w:pPr>
-      <w:r>
-        <w:rPr>
-          <w:rFonts w:ascii="Consolas" w:hAnsi="Consolas"/>
-          <w:b w:val="0"/>
-          <w:color w:val="16211D"/>
-          <w:sz w:val="19"/>
-        </w:rPr>
-        <w:t>Career peak or current form — you pick the rating basis. Azteca XI finished 2-0-2, 7 for / 7 against — same seed, same outcome, any browser: https://www.wcdraft.com/play/share?run=t2.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</w:t>
-      </w:r>
-    </w:p>
-    <w:p>
-      <w:pPr>
-        <w:spacing w:before="40" w:after="200"/>
-      </w:pPr>
-      <w:r>
-        <w:rPr>
-          <w:rFonts w:ascii="Calibri" w:hAnsi="Calibri"/>
-          <w:b/>
-          <w:color w:val="F5B62A"/>
-          <w:sz w:val="17"/>
-        </w:rPr>
-        <w:t>164/280 chars</w:t>
-      </w:r>
-      <w:r>
-        <w:rPr>
-          <w:i/>
-          <w:color w:val="5D6B64"/>
-          <w:sz w:val="17"/>
-        </w:rPr>
-        <w:t xml:space="preserve">   SAMPLE run — replace with your own strong run's share link before posting</w:t>
       </w:r>
     </w:p>
     <w:p>

</xml_diff>

<commit_message>
docs(marketing): refresh x pack for w25 (#153)
</commit_message>
<xml_diff>
--- a/marketing/x/playbook/wcdraft-x-playbook.docx
+++ b/marketing/x/playbook/wcdraft-x-playbook.docx
@@ -53,7 +53,7 @@
           <w:color w:val="2ECF92"/>
           <w:sz w:val="28"/>
         </w:rPr>
-        <w:t>Week 2026-W24</w:t>
+        <w:t>Week 2026-W25</w:t>
       </w:r>
     </w:p>
     <w:p>
@@ -66,7 +66,7 @@
           <w:color w:val="5D6B64"/>
           <w:sz w:val="21"/>
         </w:rPr>
-        <w:t>Generated 2026-06-14  ·  organic-only operator guide</w:t>
+        <w:t>Generated 2026-06-15  ·  organic-only operator guide</w:t>
       </w:r>
     </w:p>
     <w:p>
@@ -519,7 +519,7 @@
           <w:color w:val="2ECF92"/>
           <w:sz w:val="34"/>
         </w:rPr>
-        <w:t>This week's posts (W24)</w:t>
+        <w:t>This week's posts (W25)</w:t>
       </w:r>
     </w:p>
     <w:p>
@@ -533,7 +533,7 @@
           <w:color w:val="5D6B64"/>
           <w:sz w:val="21"/>
         </w:rPr>
-        <w:t>43 ready-to-paste posts, grouped by day. Pick the strongest 3–5 per day — you don't post them all. Copy one block, paste into the composer, schedule.</w:t>
+        <w:t>42 ready-to-paste posts, grouped by day. Pick the strongest 3–5 per day — you don't post them all. Copy one block, paste into the composer, schedule.</w:t>
       </w:r>
     </w:p>
     <w:p>
@@ -585,6 +585,317 @@
           <w:color w:val="16211D"/>
           <w:sz w:val="19"/>
         </w:rPr>
+        <w:t>Players from the same nation build Synergy — a live preview shows your XI's connections as you draft. Filter by position and search by name — in the draft. https://www.wcdraft.com/play</w:t>
+      </w:r>
+    </w:p>
+    <w:p>
+      <w:pPr>
+        <w:spacing w:before="40" w:after="200"/>
+      </w:pPr>
+      <w:r>
+        <w:rPr>
+          <w:rFonts w:ascii="Calibri" w:hAnsi="Calibri"/>
+          <w:b/>
+          <w:color w:val="F5B62A"/>
+          <w:sz w:val="17"/>
+        </w:rPr>
+        <w:t>179/280 chars</w:t>
+      </w:r>
+    </w:p>
+    <w:p>
+      <w:pPr>
+        <w:spacing w:before="160" w:after="40"/>
+      </w:pPr>
+      <w:r>
+        <w:rPr>
+          <w:rFonts w:ascii="Calibri" w:hAnsi="Calibri"/>
+          <w:b/>
+          <w:color w:val="5D6B64"/>
+          <w:sz w:val="18"/>
+        </w:rPr>
+        <w:t>Monday · 2 · daily challenge</w:t>
+      </w:r>
+    </w:p>
+    <w:p>
+      <w:pPr>
+        <w:spacing w:before="0" w:after="0" w:line="283" w:lineRule="auto"/>
+        <w:shd w:val="clear" w:color="auto" w:fill="F3F7F4"/>
+        <w:pBdr>
+          <w:top w:val="single" w:sz="8" w:space="8" w:color="CFE7DB"/>
+          <w:bottom w:val="single" w:sz="8" w:space="8" w:color="CFE7DB"/>
+          <w:left w:val="single" w:sz="8" w:space="8" w:color="CFE7DB"/>
+          <w:right w:val="single" w:sz="8" w:space="8" w:color="CFE7DB"/>
+        </w:pBdr>
+      </w:pPr>
+      <w:r>
+        <w:rPr>
+          <w:rFonts w:ascii="Consolas" w:hAnsi="Consolas"/>
+          <w:b w:val="0"/>
+          <w:color w:val="16211D"/>
+          <w:sz w:val="19"/>
+        </w:rPr>
+        <w:t>Group G/H openers are the cue: Belgium v Egypt and Spain v Cape Verde. Pick a 2026 squad, draft from memory, reveal after sim. https://www.wcdraft.com/play</w:t>
+      </w:r>
+    </w:p>
+    <w:p>
+      <w:pPr>
+        <w:spacing w:before="40" w:after="200"/>
+      </w:pPr>
+      <w:r>
+        <w:rPr>
+          <w:rFonts w:ascii="Calibri" w:hAnsi="Calibri"/>
+          <w:b/>
+          <w:color w:val="F5B62A"/>
+          <w:sz w:val="17"/>
+        </w:rPr>
+        <w:t>150/280 chars</w:t>
+      </w:r>
+    </w:p>
+    <w:p>
+      <w:pPr>
+        <w:spacing w:before="160" w:after="40"/>
+      </w:pPr>
+      <w:r>
+        <w:rPr>
+          <w:rFonts w:ascii="Calibri" w:hAnsi="Calibri"/>
+          <w:b/>
+          <w:color w:val="5D6B64"/>
+          <w:sz w:val="18"/>
+        </w:rPr>
+        <w:t>Monday · 3 · factoid</w:t>
+      </w:r>
+    </w:p>
+    <w:p>
+      <w:pPr>
+        <w:spacing w:before="0" w:after="0" w:line="283" w:lineRule="auto"/>
+        <w:shd w:val="clear" w:color="auto" w:fill="F3F7F4"/>
+        <w:pBdr>
+          <w:top w:val="single" w:sz="8" w:space="8" w:color="CFE7DB"/>
+          <w:bottom w:val="single" w:sz="8" w:space="8" w:color="CFE7DB"/>
+          <w:left w:val="single" w:sz="8" w:space="8" w:color="CFE7DB"/>
+          <w:right w:val="single" w:sz="8" w:space="8" w:color="CFE7DB"/>
+        </w:pBdr>
+      </w:pPr>
+      <w:r>
+        <w:rPr>
+          <w:rFonts w:ascii="Consolas" w:hAnsi="Consolas"/>
+          <w:b w:val="0"/>
+          <w:color w:val="16211D"/>
+          <w:sz w:val="19"/>
+        </w:rPr>
+        <w:t>Rate players on their whole career, or just that tournament. Rivaldo (BRA), 2002: a midfielder with 7 appearances that World Cup — in the wcdraft pool. https://www.wcdraft.com/play</w:t>
+      </w:r>
+    </w:p>
+    <w:p>
+      <w:pPr>
+        <w:spacing w:before="40" w:after="200"/>
+      </w:pPr>
+      <w:r>
+        <w:rPr>
+          <w:rFonts w:ascii="Calibri" w:hAnsi="Calibri"/>
+          <w:b/>
+          <w:color w:val="F5B62A"/>
+          <w:sz w:val="17"/>
+        </w:rPr>
+        <w:t>175/280 chars</w:t>
+      </w:r>
+    </w:p>
+    <w:p>
+      <w:pPr>
+        <w:spacing w:before="160" w:after="40"/>
+      </w:pPr>
+      <w:r>
+        <w:rPr>
+          <w:rFonts w:ascii="Calibri" w:hAnsi="Calibri"/>
+          <w:b/>
+          <w:color w:val="5D6B64"/>
+          <w:sz w:val="18"/>
+        </w:rPr>
+        <w:t>Monday · 4 · feature pitch</w:t>
+      </w:r>
+    </w:p>
+    <w:p>
+      <w:pPr>
+        <w:spacing w:before="0" w:after="0" w:line="283" w:lineRule="auto"/>
+        <w:shd w:val="clear" w:color="auto" w:fill="F3F7F4"/>
+        <w:pBdr>
+          <w:top w:val="single" w:sz="8" w:space="8" w:color="CFE7DB"/>
+          <w:bottom w:val="single" w:sz="8" w:space="8" w:color="CFE7DB"/>
+          <w:left w:val="single" w:sz="8" w:space="8" w:color="CFE7DB"/>
+          <w:right w:val="single" w:sz="8" w:space="8" w:color="CFE7DB"/>
+        </w:pBdr>
+      </w:pPr>
+      <w:r>
+        <w:rPr>
+          <w:rFonts w:ascii="Consolas" w:hAnsi="Consolas"/>
+          <w:b w:val="0"/>
+          <w:color w:val="16211D"/>
+          <w:sz w:val="19"/>
+        </w:rPr>
+        <w:t>Your XI plays the real 2026 World Cup bracket — 8 matches through the knockouts — in a calibrated match simulation. A perfect run is 8-0. https://www.wcdraft.com/play</w:t>
+      </w:r>
+    </w:p>
+    <w:p>
+      <w:pPr>
+        <w:spacing w:before="40" w:after="200"/>
+      </w:pPr>
+      <w:r>
+        <w:rPr>
+          <w:rFonts w:ascii="Calibri" w:hAnsi="Calibri"/>
+          <w:b/>
+          <w:color w:val="F5B62A"/>
+          <w:sz w:val="17"/>
+        </w:rPr>
+        <w:t>161/280 chars</w:t>
+      </w:r>
+    </w:p>
+    <w:p>
+      <w:pPr>
+        <w:spacing w:before="160" w:after="40"/>
+      </w:pPr>
+      <w:r>
+        <w:rPr>
+          <w:rFonts w:ascii="Calibri" w:hAnsi="Calibri"/>
+          <w:b/>
+          <w:color w:val="5D6B64"/>
+          <w:sz w:val="18"/>
+        </w:rPr>
+        <w:t>Monday · 5 · daily challenge</w:t>
+      </w:r>
+    </w:p>
+    <w:p>
+      <w:pPr>
+        <w:spacing w:before="0" w:after="0" w:line="283" w:lineRule="auto"/>
+        <w:shd w:val="clear" w:color="auto" w:fill="F3F7F4"/>
+        <w:pBdr>
+          <w:top w:val="single" w:sz="8" w:space="8" w:color="CFE7DB"/>
+          <w:bottom w:val="single" w:sz="8" w:space="8" w:color="CFE7DB"/>
+          <w:left w:val="single" w:sz="8" w:space="8" w:color="CFE7DB"/>
+          <w:right w:val="single" w:sz="8" w:space="8" w:color="CFE7DB"/>
+        </w:pBdr>
+      </w:pPr>
+      <w:r>
+        <w:rPr>
+          <w:rFonts w:ascii="Consolas" w:hAnsi="Consolas"/>
+          <w:b w:val="0"/>
+          <w:color w:val="16211D"/>
+          <w:sz w:val="19"/>
+        </w:rPr>
+        <w:t>Argentina 1978 just rolled. One pick — who makes your all-time XI? Two ways to value a player: Career or Current. https://www.wcdraft.com/play</w:t>
+      </w:r>
+    </w:p>
+    <w:p>
+      <w:pPr>
+        <w:spacing w:before="40" w:after="200"/>
+      </w:pPr>
+      <w:r>
+        <w:rPr>
+          <w:rFonts w:ascii="Calibri" w:hAnsi="Calibri"/>
+          <w:b/>
+          <w:color w:val="F5B62A"/>
+          <w:sz w:val="17"/>
+        </w:rPr>
+        <w:t>137/280 chars</w:t>
+      </w:r>
+    </w:p>
+    <w:p>
+      <w:pPr>
+        <w:spacing w:before="160" w:after="40"/>
+      </w:pPr>
+      <w:r>
+        <w:rPr>
+          <w:rFonts w:ascii="Calibri" w:hAnsi="Calibri"/>
+          <w:b/>
+          <w:color w:val="5D6B64"/>
+          <w:sz w:val="18"/>
+        </w:rPr>
+        <w:t>Monday · 6 · factoid</w:t>
+      </w:r>
+    </w:p>
+    <w:p>
+      <w:pPr>
+        <w:spacing w:before="0" w:after="0" w:line="283" w:lineRule="auto"/>
+        <w:shd w:val="clear" w:color="auto" w:fill="F3F7F4"/>
+        <w:pBdr>
+          <w:top w:val="single" w:sz="8" w:space="8" w:color="CFE7DB"/>
+          <w:bottom w:val="single" w:sz="8" w:space="8" w:color="CFE7DB"/>
+          <w:left w:val="single" w:sz="8" w:space="8" w:color="CFE7DB"/>
+          <w:right w:val="single" w:sz="8" w:space="8" w:color="CFE7DB"/>
+        </w:pBdr>
+      </w:pPr>
+      <w:r>
+        <w:rPr>
+          <w:rFonts w:ascii="Consolas" w:hAnsi="Consolas"/>
+          <w:b w:val="0"/>
+          <w:color w:val="16211D"/>
+          <w:sz w:val="19"/>
+        </w:rPr>
+        <w:t>Two ways to draft: by squad, or by position. Raúl (ESP), 1998: a forward with 3 appearances that World Cup — in the wcdraft pool. https://www.wcdraft.com/play</w:t>
+      </w:r>
+    </w:p>
+    <w:p>
+      <w:pPr>
+        <w:spacing w:before="40" w:after="200"/>
+      </w:pPr>
+      <w:r>
+        <w:rPr>
+          <w:rFonts w:ascii="Calibri" w:hAnsi="Calibri"/>
+          <w:b/>
+          <w:color w:val="F5B62A"/>
+          <w:sz w:val="17"/>
+        </w:rPr>
+        <w:t>153/280 chars</w:t>
+      </w:r>
+    </w:p>
+    <w:p>
+      <w:pPr>
+        <w:spacing w:before="220" w:after="100"/>
+        <w:pBdr>
+          <w:left w:val="single" w:sz="18" w:space="6" w:color="F5B62A"/>
+        </w:pBdr>
+      </w:pPr>
+      <w:r>
+        <w:rPr>
+          <w:rFonts w:ascii="Calibri" w:hAnsi="Calibri"/>
+          <w:b/>
+          <w:color w:val="16211D"/>
+          <w:sz w:val="25"/>
+        </w:rPr>
+        <w:t>Tuesday</w:t>
+      </w:r>
+    </w:p>
+    <w:p>
+      <w:pPr>
+        <w:spacing w:before="160" w:after="40"/>
+      </w:pPr>
+      <w:r>
+        <w:rPr>
+          <w:rFonts w:ascii="Calibri" w:hAnsi="Calibri"/>
+          <w:b/>
+          <w:color w:val="5D6B64"/>
+          <w:sz w:val="18"/>
+        </w:rPr>
+        <w:t>Tuesday · 1 · feature pitch</w:t>
+      </w:r>
+    </w:p>
+    <w:p>
+      <w:pPr>
+        <w:spacing w:before="0" w:after="0" w:line="283" w:lineRule="auto"/>
+        <w:shd w:val="clear" w:color="auto" w:fill="F3F7F4"/>
+        <w:pBdr>
+          <w:top w:val="single" w:sz="8" w:space="8" w:color="CFE7DB"/>
+          <w:bottom w:val="single" w:sz="8" w:space="8" w:color="CFE7DB"/>
+          <w:left w:val="single" w:sz="8" w:space="8" w:color="CFE7DB"/>
+          <w:right w:val="single" w:sz="8" w:space="8" w:color="CFE7DB"/>
+        </w:pBdr>
+      </w:pPr>
+      <w:r>
+        <w:rPr>
+          <w:rFonts w:ascii="Consolas" w:hAnsi="Consolas"/>
+          <w:b w:val="0"/>
+          <w:color w:val="16211D"/>
+          <w:sz w:val="19"/>
+        </w:rPr>
         <w:t>Filter the rolled squad by position and search players by name, right inside the draft. https://www.wcdraft.com/play</w:t>
       </w:r>
     </w:p>
@@ -613,7 +924,7 @@
           <w:color w:val="5D6B64"/>
           <w:sz w:val="18"/>
         </w:rPr>
-        <w:t>Monday · 2 · daily challenge</w:t>
+        <w:t>Tuesday · 2 · daily challenge</w:t>
       </w:r>
     </w:p>
     <w:p>
@@ -634,7 +945,7 @@
           <w:color w:val="16211D"/>
           <w:sz w:val="19"/>
         </w:rPr>
-        <w:t>Today's spin: Belgium 2014. Who's your pick? Four era presets: All-time, Post-2000, Post-2010, Modern. https://www.wcdraft.com/play</w:t>
+        <w:t>Group I opens today: France v Senegal, Iraq v Norway. Spin one of those squad-years and see if your XI survives all 8 matches. https://www.wcdraft.com/play</w:t>
       </w:r>
     </w:p>
     <w:p>
@@ -648,7 +959,7 @@
           <w:color w:val="F5B62A"/>
           <w:sz w:val="17"/>
         </w:rPr>
-        <w:t>126/280 chars</w:t>
+        <w:t>150/280 chars</w:t>
       </w:r>
     </w:p>
     <w:p>
@@ -662,7 +973,7 @@
           <w:color w:val="5D6B64"/>
           <w:sz w:val="18"/>
         </w:rPr>
-        <w:t>Monday · 3 · factoid</w:t>
+        <w:t>Tuesday · 3 · factoid</w:t>
       </w:r>
     </w:p>
     <w:p>
@@ -683,7 +994,7 @@
           <w:color w:val="16211D"/>
           <w:sz w:val="19"/>
         </w:rPr>
-        <w:t>No app store, no install — just open it and draft. Ramos (ESP) — a wcdraft all-time legend from the 2018 World Cup squad: a defender you can draft into your all-time XI. https://www.wcdraft.com/play</w:t>
+        <w:t>Draft across 1930–2026, or narrow to one era. Ramos (ESP) — a wcdraft all-time legend from the 2018 World Cup squad: a defender you can draft into your all-time XI. https://www.wcdraft.com/play</w:t>
       </w:r>
     </w:p>
     <w:p>
@@ -697,7 +1008,7 @@
           <w:color w:val="F5B62A"/>
           <w:sz w:val="17"/>
         </w:rPr>
-        <w:t>193/280 chars</w:t>
+        <w:t>188/280 chars</w:t>
       </w:r>
     </w:p>
     <w:p>
@@ -711,7 +1022,7 @@
           <w:color w:val="5D6B64"/>
           <w:sz w:val="18"/>
         </w:rPr>
-        <w:t>Monday · 4 · feature pitch</w:t>
+        <w:t>Tuesday · 4 · feature pitch</w:t>
       </w:r>
     </w:p>
     <w:p>
@@ -732,7 +1043,367 @@
           <w:color w:val="16211D"/>
           <w:sz w:val="19"/>
         </w:rPr>
-        <w:t>Seventeen spins, one pick on each: sixteen players for your XI and bench, plus one manager. https://www.wcdraft.com/play</w:t>
+        <w:t>wcdraft is free and runs entirely in your browser — no app, no download, no account needed to play. Four era presets: All-time, Post-2000, Post-2010, Modern. https://www.wcdraft.com/play</w:t>
+      </w:r>
+    </w:p>
+    <w:p>
+      <w:pPr>
+        <w:spacing w:before="40" w:after="200"/>
+      </w:pPr>
+      <w:r>
+        <w:rPr>
+          <w:rFonts w:ascii="Calibri" w:hAnsi="Calibri"/>
+          <w:b/>
+          <w:color w:val="F5B62A"/>
+          <w:sz w:val="17"/>
+        </w:rPr>
+        <w:t>181/280 chars</w:t>
+      </w:r>
+    </w:p>
+    <w:p>
+      <w:pPr>
+        <w:spacing w:before="160" w:after="40"/>
+      </w:pPr>
+      <w:r>
+        <w:rPr>
+          <w:rFonts w:ascii="Calibri" w:hAnsi="Calibri"/>
+          <w:b/>
+          <w:color w:val="5D6B64"/>
+          <w:sz w:val="18"/>
+        </w:rPr>
+        <w:t>Tuesday · 5 · daily challenge</w:t>
+      </w:r>
+    </w:p>
+    <w:p>
+      <w:pPr>
+        <w:spacing w:before="0" w:after="0" w:line="283" w:lineRule="auto"/>
+        <w:shd w:val="clear" w:color="auto" w:fill="F3F7F4"/>
+        <w:pBdr>
+          <w:top w:val="single" w:sz="8" w:space="8" w:color="CFE7DB"/>
+          <w:bottom w:val="single" w:sz="8" w:space="8" w:color="CFE7DB"/>
+          <w:left w:val="single" w:sz="8" w:space="8" w:color="CFE7DB"/>
+          <w:right w:val="single" w:sz="8" w:space="8" w:color="CFE7DB"/>
+        </w:pBdr>
+      </w:pPr>
+      <w:r>
+        <w:rPr>
+          <w:rFonts w:ascii="Consolas" w:hAnsi="Consolas"/>
+          <w:b w:val="0"/>
+          <w:color w:val="16211D"/>
+          <w:sz w:val="19"/>
+        </w:rPr>
+        <w:t>Run the real 2026 bracket — 8 matches, a perfect run is 8-0. Today's seed: Mexico 1994 — spin it and pick. https://www.wcdraft.com/play</w:t>
+      </w:r>
+    </w:p>
+    <w:p>
+      <w:pPr>
+        <w:spacing w:before="40" w:after="200"/>
+      </w:pPr>
+      <w:r>
+        <w:rPr>
+          <w:rFonts w:ascii="Calibri" w:hAnsi="Calibri"/>
+          <w:b/>
+          <w:color w:val="F5B62A"/>
+          <w:sz w:val="17"/>
+        </w:rPr>
+        <w:t>130/280 chars</w:t>
+      </w:r>
+    </w:p>
+    <w:p>
+      <w:pPr>
+        <w:spacing w:before="160" w:after="40"/>
+      </w:pPr>
+      <w:r>
+        <w:rPr>
+          <w:rFonts w:ascii="Calibri" w:hAnsi="Calibri"/>
+          <w:b/>
+          <w:color w:val="5D6B64"/>
+          <w:sz w:val="18"/>
+        </w:rPr>
+        <w:t>Tuesday · 6 · factoid</w:t>
+      </w:r>
+    </w:p>
+    <w:p>
+      <w:pPr>
+        <w:spacing w:before="0" w:after="0" w:line="283" w:lineRule="auto"/>
+        <w:shd w:val="clear" w:color="auto" w:fill="F3F7F4"/>
+        <w:pBdr>
+          <w:top w:val="single" w:sz="8" w:space="8" w:color="CFE7DB"/>
+          <w:bottom w:val="single" w:sz="8" w:space="8" w:color="CFE7DB"/>
+          <w:left w:val="single" w:sz="8" w:space="8" w:color="CFE7DB"/>
+          <w:right w:val="single" w:sz="8" w:space="8" w:color="CFE7DB"/>
+        </w:pBdr>
+      </w:pPr>
+      <w:r>
+        <w:rPr>
+          <w:rFonts w:ascii="Consolas" w:hAnsi="Consolas"/>
+          <w:b w:val="0"/>
+          <w:color w:val="16211D"/>
+          <w:sz w:val="19"/>
+        </w:rPr>
+        <w:t>All-time or Modern — you choose the era you draft from. Yamal (ESP): the 2026 World Cup forward, draftable in wcdraft. https://www.wcdraft.com/play</w:t>
+      </w:r>
+    </w:p>
+    <w:p>
+      <w:pPr>
+        <w:spacing w:before="40" w:after="200"/>
+      </w:pPr>
+      <w:r>
+        <w:rPr>
+          <w:rFonts w:ascii="Calibri" w:hAnsi="Calibri"/>
+          <w:b/>
+          <w:color w:val="F5B62A"/>
+          <w:sz w:val="17"/>
+        </w:rPr>
+        <w:t>142/280 chars</w:t>
+      </w:r>
+    </w:p>
+    <w:p>
+      <w:pPr>
+        <w:spacing w:before="220" w:after="100"/>
+        <w:pBdr>
+          <w:left w:val="single" w:sz="18" w:space="6" w:color="F5B62A"/>
+        </w:pBdr>
+      </w:pPr>
+      <w:r>
+        <w:rPr>
+          <w:rFonts w:ascii="Calibri" w:hAnsi="Calibri"/>
+          <w:b/>
+          <w:color w:val="16211D"/>
+          <w:sz w:val="25"/>
+        </w:rPr>
+        <w:t>Wednesday</w:t>
+      </w:r>
+    </w:p>
+    <w:p>
+      <w:pPr>
+        <w:spacing w:before="160" w:after="40"/>
+      </w:pPr>
+      <w:r>
+        <w:rPr>
+          <w:rFonts w:ascii="Calibri" w:hAnsi="Calibri"/>
+          <w:b/>
+          <w:color w:val="5D6B64"/>
+          <w:sz w:val="18"/>
+        </w:rPr>
+        <w:t>Wednesday · 1 · feature pitch</w:t>
+      </w:r>
+    </w:p>
+    <w:p>
+      <w:pPr>
+        <w:spacing w:before="0" w:after="0" w:line="283" w:lineRule="auto"/>
+        <w:shd w:val="clear" w:color="auto" w:fill="F3F7F4"/>
+        <w:pBdr>
+          <w:top w:val="single" w:sz="8" w:space="8" w:color="CFE7DB"/>
+          <w:bottom w:val="single" w:sz="8" w:space="8" w:color="CFE7DB"/>
+          <w:left w:val="single" w:sz="8" w:space="8" w:color="CFE7DB"/>
+          <w:right w:val="single" w:sz="8" w:space="8" w:color="CFE7DB"/>
+        </w:pBdr>
+      </w:pPr>
+      <w:r>
+        <w:rPr>
+          <w:rFonts w:ascii="Consolas" w:hAnsi="Consolas"/>
+          <w:b w:val="0"/>
+          <w:color w:val="16211D"/>
+          <w:sz w:val="19"/>
+        </w:rPr>
+        <w:t>Filter the rolled squad by position and search players by name, right inside the draft. Managers are a pick here — one of your 17 spins. https://www.wcdraft.com/play</w:t>
+      </w:r>
+    </w:p>
+    <w:p>
+      <w:pPr>
+        <w:spacing w:before="40" w:after="200"/>
+      </w:pPr>
+      <w:r>
+        <w:rPr>
+          <w:rFonts w:ascii="Calibri" w:hAnsi="Calibri"/>
+          <w:b/>
+          <w:color w:val="F5B62A"/>
+          <w:sz w:val="17"/>
+        </w:rPr>
+        <w:t>160/280 chars</w:t>
+      </w:r>
+    </w:p>
+    <w:p>
+      <w:pPr>
+        <w:spacing w:before="160" w:after="40"/>
+      </w:pPr>
+      <w:r>
+        <w:rPr>
+          <w:rFonts w:ascii="Calibri" w:hAnsi="Calibri"/>
+          <w:b/>
+          <w:color w:val="5D6B64"/>
+          <w:sz w:val="18"/>
+        </w:rPr>
+        <w:t>Wednesday · 2 · daily challenge</w:t>
+      </w:r>
+    </w:p>
+    <w:p>
+      <w:pPr>
+        <w:spacing w:before="0" w:after="0" w:line="283" w:lineRule="auto"/>
+        <w:shd w:val="clear" w:color="auto" w:fill="F3F7F4"/>
+        <w:pBdr>
+          <w:top w:val="single" w:sz="8" w:space="8" w:color="CFE7DB"/>
+          <w:bottom w:val="single" w:sz="8" w:space="8" w:color="CFE7DB"/>
+          <w:left w:val="single" w:sz="8" w:space="8" w:color="CFE7DB"/>
+          <w:right w:val="single" w:sz="8" w:space="8" w:color="CFE7DB"/>
+        </w:pBdr>
+      </w:pPr>
+      <w:r>
+        <w:rPr>
+          <w:rFonts w:ascii="Consolas" w:hAnsi="Consolas"/>
+          <w:b w:val="0"/>
+          <w:color w:val="16211D"/>
+          <w:sz w:val="19"/>
+        </w:rPr>
+        <w:t>Group K opens today: Portugal, DR Congo, Uzbekistan, Colombia. Pick a side, then build the XI across eras. https://www.wcdraft.com/play</w:t>
+      </w:r>
+    </w:p>
+    <w:p>
+      <w:pPr>
+        <w:spacing w:before="40" w:after="200"/>
+      </w:pPr>
+      <w:r>
+        <w:rPr>
+          <w:rFonts w:ascii="Calibri" w:hAnsi="Calibri"/>
+          <w:b/>
+          <w:color w:val="F5B62A"/>
+          <w:sz w:val="17"/>
+        </w:rPr>
+        <w:t>130/280 chars</w:t>
+      </w:r>
+    </w:p>
+    <w:p>
+      <w:pPr>
+        <w:spacing w:before="160" w:after="40"/>
+      </w:pPr>
+      <w:r>
+        <w:rPr>
+          <w:rFonts w:ascii="Calibri" w:hAnsi="Calibri"/>
+          <w:b/>
+          <w:color w:val="5D6B64"/>
+          <w:sz w:val="18"/>
+        </w:rPr>
+        <w:t>Wednesday · 3 · factoid</w:t>
+      </w:r>
+    </w:p>
+    <w:p>
+      <w:pPr>
+        <w:spacing w:before="0" w:after="0" w:line="283" w:lineRule="auto"/>
+        <w:shd w:val="clear" w:color="auto" w:fill="F3F7F4"/>
+        <w:pBdr>
+          <w:top w:val="single" w:sz="8" w:space="8" w:color="CFE7DB"/>
+          <w:bottom w:val="single" w:sz="8" w:space="8" w:color="CFE7DB"/>
+          <w:left w:val="single" w:sz="8" w:space="8" w:color="CFE7DB"/>
+          <w:right w:val="single" w:sz="8" w:space="8" w:color="CFE7DB"/>
+        </w:pBdr>
+      </w:pPr>
+      <w:r>
+        <w:rPr>
+          <w:rFonts w:ascii="Consolas" w:hAnsi="Consolas"/>
+          <w:b w:val="0"/>
+          <w:color w:val="16211D"/>
+          <w:sz w:val="19"/>
+        </w:rPr>
+        <w:t>Position First: lock the slot, then spin for who fills it. Santos (BRA) — a wcdraft all-time legend from the 1962 World Cup squad: a defender you can draft into your all-time XI. https://www.wcdraft.com/play</w:t>
+      </w:r>
+    </w:p>
+    <w:p>
+      <w:pPr>
+        <w:spacing w:before="40" w:after="200"/>
+      </w:pPr>
+      <w:r>
+        <w:rPr>
+          <w:rFonts w:ascii="Calibri" w:hAnsi="Calibri"/>
+          <w:b/>
+          <w:color w:val="F5B62A"/>
+          <w:sz w:val="17"/>
+        </w:rPr>
+        <w:t>202/280 chars</w:t>
+      </w:r>
+    </w:p>
+    <w:p>
+      <w:pPr>
+        <w:spacing w:before="160" w:after="40"/>
+      </w:pPr>
+      <w:r>
+        <w:rPr>
+          <w:rFonts w:ascii="Calibri" w:hAnsi="Calibri"/>
+          <w:b/>
+          <w:color w:val="5D6B64"/>
+          <w:sz w:val="18"/>
+        </w:rPr>
+        <w:t>Wednesday · 4 · feature pitch</w:t>
+      </w:r>
+    </w:p>
+    <w:p>
+      <w:pPr>
+        <w:spacing w:before="0" w:after="0" w:line="283" w:lineRule="auto"/>
+        <w:shd w:val="clear" w:color="auto" w:fill="F3F7F4"/>
+        <w:pBdr>
+          <w:top w:val="single" w:sz="8" w:space="8" w:color="CFE7DB"/>
+          <w:bottom w:val="single" w:sz="8" w:space="8" w:color="CFE7DB"/>
+          <w:left w:val="single" w:sz="8" w:space="8" w:color="CFE7DB"/>
+          <w:right w:val="single" w:sz="8" w:space="8" w:color="CFE7DB"/>
+        </w:pBdr>
+      </w:pPr>
+      <w:r>
+        <w:rPr>
+          <w:rFonts w:ascii="Consolas" w:hAnsi="Consolas"/>
+          <w:b w:val="0"/>
+          <w:color w:val="16211D"/>
+          <w:sz w:val="19"/>
+        </w:rPr>
+        <w:t>Choose your era: All-time, Post-2000, Post-2010, or Modern — drafting across more than ninety years of World Cup squads (1930–2026). Free, in your browser. No download. https://www.wcdraft.com/play</w:t>
+      </w:r>
+    </w:p>
+    <w:p>
+      <w:pPr>
+        <w:spacing w:before="40" w:after="200"/>
+      </w:pPr>
+      <w:r>
+        <w:rPr>
+          <w:rFonts w:ascii="Calibri" w:hAnsi="Calibri"/>
+          <w:b/>
+          <w:color w:val="F5B62A"/>
+          <w:sz w:val="17"/>
+        </w:rPr>
+        <w:t>192/280 chars</w:t>
+      </w:r>
+    </w:p>
+    <w:p>
+      <w:pPr>
+        <w:spacing w:before="160" w:after="40"/>
+      </w:pPr>
+      <w:r>
+        <w:rPr>
+          <w:rFonts w:ascii="Calibri" w:hAnsi="Calibri"/>
+          <w:b/>
+          <w:color w:val="5D6B64"/>
+          <w:sz w:val="18"/>
+        </w:rPr>
+        <w:t>Wednesday · 5 · daily challenge</w:t>
+      </w:r>
+    </w:p>
+    <w:p>
+      <w:pPr>
+        <w:spacing w:before="0" w:after="0" w:line="283" w:lineRule="auto"/>
+        <w:shd w:val="clear" w:color="auto" w:fill="F3F7F4"/>
+        <w:pBdr>
+          <w:top w:val="single" w:sz="8" w:space="8" w:color="CFE7DB"/>
+          <w:bottom w:val="single" w:sz="8" w:space="8" w:color="CFE7DB"/>
+          <w:left w:val="single" w:sz="8" w:space="8" w:color="CFE7DB"/>
+          <w:right w:val="single" w:sz="8" w:space="8" w:color="CFE7DB"/>
+        </w:pBdr>
+      </w:pPr>
+      <w:r>
+        <w:rPr>
+          <w:rFonts w:ascii="Consolas" w:hAnsi="Consolas"/>
+          <w:b w:val="0"/>
+          <w:color w:val="16211D"/>
+          <w:sz w:val="19"/>
+        </w:rPr>
+        <w:t>Today's spin: Austria 1954. Who's your pick? Two ways to value a player: Career or Current. https://www.wcdraft.com/play</w:t>
       </w:r>
     </w:p>
     <w:p>
@@ -760,7 +1431,7 @@
           <w:color w:val="5D6B64"/>
           <w:sz w:val="18"/>
         </w:rPr>
-        <w:t>Monday · 5 · daily challenge</w:t>
+        <w:t>Wednesday · 6 · factoid</w:t>
       </w:r>
     </w:p>
     <w:p>
@@ -781,7 +1452,7 @@
           <w:color w:val="16211D"/>
           <w:sz w:val="19"/>
         </w:rPr>
-        <w:t>Today's spin: Ivory Coast 2006. Who's your pick? Free, in your browser. No download. https://www.wcdraft.com/play</w:t>
+        <w:t>Charlton (ENG) — a wcdraft all-time legend from the 1962 World Cup squad, 1 goal that tournament. Nation Synergy rewards a connected XI. https://www.wcdraft.com/play</w:t>
       </w:r>
     </w:p>
     <w:p>
@@ -795,7 +1466,24 @@
           <w:color w:val="F5B62A"/>
           <w:sz w:val="17"/>
         </w:rPr>
-        <w:t>108/280 chars</w:t>
+        <w:t>160/280 chars</w:t>
+      </w:r>
+    </w:p>
+    <w:p>
+      <w:pPr>
+        <w:spacing w:before="220" w:after="100"/>
+        <w:pBdr>
+          <w:left w:val="single" w:sz="18" w:space="6" w:color="F5B62A"/>
+        </w:pBdr>
+      </w:pPr>
+      <w:r>
+        <w:rPr>
+          <w:rFonts w:ascii="Calibri" w:hAnsi="Calibri"/>
+          <w:b/>
+          <w:color w:val="16211D"/>
+          <w:sz w:val="25"/>
+        </w:rPr>
+        <w:t>Thursday</w:t>
       </w:r>
     </w:p>
     <w:p>
@@ -809,7 +1497,7 @@
           <w:color w:val="5D6B64"/>
           <w:sz w:val="18"/>
         </w:rPr>
-        <w:t>Monday · 6 · factoid</w:t>
+        <w:t>Thursday · 1 · feature pitch</w:t>
       </w:r>
     </w:p>
     <w:p>
@@ -830,7 +1518,7 @@
           <w:color w:val="16211D"/>
           <w:sz w:val="19"/>
         </w:rPr>
-        <w:t>Memory mode hides the numbers until you simulate. Figueroa (CHL) — a wcdraft all-time legend from the 1966 World Cup squad: a defender you can draft into your all-time XI. https://www.wcdraft.com/play</w:t>
+        <w:t>The manager is one of your spins — a real pick that shapes the squad, not a footnote. https://www.wcdraft.com/play</w:t>
       </w:r>
     </w:p>
     <w:p>
@@ -844,24 +1532,7 @@
           <w:color w:val="F5B62A"/>
           <w:sz w:val="17"/>
         </w:rPr>
-        <w:t>195/280 chars</w:t>
-      </w:r>
-    </w:p>
-    <w:p>
-      <w:pPr>
-        <w:spacing w:before="220" w:after="100"/>
-        <w:pBdr>
-          <w:left w:val="single" w:sz="18" w:space="6" w:color="F5B62A"/>
-        </w:pBdr>
-      </w:pPr>
-      <w:r>
-        <w:rPr>
-          <w:rFonts w:ascii="Calibri" w:hAnsi="Calibri"/>
-          <w:b/>
-          <w:color w:val="16211D"/>
-          <w:sz w:val="25"/>
-        </w:rPr>
-        <w:t>Tuesday</w:t>
+        <w:t>109/280 chars</w:t>
       </w:r>
     </w:p>
     <w:p>
@@ -875,7 +1546,105 @@
           <w:color w:val="5D6B64"/>
           <w:sz w:val="18"/>
         </w:rPr>
-        <w:t>Tuesday · 1 · feature pitch</w:t>
+        <w:t>Thursday · 2 · daily challenge</w:t>
+      </w:r>
+    </w:p>
+    <w:p>
+      <w:pPr>
+        <w:spacing w:before="0" w:after="0" w:line="283" w:lineRule="auto"/>
+        <w:shd w:val="clear" w:color="auto" w:fill="F3F7F4"/>
+        <w:pBdr>
+          <w:top w:val="single" w:sz="8" w:space="8" w:color="CFE7DB"/>
+          <w:bottom w:val="single" w:sz="8" w:space="8" w:color="CFE7DB"/>
+          <w:left w:val="single" w:sz="8" w:space="8" w:color="CFE7DB"/>
+          <w:right w:val="single" w:sz="8" w:space="8" w:color="CFE7DB"/>
+        </w:pBdr>
+      </w:pPr>
+      <w:r>
+        <w:rPr>
+          <w:rFonts w:ascii="Consolas" w:hAnsi="Consolas"/>
+          <w:b w:val="0"/>
+          <w:color w:val="16211D"/>
+          <w:sz w:val="19"/>
+        </w:rPr>
+        <w:t>Matchday 2 starts: Mexico v South Korea, Canada v Qatar, Czechia v South Africa, Switzerland v Bosnia. Draft the side you're backing. https://www.wcdraft.com/play</w:t>
+      </w:r>
+    </w:p>
+    <w:p>
+      <w:pPr>
+        <w:spacing w:before="40" w:after="200"/>
+      </w:pPr>
+      <w:r>
+        <w:rPr>
+          <w:rFonts w:ascii="Calibri" w:hAnsi="Calibri"/>
+          <w:b/>
+          <w:color w:val="F5B62A"/>
+          <w:sz w:val="17"/>
+        </w:rPr>
+        <w:t>157/280 chars</w:t>
+      </w:r>
+    </w:p>
+    <w:p>
+      <w:pPr>
+        <w:spacing w:before="160" w:after="40"/>
+      </w:pPr>
+      <w:r>
+        <w:rPr>
+          <w:rFonts w:ascii="Calibri" w:hAnsi="Calibri"/>
+          <w:b/>
+          <w:color w:val="5D6B64"/>
+          <w:sz w:val="18"/>
+        </w:rPr>
+        <w:t>Thursday · 3 · factoid</w:t>
+      </w:r>
+    </w:p>
+    <w:p>
+      <w:pPr>
+        <w:spacing w:before="0" w:after="0" w:line="283" w:lineRule="auto"/>
+        <w:shd w:val="clear" w:color="auto" w:fill="F3F7F4"/>
+        <w:pBdr>
+          <w:top w:val="single" w:sz="8" w:space="8" w:color="CFE7DB"/>
+          <w:bottom w:val="single" w:sz="8" w:space="8" w:color="CFE7DB"/>
+          <w:left w:val="single" w:sz="8" w:space="8" w:color="CFE7DB"/>
+          <w:right w:val="single" w:sz="8" w:space="8" w:color="CFE7DB"/>
+        </w:pBdr>
+      </w:pPr>
+      <w:r>
+        <w:rPr>
+          <w:rFonts w:ascii="Consolas" w:hAnsi="Consolas"/>
+          <w:b w:val="0"/>
+          <w:color w:val="16211D"/>
+          <w:sz w:val="19"/>
+        </w:rPr>
+        <w:t>Casillas (ESP), 2006: a goalkeeper with 3 appearances that World Cup — in the wcdraft pool. No app store, no install — just open it and draft. https://www.wcdraft.com/play</w:t>
+      </w:r>
+    </w:p>
+    <w:p>
+      <w:pPr>
+        <w:spacing w:before="40" w:after="200"/>
+      </w:pPr>
+      <w:r>
+        <w:rPr>
+          <w:rFonts w:ascii="Calibri" w:hAnsi="Calibri"/>
+          <w:b/>
+          <w:color w:val="F5B62A"/>
+          <w:sz w:val="17"/>
+        </w:rPr>
+        <w:t>166/280 chars</w:t>
+      </w:r>
+    </w:p>
+    <w:p>
+      <w:pPr>
+        <w:spacing w:before="160" w:after="40"/>
+      </w:pPr>
+      <w:r>
+        <w:rPr>
+          <w:rFonts w:ascii="Calibri" w:hAnsi="Calibri"/>
+          <w:b/>
+          <w:color w:val="5D6B64"/>
+          <w:sz w:val="18"/>
+        </w:rPr>
+        <w:t>Thursday · 4 · feature pitch</w:t>
       </w:r>
     </w:p>
     <w:p>
@@ -924,7 +1693,7 @@
           <w:color w:val="5D6B64"/>
           <w:sz w:val="18"/>
         </w:rPr>
-        <w:t>Tuesday · 2 · daily challenge</w:t>
+        <w:t>Thursday · 5 · daily challenge</w:t>
       </w:r>
     </w:p>
     <w:p>
@@ -945,7 +1714,7 @@
           <w:color w:val="16211D"/>
           <w:sz w:val="19"/>
         </w:rPr>
-        <w:t>You draft a manager too. Most games don't let you. Today's seed: Brazil 2026 — spin it and pick. https://www.wcdraft.com/play</w:t>
+        <w:t>England 2014 just rolled. One pick — who makes your all-time XI? Same seed, same outcome: your run link is fully reproducible. https://www.wcdraft.com/play</w:t>
       </w:r>
     </w:p>
     <w:p>
@@ -959,7 +1728,7 @@
           <w:color w:val="F5B62A"/>
           <w:sz w:val="17"/>
         </w:rPr>
-        <w:t>120/280 chars</w:t>
+        <w:t>150/280 chars</w:t>
       </w:r>
     </w:p>
     <w:p>
@@ -973,7 +1742,7 @@
           <w:color w:val="5D6B64"/>
           <w:sz w:val="18"/>
         </w:rPr>
-        <w:t>Tuesday · 3 · factoid</w:t>
+        <w:t>Thursday · 6 · factoid</w:t>
       </w:r>
     </w:p>
     <w:p>
@@ -994,7 +1763,7 @@
           <w:color w:val="16211D"/>
           <w:sz w:val="19"/>
         </w:rPr>
-        <w:t>Classic, or Memory — ratings hidden until the reveal. Ronaldo (BRA): the 1994 World Cup forward, draftable in wcdraft. https://www.wcdraft.com/play</w:t>
+        <w:t>Two ways to draft: by squad, or by position. Eto'o (CMR) — a wcdraft all-time legend from the 2014 World Cup squad: a forward you can draft into your all-time XI. https://www.wcdraft.com/play</w:t>
       </w:r>
     </w:p>
     <w:p>
@@ -1008,7 +1777,24 @@
           <w:color w:val="F5B62A"/>
           <w:sz w:val="17"/>
         </w:rPr>
-        <w:t>142/280 chars</w:t>
+        <w:t>186/280 chars</w:t>
+      </w:r>
+    </w:p>
+    <w:p>
+      <w:pPr>
+        <w:spacing w:before="220" w:after="100"/>
+        <w:pBdr>
+          <w:left w:val="single" w:sz="18" w:space="6" w:color="F5B62A"/>
+        </w:pBdr>
+      </w:pPr>
+      <w:r>
+        <w:rPr>
+          <w:rFonts w:ascii="Calibri" w:hAnsi="Calibri"/>
+          <w:b/>
+          <w:color w:val="16211D"/>
+          <w:sz w:val="25"/>
+        </w:rPr>
+        <w:t>Friday</w:t>
       </w:r>
     </w:p>
     <w:p>
@@ -1022,7 +1808,7 @@
           <w:color w:val="5D6B64"/>
           <w:sz w:val="18"/>
         </w:rPr>
-        <w:t>Tuesday · 4 · feature pitch</w:t>
+        <w:t>Friday · 1 · feature pitch</w:t>
       </w:r>
     </w:p>
     <w:p>
@@ -1043,7 +1829,7 @@
           <w:color w:val="16211D"/>
           <w:sz w:val="19"/>
         </w:rPr>
-        <w:t>Your XI plays the real 2026 World Cup bracket — 8 matches through the knockouts — in a calibrated match simulation. A perfect run is 8-0. Career peak or current form — you pick the rating basis. https://www.wcdraft.com/play</w:t>
+        <w:t>Pick your draft order: Squad First, or Position First — commit a slot to fill before the squad is even revealed. Four era presets: All-time, Post-2000, Post-2010, Modern. https://www.wcdraft.com/play</w:t>
       </w:r>
     </w:p>
     <w:p>
@@ -1057,7 +1843,7 @@
           <w:color w:val="F5B62A"/>
           <w:sz w:val="17"/>
         </w:rPr>
-        <w:t>218/280 chars</w:t>
+        <w:t>194/280 chars</w:t>
       </w:r>
     </w:p>
     <w:p>
@@ -1071,7 +1857,7 @@
           <w:color w:val="5D6B64"/>
           <w:sz w:val="18"/>
         </w:rPr>
-        <w:t>Tuesday · 5 · daily challenge</w:t>
+        <w:t>Friday · 2 · daily challenge</w:t>
       </w:r>
     </w:p>
     <w:p>
@@ -1092,7 +1878,7 @@
           <w:color w:val="16211D"/>
           <w:sz w:val="19"/>
         </w:rPr>
-        <w:t>There's a season-keyed leaderboard — post your run. Today's seed: Argentina 1982 — spin it and pick. https://www.wcdraft.com/play</w:t>
+        <w:t>Friday slate: Scotland v Morocco, Brazil v Haiti. Build an all-time XI from one of those nations before kickoff, then let the bracket argue back. https://www.wcdraft.com/play</w:t>
       </w:r>
     </w:p>
     <w:p>
@@ -1106,7 +1892,7 @@
           <w:color w:val="F5B62A"/>
           <w:sz w:val="17"/>
         </w:rPr>
-        <w:t>124/280 chars</w:t>
+        <w:t>169/280 chars</w:t>
       </w:r>
     </w:p>
     <w:p>
@@ -1120,7 +1906,7 @@
           <w:color w:val="5D6B64"/>
           <w:sz w:val="18"/>
         </w:rPr>
-        <w:t>Tuesday · 6 · factoid</w:t>
+        <w:t>Friday · 3 · factoid</w:t>
       </w:r>
     </w:p>
     <w:p>
@@ -1141,7 +1927,7 @@
           <w:color w:val="16211D"/>
           <w:sz w:val="19"/>
         </w:rPr>
-        <w:t>Neuer (DEU) — a wcdraft all-time legend from the 2010 World Cup squad: a goalkeeper you can draft into your all-time XI. Free, in your browser. No download. https://www.wcdraft.com/play</w:t>
+        <w:t>Robben (NLD) — a wcdraft all-time legend from the 2006 World Cup squad, 1 goal that tournament. Draft across 1930–2026, or narrow to one era. https://www.wcdraft.com/play</w:t>
       </w:r>
     </w:p>
     <w:p>
@@ -1155,24 +1941,7 @@
           <w:color w:val="F5B62A"/>
           <w:sz w:val="17"/>
         </w:rPr>
-        <w:t>180/280 chars</w:t>
-      </w:r>
-    </w:p>
-    <w:p>
-      <w:pPr>
-        <w:spacing w:before="220" w:after="100"/>
-        <w:pBdr>
-          <w:left w:val="single" w:sz="18" w:space="6" w:color="F5B62A"/>
-        </w:pBdr>
-      </w:pPr>
-      <w:r>
-        <w:rPr>
-          <w:rFonts w:ascii="Calibri" w:hAnsi="Calibri"/>
-          <w:b/>
-          <w:color w:val="16211D"/>
-          <w:sz w:val="25"/>
-        </w:rPr>
-        <w:t>Wednesday</w:t>
+        <w:t>165/280 chars</w:t>
       </w:r>
     </w:p>
     <w:p>
@@ -1186,7 +1955,7 @@
           <w:color w:val="5D6B64"/>
           <w:sz w:val="18"/>
         </w:rPr>
-        <w:t>Wednesday · 1 · feature pitch</w:t>
+        <w:t>Friday · 4 · feature pitch</w:t>
       </w:r>
     </w:p>
     <w:p>
@@ -1207,7 +1976,7 @@
           <w:color w:val="16211D"/>
           <w:sz w:val="19"/>
         </w:rPr>
-        <w:t>Seventeen spins, one pick on each: sixteen players for your XI and bench, plus one manager. Every run has a shareable, replayable link. https://www.wcdraft.com/play</w:t>
+        <w:t>Choose your era: All-time, Post-2000, Post-2010, or Modern — drafting across more than ninety years of World Cup squads (1930–2026). https://www.wcdraft.com/play</w:t>
       </w:r>
     </w:p>
     <w:p>
@@ -1221,7 +1990,7 @@
           <w:color w:val="F5B62A"/>
           <w:sz w:val="17"/>
         </w:rPr>
-        <w:t>159/280 chars</w:t>
+        <w:t>156/280 chars</w:t>
       </w:r>
     </w:p>
     <w:p>
@@ -1235,7 +2004,7 @@
           <w:color w:val="5D6B64"/>
           <w:sz w:val="18"/>
         </w:rPr>
-        <w:t>Wednesday · 2 · daily challenge</w:t>
+        <w:t>Friday · 5 · daily challenge</w:t>
       </w:r>
     </w:p>
     <w:p>
@@ -1256,7 +2025,318 @@
           <w:color w:val="16211D"/>
           <w:sz w:val="19"/>
         </w:rPr>
-        <w:t>Today's spin: West Germany 1982. Who's your pick? Career peak or current form — you pick the rating basis. https://www.wcdraft.com/play</w:t>
+        <w:t>Seventeen spins. One pick each. Build the whole XI. Today's seed: Brazil 1994 — spin it and pick. https://www.wcdraft.com/play</w:t>
+      </w:r>
+    </w:p>
+    <w:p>
+      <w:pPr>
+        <w:spacing w:before="40" w:after="200"/>
+      </w:pPr>
+      <w:r>
+        <w:rPr>
+          <w:rFonts w:ascii="Calibri" w:hAnsi="Calibri"/>
+          <w:b/>
+          <w:color w:val="F5B62A"/>
+          <w:sz w:val="17"/>
+        </w:rPr>
+        <w:t>121/280 chars</w:t>
+      </w:r>
+    </w:p>
+    <w:p>
+      <w:pPr>
+        <w:spacing w:before="160" w:after="40"/>
+      </w:pPr>
+      <w:r>
+        <w:rPr>
+          <w:rFonts w:ascii="Calibri" w:hAnsi="Calibri"/>
+          <w:b/>
+          <w:color w:val="5D6B64"/>
+          <w:sz w:val="18"/>
+        </w:rPr>
+        <w:t>Friday · 6 · factoid</w:t>
+      </w:r>
+    </w:p>
+    <w:p>
+      <w:pPr>
+        <w:spacing w:before="0" w:after="0" w:line="283" w:lineRule="auto"/>
+        <w:shd w:val="clear" w:color="auto" w:fill="F3F7F4"/>
+        <w:pBdr>
+          <w:top w:val="single" w:sz="8" w:space="8" w:color="CFE7DB"/>
+          <w:bottom w:val="single" w:sz="8" w:space="8" w:color="CFE7DB"/>
+          <w:left w:val="single" w:sz="8" w:space="8" w:color="CFE7DB"/>
+          <w:right w:val="single" w:sz="8" w:space="8" w:color="CFE7DB"/>
+        </w:pBdr>
+      </w:pPr>
+      <w:r>
+        <w:rPr>
+          <w:rFonts w:ascii="Consolas" w:hAnsi="Consolas"/>
+          <w:b w:val="0"/>
+          <w:color w:val="16211D"/>
+          <w:sz w:val="19"/>
+        </w:rPr>
+        <w:t>There's a season-keyed leaderboard — post your run. Fontaine (FRA), 1958: a forward with 6 appearances that World Cup — in the wcdraft pool. https://www.wcdraft.com/play</w:t>
+      </w:r>
+    </w:p>
+    <w:p>
+      <w:pPr>
+        <w:spacing w:before="40" w:after="200"/>
+      </w:pPr>
+      <w:r>
+        <w:rPr>
+          <w:rFonts w:ascii="Calibri" w:hAnsi="Calibri"/>
+          <w:b/>
+          <w:color w:val="F5B62A"/>
+          <w:sz w:val="17"/>
+        </w:rPr>
+        <w:t>164/280 chars</w:t>
+      </w:r>
+    </w:p>
+    <w:p>
+      <w:pPr>
+        <w:spacing w:before="220" w:after="100"/>
+        <w:pBdr>
+          <w:left w:val="single" w:sz="18" w:space="6" w:color="F5B62A"/>
+        </w:pBdr>
+      </w:pPr>
+      <w:r>
+        <w:rPr>
+          <w:rFonts w:ascii="Calibri" w:hAnsi="Calibri"/>
+          <w:b/>
+          <w:color w:val="16211D"/>
+          <w:sz w:val="25"/>
+        </w:rPr>
+        <w:t>Saturday</w:t>
+      </w:r>
+    </w:p>
+    <w:p>
+      <w:pPr>
+        <w:spacing w:before="160" w:after="40"/>
+      </w:pPr>
+      <w:r>
+        <w:rPr>
+          <w:rFonts w:ascii="Calibri" w:hAnsi="Calibri"/>
+          <w:b/>
+          <w:color w:val="5D6B64"/>
+          <w:sz w:val="18"/>
+        </w:rPr>
+        <w:t>Saturday · 1 · feature pitch</w:t>
+      </w:r>
+    </w:p>
+    <w:p>
+      <w:pPr>
+        <w:spacing w:before="0" w:after="0" w:line="283" w:lineRule="auto"/>
+        <w:shd w:val="clear" w:color="auto" w:fill="F3F7F4"/>
+        <w:pBdr>
+          <w:top w:val="single" w:sz="8" w:space="8" w:color="CFE7DB"/>
+          <w:bottom w:val="single" w:sz="8" w:space="8" w:color="CFE7DB"/>
+          <w:left w:val="single" w:sz="8" w:space="8" w:color="CFE7DB"/>
+          <w:right w:val="single" w:sz="8" w:space="8" w:color="CFE7DB"/>
+        </w:pBdr>
+      </w:pPr>
+      <w:r>
+        <w:rPr>
+          <w:rFonts w:ascii="Consolas" w:hAnsi="Consolas"/>
+          <w:b w:val="0"/>
+          <w:color w:val="16211D"/>
+          <w:sz w:val="19"/>
+        </w:rPr>
+        <w:t>Every run gets a shareable link that replays the exact same draft and result in any browser — same seed, same outcome. Same-nation picks build Synergy — watch it live as you draft. https://www.wcdraft.com/play</w:t>
+      </w:r>
+    </w:p>
+    <w:p>
+      <w:pPr>
+        <w:spacing w:before="40" w:after="200"/>
+      </w:pPr>
+      <w:r>
+        <w:rPr>
+          <w:rFonts w:ascii="Calibri" w:hAnsi="Calibri"/>
+          <w:b/>
+          <w:color w:val="F5B62A"/>
+          <w:sz w:val="17"/>
+        </w:rPr>
+        <w:t>204/280 chars</w:t>
+      </w:r>
+    </w:p>
+    <w:p>
+      <w:pPr>
+        <w:spacing w:before="160" w:after="40"/>
+      </w:pPr>
+      <w:r>
+        <w:rPr>
+          <w:rFonts w:ascii="Calibri" w:hAnsi="Calibri"/>
+          <w:b/>
+          <w:color w:val="5D6B64"/>
+          <w:sz w:val="18"/>
+        </w:rPr>
+        <w:t>Saturday · 2 · daily challenge</w:t>
+      </w:r>
+    </w:p>
+    <w:p>
+      <w:pPr>
+        <w:spacing w:before="0" w:after="0" w:line="283" w:lineRule="auto"/>
+        <w:shd w:val="clear" w:color="auto" w:fill="F3F7F4"/>
+        <w:pBdr>
+          <w:top w:val="single" w:sz="8" w:space="8" w:color="CFE7DB"/>
+          <w:bottom w:val="single" w:sz="8" w:space="8" w:color="CFE7DB"/>
+          <w:left w:val="single" w:sz="8" w:space="8" w:color="CFE7DB"/>
+          <w:right w:val="single" w:sz="8" w:space="8" w:color="CFE7DB"/>
+        </w:pBdr>
+      </w:pPr>
+      <w:r>
+        <w:rPr>
+          <w:rFonts w:ascii="Consolas" w:hAnsi="Consolas"/>
+          <w:b w:val="0"/>
+          <w:color w:val="16211D"/>
+          <w:sz w:val="19"/>
+        </w:rPr>
+        <w:t>Netherlands v Sweden, Tunisia v Japan today. Memory mode is the real test: pick by names, years and flags before the reveal. https://www.wcdraft.com/play</w:t>
+      </w:r>
+    </w:p>
+    <w:p>
+      <w:pPr>
+        <w:spacing w:before="40" w:after="200"/>
+      </w:pPr>
+      <w:r>
+        <w:rPr>
+          <w:rFonts w:ascii="Calibri" w:hAnsi="Calibri"/>
+          <w:b/>
+          <w:color w:val="F5B62A"/>
+          <w:sz w:val="17"/>
+        </w:rPr>
+        <w:t>148/280 chars</w:t>
+      </w:r>
+    </w:p>
+    <w:p>
+      <w:pPr>
+        <w:spacing w:before="160" w:after="40"/>
+      </w:pPr>
+      <w:r>
+        <w:rPr>
+          <w:rFonts w:ascii="Calibri" w:hAnsi="Calibri"/>
+          <w:b/>
+          <w:color w:val="5D6B64"/>
+          <w:sz w:val="18"/>
+        </w:rPr>
+        <w:t>Saturday · 3 · factoid</w:t>
+      </w:r>
+    </w:p>
+    <w:p>
+      <w:pPr>
+        <w:spacing w:before="0" w:after="0" w:line="283" w:lineRule="auto"/>
+        <w:shd w:val="clear" w:color="auto" w:fill="F3F7F4"/>
+        <w:pBdr>
+          <w:top w:val="single" w:sz="8" w:space="8" w:color="CFE7DB"/>
+          <w:bottom w:val="single" w:sz="8" w:space="8" w:color="CFE7DB"/>
+          <w:left w:val="single" w:sz="8" w:space="8" w:color="CFE7DB"/>
+          <w:right w:val="single" w:sz="8" w:space="8" w:color="CFE7DB"/>
+        </w:pBdr>
+      </w:pPr>
+      <w:r>
+        <w:rPr>
+          <w:rFonts w:ascii="Consolas" w:hAnsi="Consolas"/>
+          <w:b w:val="0"/>
+          <w:color w:val="16211D"/>
+          <w:sz w:val="19"/>
+        </w:rPr>
+        <w:t>Casillas (ESP), 2010: a goalkeeper with 7 appearances that World Cup — in the wcdraft pool. Managers are a pick here — one of your 17 spins. https://www.wcdraft.com/play</w:t>
+      </w:r>
+    </w:p>
+    <w:p>
+      <w:pPr>
+        <w:spacing w:before="40" w:after="200"/>
+      </w:pPr>
+      <w:r>
+        <w:rPr>
+          <w:rFonts w:ascii="Calibri" w:hAnsi="Calibri"/>
+          <w:b/>
+          <w:color w:val="F5B62A"/>
+          <w:sz w:val="17"/>
+        </w:rPr>
+        <w:t>164/280 chars</w:t>
+      </w:r>
+    </w:p>
+    <w:p>
+      <w:pPr>
+        <w:spacing w:before="160" w:after="40"/>
+      </w:pPr>
+      <w:r>
+        <w:rPr>
+          <w:rFonts w:ascii="Calibri" w:hAnsi="Calibri"/>
+          <w:b/>
+          <w:color w:val="5D6B64"/>
+          <w:sz w:val="18"/>
+        </w:rPr>
+        <w:t>Saturday · 4 · feature pitch</w:t>
+      </w:r>
+    </w:p>
+    <w:p>
+      <w:pPr>
+        <w:spacing w:before="0" w:after="0" w:line="283" w:lineRule="auto"/>
+        <w:shd w:val="clear" w:color="auto" w:fill="F3F7F4"/>
+        <w:pBdr>
+          <w:top w:val="single" w:sz="8" w:space="8" w:color="CFE7DB"/>
+          <w:bottom w:val="single" w:sz="8" w:space="8" w:color="CFE7DB"/>
+          <w:left w:val="single" w:sz="8" w:space="8" w:color="CFE7DB"/>
+          <w:right w:val="single" w:sz="8" w:space="8" w:color="CFE7DB"/>
+        </w:pBdr>
+      </w:pPr>
+      <w:r>
+        <w:rPr>
+          <w:rFonts w:ascii="Consolas" w:hAnsi="Consolas"/>
+          <w:b w:val="0"/>
+          <w:color w:val="16211D"/>
+          <w:sz w:val="19"/>
+        </w:rPr>
+        <w:t>Choose your era: All-time, Post-2000, Post-2010, or Modern — drafting across more than ninety years of World Cup squads (1930–2026). Every run has a shareable, replayable link. https://www.wcdraft.com/play</w:t>
+      </w:r>
+    </w:p>
+    <w:p>
+      <w:pPr>
+        <w:spacing w:before="40" w:after="200"/>
+      </w:pPr>
+      <w:r>
+        <w:rPr>
+          <w:rFonts w:ascii="Calibri" w:hAnsi="Calibri"/>
+          <w:b/>
+          <w:color w:val="F5B62A"/>
+          <w:sz w:val="17"/>
+        </w:rPr>
+        <w:t>200/280 chars</w:t>
+      </w:r>
+    </w:p>
+    <w:p>
+      <w:pPr>
+        <w:spacing w:before="160" w:after="40"/>
+      </w:pPr>
+      <w:r>
+        <w:rPr>
+          <w:rFonts w:ascii="Calibri" w:hAnsi="Calibri"/>
+          <w:b/>
+          <w:color w:val="5D6B64"/>
+          <w:sz w:val="18"/>
+        </w:rPr>
+        <w:t>Saturday · 5 · daily challenge</w:t>
+      </w:r>
+    </w:p>
+    <w:p>
+      <w:pPr>
+        <w:spacing w:before="0" w:after="0" w:line="283" w:lineRule="auto"/>
+        <w:shd w:val="clear" w:color="auto" w:fill="F3F7F4"/>
+        <w:pBdr>
+          <w:top w:val="single" w:sz="8" w:space="8" w:color="CFE7DB"/>
+          <w:bottom w:val="single" w:sz="8" w:space="8" w:color="CFE7DB"/>
+          <w:left w:val="single" w:sz="8" w:space="8" w:color="CFE7DB"/>
+          <w:right w:val="single" w:sz="8" w:space="8" w:color="CFE7DB"/>
+        </w:pBdr>
+      </w:pPr>
+      <w:r>
+        <w:rPr>
+          <w:rFonts w:ascii="Consolas" w:hAnsi="Consolas"/>
+          <w:b w:val="0"/>
+          <w:color w:val="16211D"/>
+          <w:sz w:val="19"/>
+        </w:rPr>
+        <w:t>Run the real 2026 bracket — 8 matches, a perfect run is 8-0. Today's seed: Brazil 1958 — spin it and pick. https://www.wcdraft.com/play</w:t>
       </w:r>
     </w:p>
     <w:p>
@@ -1284,7 +2364,7 @@
           <w:color w:val="5D6B64"/>
           <w:sz w:val="18"/>
         </w:rPr>
-        <w:t>Wednesday · 3 · factoid</w:t>
+        <w:t>Saturday · 6 · factoid</w:t>
       </w:r>
     </w:p>
     <w:p>
@@ -1305,7 +2385,7 @@
           <w:color w:val="16211D"/>
           <w:sz w:val="19"/>
         </w:rPr>
-        <w:t>Same-nation picks build Synergy — watch it live as you draft. Kaká (BRA) — a wcdraft all-time legend from the 2010 World Cup squad: a midfielder you can draft into your all-time XI. https://www.wcdraft.com/play</w:t>
+        <w:t>Albert (HUN), 1966: a midfielder with 4 appearances that World Cup — in the wcdraft pool. Seventeen spins. One pick each. Build the whole XI. https://www.wcdraft.com/play</w:t>
       </w:r>
     </w:p>
     <w:p>
@@ -1319,1087 +2399,7 @@
           <w:color w:val="F5B62A"/>
           <w:sz w:val="17"/>
         </w:rPr>
-        <w:t>205/280 chars</w:t>
-      </w:r>
-    </w:p>
-    <w:p>
-      <w:pPr>
-        <w:spacing w:before="160" w:after="40"/>
-      </w:pPr>
-      <w:r>
-        <w:rPr>
-          <w:rFonts w:ascii="Calibri" w:hAnsi="Calibri"/>
-          <w:b/>
-          <w:color w:val="5D6B64"/>
-          <w:sz w:val="18"/>
-        </w:rPr>
-        <w:t>Wednesday · 4 · feature pitch</w:t>
-      </w:r>
-    </w:p>
-    <w:p>
-      <w:pPr>
-        <w:spacing w:before="0" w:after="0" w:line="283" w:lineRule="auto"/>
-        <w:shd w:val="clear" w:color="auto" w:fill="F3F7F4"/>
-        <w:pBdr>
-          <w:top w:val="single" w:sz="8" w:space="8" w:color="CFE7DB"/>
-          <w:bottom w:val="single" w:sz="8" w:space="8" w:color="CFE7DB"/>
-          <w:left w:val="single" w:sz="8" w:space="8" w:color="CFE7DB"/>
-          <w:right w:val="single" w:sz="8" w:space="8" w:color="CFE7DB"/>
-        </w:pBdr>
-      </w:pPr>
-      <w:r>
-        <w:rPr>
-          <w:rFonts w:ascii="Consolas" w:hAnsi="Consolas"/>
-          <w:b w:val="0"/>
-          <w:color w:val="16211D"/>
-          <w:sz w:val="19"/>
-        </w:rPr>
-        <w:t>Players from the same nation build Synergy — a live preview shows your XI's connections as you draft. https://www.wcdraft.com/play</w:t>
-      </w:r>
-    </w:p>
-    <w:p>
-      <w:pPr>
-        <w:spacing w:before="40" w:after="200"/>
-      </w:pPr>
-      <w:r>
-        <w:rPr>
-          <w:rFonts w:ascii="Calibri" w:hAnsi="Calibri"/>
-          <w:b/>
-          <w:color w:val="F5B62A"/>
-          <w:sz w:val="17"/>
-        </w:rPr>
-        <w:t>125/280 chars</w:t>
-      </w:r>
-    </w:p>
-    <w:p>
-      <w:pPr>
-        <w:spacing w:before="160" w:after="40"/>
-      </w:pPr>
-      <w:r>
-        <w:rPr>
-          <w:rFonts w:ascii="Calibri" w:hAnsi="Calibri"/>
-          <w:b/>
-          <w:color w:val="5D6B64"/>
-          <w:sz w:val="18"/>
-        </w:rPr>
-        <w:t>Wednesday · 5 · daily challenge</w:t>
-      </w:r>
-    </w:p>
-    <w:p>
-      <w:pPr>
-        <w:spacing w:before="0" w:after="0" w:line="283" w:lineRule="auto"/>
-        <w:shd w:val="clear" w:color="auto" w:fill="F3F7F4"/>
-        <w:pBdr>
-          <w:top w:val="single" w:sz="8" w:space="8" w:color="CFE7DB"/>
-          <w:bottom w:val="single" w:sz="8" w:space="8" w:color="CFE7DB"/>
-          <w:left w:val="single" w:sz="8" w:space="8" w:color="CFE7DB"/>
-          <w:right w:val="single" w:sz="8" w:space="8" w:color="CFE7DB"/>
-        </w:pBdr>
-      </w:pPr>
-      <w:r>
-        <w:rPr>
-          <w:rFonts w:ascii="Consolas" w:hAnsi="Consolas"/>
-          <w:b w:val="0"/>
-          <w:color w:val="16211D"/>
-          <w:sz w:val="19"/>
-        </w:rPr>
-        <w:t>Two modes: ratings on the table, or draft from memory. Today's seed: Senegal 2026 — spin it and pick. https://www.wcdraft.com/play</w:t>
-      </w:r>
-    </w:p>
-    <w:p>
-      <w:pPr>
-        <w:spacing w:before="40" w:after="200"/>
-      </w:pPr>
-      <w:r>
-        <w:rPr>
-          <w:rFonts w:ascii="Calibri" w:hAnsi="Calibri"/>
-          <w:b/>
-          <w:color w:val="F5B62A"/>
-          <w:sz w:val="17"/>
-        </w:rPr>
-        <w:t>125/280 chars</w:t>
-      </w:r>
-    </w:p>
-    <w:p>
-      <w:pPr>
-        <w:spacing w:before="160" w:after="40"/>
-      </w:pPr>
-      <w:r>
-        <w:rPr>
-          <w:rFonts w:ascii="Calibri" w:hAnsi="Calibri"/>
-          <w:b/>
-          <w:color w:val="5D6B64"/>
-          <w:sz w:val="18"/>
-        </w:rPr>
-        <w:t>Wednesday · 6 · factoid</w:t>
-      </w:r>
-    </w:p>
-    <w:p>
-      <w:pPr>
-        <w:spacing w:before="0" w:after="0" w:line="283" w:lineRule="auto"/>
-        <w:shd w:val="clear" w:color="auto" w:fill="F3F7F4"/>
-        <w:pBdr>
-          <w:top w:val="single" w:sz="8" w:space="8" w:color="CFE7DB"/>
-          <w:bottom w:val="single" w:sz="8" w:space="8" w:color="CFE7DB"/>
-          <w:left w:val="single" w:sz="8" w:space="8" w:color="CFE7DB"/>
-          <w:right w:val="single" w:sz="8" w:space="8" w:color="CFE7DB"/>
-        </w:pBdr>
-      </w:pPr>
-      <w:r>
-        <w:rPr>
-          <w:rFonts w:ascii="Consolas" w:hAnsi="Consolas"/>
-          <w:b w:val="0"/>
-          <w:color w:val="16211D"/>
-          <w:sz w:val="19"/>
-        </w:rPr>
-        <w:t>Neuer (DEU) — a wcdraft all-time legend from the 2026 World Cup squad: a goalkeeper you can draft into your all-time XI. Classic, or Memory — ratings hidden until the reveal. https://www.wcdraft.com/play</w:t>
-      </w:r>
-    </w:p>
-    <w:p>
-      <w:pPr>
-        <w:spacing w:before="40" w:after="200"/>
-      </w:pPr>
-      <w:r>
-        <w:rPr>
-          <w:rFonts w:ascii="Calibri" w:hAnsi="Calibri"/>
-          <w:b/>
-          <w:color w:val="F5B62A"/>
-          <w:sz w:val="17"/>
-        </w:rPr>
-        <w:t>198/280 chars</w:t>
-      </w:r>
-    </w:p>
-    <w:p>
-      <w:pPr>
-        <w:spacing w:before="220" w:after="100"/>
-        <w:pBdr>
-          <w:left w:val="single" w:sz="18" w:space="6" w:color="F5B62A"/>
-        </w:pBdr>
-      </w:pPr>
-      <w:r>
-        <w:rPr>
-          <w:rFonts w:ascii="Calibri" w:hAnsi="Calibri"/>
-          <w:b/>
-          <w:color w:val="16211D"/>
-          <w:sz w:val="25"/>
-        </w:rPr>
-        <w:t>Thursday</w:t>
-      </w:r>
-    </w:p>
-    <w:p>
-      <w:pPr>
-        <w:spacing w:before="160" w:after="40"/>
-      </w:pPr>
-      <w:r>
-        <w:rPr>
-          <w:rFonts w:ascii="Calibri" w:hAnsi="Calibri"/>
-          <w:b/>
-          <w:color w:val="5D6B64"/>
-          <w:sz w:val="18"/>
-        </w:rPr>
-        <w:t>Thursday · 1 · feature pitch</w:t>
-      </w:r>
-    </w:p>
-    <w:p>
-      <w:pPr>
-        <w:spacing w:before="0" w:after="0" w:line="283" w:lineRule="auto"/>
-        <w:shd w:val="clear" w:color="auto" w:fill="F3F7F4"/>
-        <w:pBdr>
-          <w:top w:val="single" w:sz="8" w:space="8" w:color="CFE7DB"/>
-          <w:bottom w:val="single" w:sz="8" w:space="8" w:color="CFE7DB"/>
-          <w:left w:val="single" w:sz="8" w:space="8" w:color="CFE7DB"/>
-          <w:right w:val="single" w:sz="8" w:space="8" w:color="CFE7DB"/>
-        </w:pBdr>
-      </w:pPr>
-      <w:r>
-        <w:rPr>
-          <w:rFonts w:ascii="Consolas" w:hAnsi="Consolas"/>
-          <w:b w:val="0"/>
-          <w:color w:val="16211D"/>
-          <w:sz w:val="19"/>
-        </w:rPr>
-        <w:t>wcdraft is free and runs entirely in your browser — no app, no download, no account needed to play. Career peak or current form — you pick the rating basis. https://www.wcdraft.com/play</w:t>
-      </w:r>
-    </w:p>
-    <w:p>
-      <w:pPr>
-        <w:spacing w:before="40" w:after="200"/>
-      </w:pPr>
-      <w:r>
-        <w:rPr>
-          <w:rFonts w:ascii="Calibri" w:hAnsi="Calibri"/>
-          <w:b/>
-          <w:color w:val="F5B62A"/>
-          <w:sz w:val="17"/>
-        </w:rPr>
-        <w:t>180/280 chars</w:t>
-      </w:r>
-    </w:p>
-    <w:p>
-      <w:pPr>
-        <w:spacing w:before="160" w:after="40"/>
-      </w:pPr>
-      <w:r>
-        <w:rPr>
-          <w:rFonts w:ascii="Calibri" w:hAnsi="Calibri"/>
-          <w:b/>
-          <w:color w:val="5D6B64"/>
-          <w:sz w:val="18"/>
-        </w:rPr>
-        <w:t>Thursday · 2 · daily challenge</w:t>
-      </w:r>
-    </w:p>
-    <w:p>
-      <w:pPr>
-        <w:spacing w:before="0" w:after="0" w:line="283" w:lineRule="auto"/>
-        <w:shd w:val="clear" w:color="auto" w:fill="F3F7F4"/>
-        <w:pBdr>
-          <w:top w:val="single" w:sz="8" w:space="8" w:color="CFE7DB"/>
-          <w:bottom w:val="single" w:sz="8" w:space="8" w:color="CFE7DB"/>
-          <w:left w:val="single" w:sz="8" w:space="8" w:color="CFE7DB"/>
-          <w:right w:val="single" w:sz="8" w:space="8" w:color="CFE7DB"/>
-        </w:pBdr>
-      </w:pPr>
-      <w:r>
-        <w:rPr>
-          <w:rFonts w:ascii="Consolas" w:hAnsi="Consolas"/>
-          <w:b w:val="0"/>
-          <w:color w:val="16211D"/>
-          <w:sz w:val="19"/>
-        </w:rPr>
-        <w:t>Today's spin: Argentina 1982. Who's your pick? Nation Synergy rewards a connected XI. https://www.wcdraft.com/play</w:t>
-      </w:r>
-    </w:p>
-    <w:p>
-      <w:pPr>
-        <w:spacing w:before="40" w:after="200"/>
-      </w:pPr>
-      <w:r>
-        <w:rPr>
-          <w:rFonts w:ascii="Calibri" w:hAnsi="Calibri"/>
-          <w:b/>
-          <w:color w:val="F5B62A"/>
-          <w:sz w:val="17"/>
-        </w:rPr>
-        <w:t>109/280 chars</w:t>
-      </w:r>
-    </w:p>
-    <w:p>
-      <w:pPr>
-        <w:spacing w:before="160" w:after="40"/>
-      </w:pPr>
-      <w:r>
-        <w:rPr>
-          <w:rFonts w:ascii="Calibri" w:hAnsi="Calibri"/>
-          <w:b/>
-          <w:color w:val="5D6B64"/>
-          <w:sz w:val="18"/>
-        </w:rPr>
-        <w:t>Thursday · 3 · factoid</w:t>
-      </w:r>
-    </w:p>
-    <w:p>
-      <w:pPr>
-        <w:spacing w:before="0" w:after="0" w:line="283" w:lineRule="auto"/>
-        <w:shd w:val="clear" w:color="auto" w:fill="F3F7F4"/>
-        <w:pBdr>
-          <w:top w:val="single" w:sz="8" w:space="8" w:color="CFE7DB"/>
-          <w:bottom w:val="single" w:sz="8" w:space="8" w:color="CFE7DB"/>
-          <w:left w:val="single" w:sz="8" w:space="8" w:color="CFE7DB"/>
-          <w:right w:val="single" w:sz="8" w:space="8" w:color="CFE7DB"/>
-        </w:pBdr>
-      </w:pPr>
-      <w:r>
-        <w:rPr>
-          <w:rFonts w:ascii="Consolas" w:hAnsi="Consolas"/>
-          <w:b w:val="0"/>
-          <w:color w:val="16211D"/>
-          <w:sz w:val="19"/>
-        </w:rPr>
-        <w:t>You draft a manager too. Most games don't let you. Ronaldo (PRT) — a wcdraft all-time legend from the 2010 World Cup squad, 1 goal that tournament. https://www.wcdraft.com/play</w:t>
-      </w:r>
-    </w:p>
-    <w:p>
-      <w:pPr>
-        <w:spacing w:before="40" w:after="200"/>
-      </w:pPr>
-      <w:r>
-        <w:rPr>
-          <w:rFonts w:ascii="Calibri" w:hAnsi="Calibri"/>
-          <w:b/>
-          <w:color w:val="F5B62A"/>
-          <w:sz w:val="17"/>
-        </w:rPr>
-        <w:t>171/280 chars</w:t>
-      </w:r>
-    </w:p>
-    <w:p>
-      <w:pPr>
-        <w:spacing w:before="160" w:after="40"/>
-      </w:pPr>
-      <w:r>
-        <w:rPr>
-          <w:rFonts w:ascii="Calibri" w:hAnsi="Calibri"/>
-          <w:b/>
-          <w:color w:val="5D6B64"/>
-          <w:sz w:val="18"/>
-        </w:rPr>
-        <w:t>Thursday · 4 · feature pitch</w:t>
-      </w:r>
-    </w:p>
-    <w:p>
-      <w:pPr>
-        <w:spacing w:before="0" w:after="0" w:line="283" w:lineRule="auto"/>
-        <w:shd w:val="clear" w:color="auto" w:fill="F3F7F4"/>
-        <w:pBdr>
-          <w:top w:val="single" w:sz="8" w:space="8" w:color="CFE7DB"/>
-          <w:bottom w:val="single" w:sz="8" w:space="8" w:color="CFE7DB"/>
-          <w:left w:val="single" w:sz="8" w:space="8" w:color="CFE7DB"/>
-          <w:right w:val="single" w:sz="8" w:space="8" w:color="CFE7DB"/>
-        </w:pBdr>
-      </w:pPr>
-      <w:r>
-        <w:rPr>
-          <w:rFonts w:ascii="Consolas" w:hAnsi="Consolas"/>
-          <w:b w:val="0"/>
-          <w:color w:val="16211D"/>
-          <w:sz w:val="19"/>
-        </w:rPr>
-        <w:t>wcdraft is free and runs entirely in your browser — no app, no download, no account needed to play. https://www.wcdraft.com/play</w:t>
-      </w:r>
-    </w:p>
-    <w:p>
-      <w:pPr>
-        <w:spacing w:before="40" w:after="200"/>
-      </w:pPr>
-      <w:r>
-        <w:rPr>
-          <w:rFonts w:ascii="Calibri" w:hAnsi="Calibri"/>
-          <w:b/>
-          <w:color w:val="F5B62A"/>
-          <w:sz w:val="17"/>
-        </w:rPr>
-        <w:t>123/280 chars</w:t>
-      </w:r>
-    </w:p>
-    <w:p>
-      <w:pPr>
-        <w:spacing w:before="160" w:after="40"/>
-      </w:pPr>
-      <w:r>
-        <w:rPr>
-          <w:rFonts w:ascii="Calibri" w:hAnsi="Calibri"/>
-          <w:b/>
-          <w:color w:val="5D6B64"/>
-          <w:sz w:val="18"/>
-        </w:rPr>
-        <w:t>Thursday · 5 · daily challenge</w:t>
-      </w:r>
-    </w:p>
-    <w:p>
-      <w:pPr>
-        <w:spacing w:before="0" w:after="0" w:line="283" w:lineRule="auto"/>
-        <w:shd w:val="clear" w:color="auto" w:fill="F3F7F4"/>
-        <w:pBdr>
-          <w:top w:val="single" w:sz="8" w:space="8" w:color="CFE7DB"/>
-          <w:bottom w:val="single" w:sz="8" w:space="8" w:color="CFE7DB"/>
-          <w:left w:val="single" w:sz="8" w:space="8" w:color="CFE7DB"/>
-          <w:right w:val="single" w:sz="8" w:space="8" w:color="CFE7DB"/>
-        </w:pBdr>
-      </w:pPr>
-      <w:r>
-        <w:rPr>
-          <w:rFonts w:ascii="Consolas" w:hAnsi="Consolas"/>
-          <w:b w:val="0"/>
-          <w:color w:val="16211D"/>
-          <w:sz w:val="19"/>
-        </w:rPr>
-        <w:t>Today's spin: France 1958. Who's your pick? Submit your run to the leaderboard and rank up. https://www.wcdraft.com/play</w:t>
-      </w:r>
-    </w:p>
-    <w:p>
-      <w:pPr>
-        <w:spacing w:before="40" w:after="200"/>
-      </w:pPr>
-      <w:r>
-        <w:rPr>
-          <w:rFonts w:ascii="Calibri" w:hAnsi="Calibri"/>
-          <w:b/>
-          <w:color w:val="F5B62A"/>
-          <w:sz w:val="17"/>
-        </w:rPr>
-        <w:t>115/280 chars</w:t>
-      </w:r>
-    </w:p>
-    <w:p>
-      <w:pPr>
-        <w:spacing w:before="160" w:after="40"/>
-      </w:pPr>
-      <w:r>
-        <w:rPr>
-          <w:rFonts w:ascii="Calibri" w:hAnsi="Calibri"/>
-          <w:b/>
-          <w:color w:val="5D6B64"/>
-          <w:sz w:val="18"/>
-        </w:rPr>
-        <w:t>Thursday · 6 · factoid</w:t>
-      </w:r>
-    </w:p>
-    <w:p>
-      <w:pPr>
-        <w:spacing w:before="0" w:after="0" w:line="283" w:lineRule="auto"/>
-        <w:shd w:val="clear" w:color="auto" w:fill="F3F7F4"/>
-        <w:pBdr>
-          <w:top w:val="single" w:sz="8" w:space="8" w:color="CFE7DB"/>
-          <w:bottom w:val="single" w:sz="8" w:space="8" w:color="CFE7DB"/>
-          <w:left w:val="single" w:sz="8" w:space="8" w:color="CFE7DB"/>
-          <w:right w:val="single" w:sz="8" w:space="8" w:color="CFE7DB"/>
-        </w:pBdr>
-      </w:pPr>
-      <w:r>
-        <w:rPr>
-          <w:rFonts w:ascii="Consolas" w:hAnsi="Consolas"/>
-          <w:b w:val="0"/>
-          <w:color w:val="16211D"/>
-          <w:sz w:val="19"/>
-        </w:rPr>
-        <w:t>Classic, or Memory — ratings hidden until the reveal. Zico (BRA) — a wcdraft all-time legend from the 1978 World Cup squad, 1 goal that tournament. https://www.wcdraft.com/play</w:t>
-      </w:r>
-    </w:p>
-    <w:p>
-      <w:pPr>
-        <w:spacing w:before="40" w:after="200"/>
-      </w:pPr>
-      <w:r>
-        <w:rPr>
-          <w:rFonts w:ascii="Calibri" w:hAnsi="Calibri"/>
-          <w:b/>
-          <w:color w:val="F5B62A"/>
-          <w:sz w:val="17"/>
-        </w:rPr>
-        <w:t>171/280 chars</w:t>
-      </w:r>
-    </w:p>
-    <w:p>
-      <w:pPr>
-        <w:spacing w:before="220" w:after="100"/>
-        <w:pBdr>
-          <w:left w:val="single" w:sz="18" w:space="6" w:color="F5B62A"/>
-        </w:pBdr>
-      </w:pPr>
-      <w:r>
-        <w:rPr>
-          <w:rFonts w:ascii="Calibri" w:hAnsi="Calibri"/>
-          <w:b/>
-          <w:color w:val="16211D"/>
-          <w:sz w:val="25"/>
-        </w:rPr>
-        <w:t>Friday</w:t>
-      </w:r>
-    </w:p>
-    <w:p>
-      <w:pPr>
-        <w:spacing w:before="160" w:after="40"/>
-      </w:pPr>
-      <w:r>
-        <w:rPr>
-          <w:rFonts w:ascii="Calibri" w:hAnsi="Calibri"/>
-          <w:b/>
-          <w:color w:val="5D6B64"/>
-          <w:sz w:val="18"/>
-        </w:rPr>
-        <w:t>Friday · 1 · feature pitch</w:t>
-      </w:r>
-    </w:p>
-    <w:p>
-      <w:pPr>
-        <w:spacing w:before="0" w:after="0" w:line="283" w:lineRule="auto"/>
-        <w:shd w:val="clear" w:color="auto" w:fill="F3F7F4"/>
-        <w:pBdr>
-          <w:top w:val="single" w:sz="8" w:space="8" w:color="CFE7DB"/>
-          <w:bottom w:val="single" w:sz="8" w:space="8" w:color="CFE7DB"/>
-          <w:left w:val="single" w:sz="8" w:space="8" w:color="CFE7DB"/>
-          <w:right w:val="single" w:sz="8" w:space="8" w:color="CFE7DB"/>
-        </w:pBdr>
-      </w:pPr>
-      <w:r>
-        <w:rPr>
-          <w:rFonts w:ascii="Consolas" w:hAnsi="Consolas"/>
-          <w:b w:val="0"/>
-          <w:color w:val="16211D"/>
-          <w:sz w:val="19"/>
-        </w:rPr>
-        <w:t>Post your run to a season-keyed ranked leaderboard and see where your XI lands. Every run has a shareable, replayable link. https://www.wcdraft.com/play</w:t>
-      </w:r>
-    </w:p>
-    <w:p>
-      <w:pPr>
-        <w:spacing w:before="40" w:after="200"/>
-      </w:pPr>
-      <w:r>
-        <w:rPr>
-          <w:rFonts w:ascii="Calibri" w:hAnsi="Calibri"/>
-          <w:b/>
-          <w:color w:val="F5B62A"/>
-          <w:sz w:val="17"/>
-        </w:rPr>
-        <w:t>147/280 chars</w:t>
-      </w:r>
-    </w:p>
-    <w:p>
-      <w:pPr>
-        <w:spacing w:before="160" w:after="40"/>
-      </w:pPr>
-      <w:r>
-        <w:rPr>
-          <w:rFonts w:ascii="Calibri" w:hAnsi="Calibri"/>
-          <w:b/>
-          <w:color w:val="5D6B64"/>
-          <w:sz w:val="18"/>
-        </w:rPr>
-        <w:t>Friday · 2 · daily challenge</w:t>
-      </w:r>
-    </w:p>
-    <w:p>
-      <w:pPr>
-        <w:spacing w:before="0" w:after="0" w:line="283" w:lineRule="auto"/>
-        <w:shd w:val="clear" w:color="auto" w:fill="F3F7F4"/>
-        <w:pBdr>
-          <w:top w:val="single" w:sz="8" w:space="8" w:color="CFE7DB"/>
-          <w:bottom w:val="single" w:sz="8" w:space="8" w:color="CFE7DB"/>
-          <w:left w:val="single" w:sz="8" w:space="8" w:color="CFE7DB"/>
-          <w:right w:val="single" w:sz="8" w:space="8" w:color="CFE7DB"/>
-        </w:pBdr>
-      </w:pPr>
-      <w:r>
-        <w:rPr>
-          <w:rFonts w:ascii="Consolas" w:hAnsi="Consolas"/>
-          <w:b w:val="0"/>
-          <w:color w:val="16211D"/>
-          <w:sz w:val="19"/>
-        </w:rPr>
-        <w:t>France 1982 just rolled. One pick — who makes your all-time XI? Search the rolled squad by name, filter by position. https://www.wcdraft.com/play</w:t>
-      </w:r>
-    </w:p>
-    <w:p>
-      <w:pPr>
-        <w:spacing w:before="40" w:after="200"/>
-      </w:pPr>
-      <w:r>
-        <w:rPr>
-          <w:rFonts w:ascii="Calibri" w:hAnsi="Calibri"/>
-          <w:b/>
-          <w:color w:val="F5B62A"/>
-          <w:sz w:val="17"/>
-        </w:rPr>
-        <w:t>140/280 chars</w:t>
-      </w:r>
-    </w:p>
-    <w:p>
-      <w:pPr>
-        <w:spacing w:before="160" w:after="40"/>
-      </w:pPr>
-      <w:r>
-        <w:rPr>
-          <w:rFonts w:ascii="Calibri" w:hAnsi="Calibri"/>
-          <w:b/>
-          <w:color w:val="5D6B64"/>
-          <w:sz w:val="18"/>
-        </w:rPr>
-        <w:t>Friday · 3 · factoid</w:t>
-      </w:r>
-    </w:p>
-    <w:p>
-      <w:pPr>
-        <w:spacing w:before="0" w:after="0" w:line="283" w:lineRule="auto"/>
-        <w:shd w:val="clear" w:color="auto" w:fill="F3F7F4"/>
-        <w:pBdr>
-          <w:top w:val="single" w:sz="8" w:space="8" w:color="CFE7DB"/>
-          <w:bottom w:val="single" w:sz="8" w:space="8" w:color="CFE7DB"/>
-          <w:left w:val="single" w:sz="8" w:space="8" w:color="CFE7DB"/>
-          <w:right w:val="single" w:sz="8" w:space="8" w:color="CFE7DB"/>
-        </w:pBdr>
-      </w:pPr>
-      <w:r>
-        <w:rPr>
-          <w:rFonts w:ascii="Consolas" w:hAnsi="Consolas"/>
-          <w:b w:val="0"/>
-          <w:color w:val="16211D"/>
-          <w:sz w:val="19"/>
-        </w:rPr>
-        <w:t>Two ways to value a player: Career or Current. Müller (DEU) — a wcdraft all-time legend from the 1974 World Cup squad, 4 goals that tournament. https://www.wcdraft.com/play</w:t>
-      </w:r>
-    </w:p>
-    <w:p>
-      <w:pPr>
-        <w:spacing w:before="40" w:after="200"/>
-      </w:pPr>
-      <w:r>
-        <w:rPr>
-          <w:rFonts w:ascii="Calibri" w:hAnsi="Calibri"/>
-          <w:b/>
-          <w:color w:val="F5B62A"/>
-          <w:sz w:val="17"/>
-        </w:rPr>
-        <w:t>167/280 chars</w:t>
-      </w:r>
-    </w:p>
-    <w:p>
-      <w:pPr>
-        <w:spacing w:before="160" w:after="40"/>
-      </w:pPr>
-      <w:r>
-        <w:rPr>
-          <w:rFonts w:ascii="Calibri" w:hAnsi="Calibri"/>
-          <w:b/>
-          <w:color w:val="5D6B64"/>
-          <w:sz w:val="18"/>
-        </w:rPr>
-        <w:t>Friday · 4 · feature pitch</w:t>
-      </w:r>
-    </w:p>
-    <w:p>
-      <w:pPr>
-        <w:spacing w:before="0" w:after="0" w:line="283" w:lineRule="auto"/>
-        <w:shd w:val="clear" w:color="auto" w:fill="F3F7F4"/>
-        <w:pBdr>
-          <w:top w:val="single" w:sz="8" w:space="8" w:color="CFE7DB"/>
-          <w:bottom w:val="single" w:sz="8" w:space="8" w:color="CFE7DB"/>
-          <w:left w:val="single" w:sz="8" w:space="8" w:color="CFE7DB"/>
-          <w:right w:val="single" w:sz="8" w:space="8" w:color="CFE7DB"/>
-        </w:pBdr>
-      </w:pPr>
-      <w:r>
-        <w:rPr>
-          <w:rFonts w:ascii="Consolas" w:hAnsi="Consolas"/>
-          <w:b w:val="0"/>
-          <w:color w:val="16211D"/>
-          <w:sz w:val="19"/>
-        </w:rPr>
-        <w:t>Every run gets a shareable link that replays the exact same draft and result in any browser — same seed, same outcome. https://www.wcdraft.com/play</w:t>
-      </w:r>
-    </w:p>
-    <w:p>
-      <w:pPr>
-        <w:spacing w:before="40" w:after="200"/>
-      </w:pPr>
-      <w:r>
-        <w:rPr>
-          <w:rFonts w:ascii="Calibri" w:hAnsi="Calibri"/>
-          <w:b/>
-          <w:color w:val="F5B62A"/>
-          <w:sz w:val="17"/>
-        </w:rPr>
-        <w:t>142/280 chars</w:t>
-      </w:r>
-    </w:p>
-    <w:p>
-      <w:pPr>
-        <w:spacing w:before="160" w:after="40"/>
-      </w:pPr>
-      <w:r>
-        <w:rPr>
-          <w:rFonts w:ascii="Calibri" w:hAnsi="Calibri"/>
-          <w:b/>
-          <w:color w:val="5D6B64"/>
-          <w:sz w:val="18"/>
-        </w:rPr>
-        <w:t>Friday · 5 · daily challenge</w:t>
-      </w:r>
-    </w:p>
-    <w:p>
-      <w:pPr>
-        <w:spacing w:before="0" w:after="0" w:line="283" w:lineRule="auto"/>
-        <w:shd w:val="clear" w:color="auto" w:fill="F3F7F4"/>
-        <w:pBdr>
-          <w:top w:val="single" w:sz="8" w:space="8" w:color="CFE7DB"/>
-          <w:bottom w:val="single" w:sz="8" w:space="8" w:color="CFE7DB"/>
-          <w:left w:val="single" w:sz="8" w:space="8" w:color="CFE7DB"/>
-          <w:right w:val="single" w:sz="8" w:space="8" w:color="CFE7DB"/>
-        </w:pBdr>
-      </w:pPr>
-      <w:r>
-        <w:rPr>
-          <w:rFonts w:ascii="Consolas" w:hAnsi="Consolas"/>
-          <w:b w:val="0"/>
-          <w:color w:val="16211D"/>
-          <w:sz w:val="19"/>
-        </w:rPr>
-        <w:t>Position First: lock the slot, then spin for who fills it. Today's seed: Soviet Union 1966 — spin it and pick. https://www.wcdraft.com/play</w:t>
-      </w:r>
-    </w:p>
-    <w:p>
-      <w:pPr>
-        <w:spacing w:before="40" w:after="200"/>
-      </w:pPr>
-      <w:r>
-        <w:rPr>
-          <w:rFonts w:ascii="Calibri" w:hAnsi="Calibri"/>
-          <w:b/>
-          <w:color w:val="F5B62A"/>
-          <w:sz w:val="17"/>
-        </w:rPr>
-        <w:t>134/280 chars</w:t>
-      </w:r>
-    </w:p>
-    <w:p>
-      <w:pPr>
-        <w:spacing w:before="160" w:after="40"/>
-      </w:pPr>
-      <w:r>
-        <w:rPr>
-          <w:rFonts w:ascii="Calibri" w:hAnsi="Calibri"/>
-          <w:b/>
-          <w:color w:val="5D6B64"/>
-          <w:sz w:val="18"/>
-        </w:rPr>
-        <w:t>Friday · 6 · factoid</w:t>
-      </w:r>
-    </w:p>
-    <w:p>
-      <w:pPr>
-        <w:spacing w:before="0" w:after="0" w:line="283" w:lineRule="auto"/>
-        <w:shd w:val="clear" w:color="auto" w:fill="F3F7F4"/>
-        <w:pBdr>
-          <w:top w:val="single" w:sz="8" w:space="8" w:color="CFE7DB"/>
-          <w:bottom w:val="single" w:sz="8" w:space="8" w:color="CFE7DB"/>
-          <w:left w:val="single" w:sz="8" w:space="8" w:color="CFE7DB"/>
-          <w:right w:val="single" w:sz="8" w:space="8" w:color="CFE7DB"/>
-        </w:pBdr>
-      </w:pPr>
-      <w:r>
-        <w:rPr>
-          <w:rFonts w:ascii="Consolas" w:hAnsi="Consolas"/>
-          <w:b w:val="0"/>
-          <w:color w:val="16211D"/>
-          <w:sz w:val="19"/>
-        </w:rPr>
-        <w:t>Henry (FRA), 1998: a forward with 6 appearances that World Cup — in the wcdraft pool. Ranked board, keyed to the season. Climb it. https://www.wcdraft.com/play</w:t>
-      </w:r>
-    </w:p>
-    <w:p>
-      <w:pPr>
-        <w:spacing w:before="40" w:after="200"/>
-      </w:pPr>
-      <w:r>
-        <w:rPr>
-          <w:rFonts w:ascii="Calibri" w:hAnsi="Calibri"/>
-          <w:b/>
-          <w:color w:val="F5B62A"/>
-          <w:sz w:val="17"/>
-        </w:rPr>
-        <w:t>154/280 chars</w:t>
-      </w:r>
-    </w:p>
-    <w:p>
-      <w:pPr>
-        <w:spacing w:before="220" w:after="100"/>
-        <w:pBdr>
-          <w:left w:val="single" w:sz="18" w:space="6" w:color="F5B62A"/>
-        </w:pBdr>
-      </w:pPr>
-      <w:r>
-        <w:rPr>
-          <w:rFonts w:ascii="Calibri" w:hAnsi="Calibri"/>
-          <w:b/>
-          <w:color w:val="16211D"/>
-          <w:sz w:val="25"/>
-        </w:rPr>
-        <w:t>Saturday</w:t>
-      </w:r>
-    </w:p>
-    <w:p>
-      <w:pPr>
-        <w:spacing w:before="160" w:after="40"/>
-      </w:pPr>
-      <w:r>
-        <w:rPr>
-          <w:rFonts w:ascii="Calibri" w:hAnsi="Calibri"/>
-          <w:b/>
-          <w:color w:val="5D6B64"/>
-          <w:sz w:val="18"/>
-        </w:rPr>
-        <w:t>Saturday · 1 · feature pitch</w:t>
-      </w:r>
-    </w:p>
-    <w:p>
-      <w:pPr>
-        <w:spacing w:before="0" w:after="0" w:line="283" w:lineRule="auto"/>
-        <w:shd w:val="clear" w:color="auto" w:fill="F3F7F4"/>
-        <w:pBdr>
-          <w:top w:val="single" w:sz="8" w:space="8" w:color="CFE7DB"/>
-          <w:bottom w:val="single" w:sz="8" w:space="8" w:color="CFE7DB"/>
-          <w:left w:val="single" w:sz="8" w:space="8" w:color="CFE7DB"/>
-          <w:right w:val="single" w:sz="8" w:space="8" w:color="CFE7DB"/>
-        </w:pBdr>
-      </w:pPr>
-      <w:r>
-        <w:rPr>
-          <w:rFonts w:ascii="Consolas" w:hAnsi="Consolas"/>
-          <w:b w:val="0"/>
-          <w:color w:val="16211D"/>
-          <w:sz w:val="19"/>
-        </w:rPr>
-        <w:t>Pick your draft order: Squad First, or Position First — commit a slot to fill before the squad is even revealed. https://www.wcdraft.com/play</w:t>
-      </w:r>
-    </w:p>
-    <w:p>
-      <w:pPr>
-        <w:spacing w:before="40" w:after="200"/>
-      </w:pPr>
-      <w:r>
-        <w:rPr>
-          <w:rFonts w:ascii="Calibri" w:hAnsi="Calibri"/>
-          <w:b/>
-          <w:color w:val="F5B62A"/>
-          <w:sz w:val="17"/>
-        </w:rPr>
-        <w:t>136/280 chars</w:t>
-      </w:r>
-    </w:p>
-    <w:p>
-      <w:pPr>
-        <w:spacing w:before="160" w:after="40"/>
-      </w:pPr>
-      <w:r>
-        <w:rPr>
-          <w:rFonts w:ascii="Calibri" w:hAnsi="Calibri"/>
-          <w:b/>
-          <w:color w:val="5D6B64"/>
-          <w:sz w:val="18"/>
-        </w:rPr>
-        <w:t>Saturday · 2 · daily challenge</w:t>
-      </w:r>
-    </w:p>
-    <w:p>
-      <w:pPr>
-        <w:spacing w:before="0" w:after="0" w:line="283" w:lineRule="auto"/>
-        <w:shd w:val="clear" w:color="auto" w:fill="F3F7F4"/>
-        <w:pBdr>
-          <w:top w:val="single" w:sz="8" w:space="8" w:color="CFE7DB"/>
-          <w:bottom w:val="single" w:sz="8" w:space="8" w:color="CFE7DB"/>
-          <w:left w:val="single" w:sz="8" w:space="8" w:color="CFE7DB"/>
-          <w:right w:val="single" w:sz="8" w:space="8" w:color="CFE7DB"/>
-        </w:pBdr>
-      </w:pPr>
-      <w:r>
-        <w:rPr>
-          <w:rFonts w:ascii="Consolas" w:hAnsi="Consolas"/>
-          <w:b w:val="0"/>
-          <w:color w:val="16211D"/>
-          <w:sz w:val="19"/>
-        </w:rPr>
-        <w:t>Squad First or Position First — your call. Today's seed: Spain 2002 — spin it and pick. https://www.wcdraft.com/play</w:t>
-      </w:r>
-    </w:p>
-    <w:p>
-      <w:pPr>
-        <w:spacing w:before="40" w:after="200"/>
-      </w:pPr>
-      <w:r>
-        <w:rPr>
-          <w:rFonts w:ascii="Calibri" w:hAnsi="Calibri"/>
-          <w:b/>
-          <w:color w:val="F5B62A"/>
-          <w:sz w:val="17"/>
-        </w:rPr>
-        <w:t>111/280 chars</w:t>
-      </w:r>
-    </w:p>
-    <w:p>
-      <w:pPr>
-        <w:spacing w:before="160" w:after="40"/>
-      </w:pPr>
-      <w:r>
-        <w:rPr>
-          <w:rFonts w:ascii="Calibri" w:hAnsi="Calibri"/>
-          <w:b/>
-          <w:color w:val="5D6B64"/>
-          <w:sz w:val="18"/>
-        </w:rPr>
-        <w:t>Saturday · 3 · factoid</w:t>
-      </w:r>
-    </w:p>
-    <w:p>
-      <w:pPr>
-        <w:spacing w:before="0" w:after="0" w:line="283" w:lineRule="auto"/>
-        <w:shd w:val="clear" w:color="auto" w:fill="F3F7F4"/>
-        <w:pBdr>
-          <w:top w:val="single" w:sz="8" w:space="8" w:color="CFE7DB"/>
-          <w:bottom w:val="single" w:sz="8" w:space="8" w:color="CFE7DB"/>
-          <w:left w:val="single" w:sz="8" w:space="8" w:color="CFE7DB"/>
-          <w:right w:val="single" w:sz="8" w:space="8" w:color="CFE7DB"/>
-        </w:pBdr>
-      </w:pPr>
-      <w:r>
-        <w:rPr>
-          <w:rFonts w:ascii="Consolas" w:hAnsi="Consolas"/>
-          <w:b w:val="0"/>
-          <w:color w:val="16211D"/>
-          <w:sz w:val="19"/>
-        </w:rPr>
-        <w:t>Same-nation picks build Synergy — watch it live as you draft. Sindelar (AUT) — a wcdraft all-time legend from the 1934 World Cup squad, 1 goal that tournament. https://www.wcdraft.com/play</w:t>
-      </w:r>
-    </w:p>
-    <w:p>
-      <w:pPr>
-        <w:spacing w:before="40" w:after="200"/>
-      </w:pPr>
-      <w:r>
-        <w:rPr>
-          <w:rFonts w:ascii="Calibri" w:hAnsi="Calibri"/>
-          <w:b/>
-          <w:color w:val="F5B62A"/>
-          <w:sz w:val="17"/>
-        </w:rPr>
-        <w:t>183/280 chars</w:t>
-      </w:r>
-    </w:p>
-    <w:p>
-      <w:pPr>
-        <w:spacing w:before="160" w:after="40"/>
-      </w:pPr>
-      <w:r>
-        <w:rPr>
-          <w:rFonts w:ascii="Calibri" w:hAnsi="Calibri"/>
-          <w:b/>
-          <w:color w:val="5D6B64"/>
-          <w:sz w:val="18"/>
-        </w:rPr>
-        <w:t>Saturday · 4 · feature pitch</w:t>
-      </w:r>
-    </w:p>
-    <w:p>
-      <w:pPr>
-        <w:spacing w:before="0" w:after="0" w:line="283" w:lineRule="auto"/>
-        <w:shd w:val="clear" w:color="auto" w:fill="F3F7F4"/>
-        <w:pBdr>
-          <w:top w:val="single" w:sz="8" w:space="8" w:color="CFE7DB"/>
-          <w:bottom w:val="single" w:sz="8" w:space="8" w:color="CFE7DB"/>
-          <w:left w:val="single" w:sz="8" w:space="8" w:color="CFE7DB"/>
-          <w:right w:val="single" w:sz="8" w:space="8" w:color="CFE7DB"/>
-        </w:pBdr>
-      </w:pPr>
-      <w:r>
-        <w:rPr>
-          <w:rFonts w:ascii="Consolas" w:hAnsi="Consolas"/>
-          <w:b w:val="0"/>
-          <w:color w:val="16211D"/>
-          <w:sz w:val="19"/>
-        </w:rPr>
-        <w:t>Players from the same nation build Synergy — a live preview shows your XI's connections as you draft. Run the real 2026 bracket — 8 matches, a perfect run is 8-0. https://www.wcdraft.com/play</w:t>
-      </w:r>
-    </w:p>
-    <w:p>
-      <w:pPr>
-        <w:spacing w:before="40" w:after="200"/>
-      </w:pPr>
-      <w:r>
-        <w:rPr>
-          <w:rFonts w:ascii="Calibri" w:hAnsi="Calibri"/>
-          <w:b/>
-          <w:color w:val="F5B62A"/>
-          <w:sz w:val="17"/>
-        </w:rPr>
-        <w:t>186/280 chars</w:t>
-      </w:r>
-    </w:p>
-    <w:p>
-      <w:pPr>
-        <w:spacing w:before="160" w:after="40"/>
-      </w:pPr>
-      <w:r>
-        <w:rPr>
-          <w:rFonts w:ascii="Calibri" w:hAnsi="Calibri"/>
-          <w:b/>
-          <w:color w:val="5D6B64"/>
-          <w:sz w:val="18"/>
-        </w:rPr>
-        <w:t>Saturday · 5 · daily challenge</w:t>
-      </w:r>
-    </w:p>
-    <w:p>
-      <w:pPr>
-        <w:spacing w:before="0" w:after="0" w:line="283" w:lineRule="auto"/>
-        <w:shd w:val="clear" w:color="auto" w:fill="F3F7F4"/>
-        <w:pBdr>
-          <w:top w:val="single" w:sz="8" w:space="8" w:color="CFE7DB"/>
-          <w:bottom w:val="single" w:sz="8" w:space="8" w:color="CFE7DB"/>
-          <w:left w:val="single" w:sz="8" w:space="8" w:color="CFE7DB"/>
-          <w:right w:val="single" w:sz="8" w:space="8" w:color="CFE7DB"/>
-        </w:pBdr>
-      </w:pPr>
-      <w:r>
-        <w:rPr>
-          <w:rFonts w:ascii="Consolas" w:hAnsi="Consolas"/>
-          <w:b w:val="0"/>
-          <w:color w:val="16211D"/>
-          <w:sz w:val="19"/>
-        </w:rPr>
-        <w:t>Today's spin: West Germany 1978. Who's your pick? Draft across 1930–2026, or narrow to one era. https://www.wcdraft.com/play</w:t>
-      </w:r>
-    </w:p>
-    <w:p>
-      <w:pPr>
-        <w:spacing w:before="40" w:after="200"/>
-      </w:pPr>
-      <w:r>
-        <w:rPr>
-          <w:rFonts w:ascii="Calibri" w:hAnsi="Calibri"/>
-          <w:b/>
-          <w:color w:val="F5B62A"/>
-          <w:sz w:val="17"/>
-        </w:rPr>
-        <w:t>119/280 chars</w:t>
-      </w:r>
-    </w:p>
-    <w:p>
-      <w:pPr>
-        <w:spacing w:before="160" w:after="40"/>
-      </w:pPr>
-      <w:r>
-        <w:rPr>
-          <w:rFonts w:ascii="Calibri" w:hAnsi="Calibri"/>
-          <w:b/>
-          <w:color w:val="5D6B64"/>
-          <w:sz w:val="18"/>
-        </w:rPr>
-        <w:t>Saturday · 6 · factoid</w:t>
-      </w:r>
-    </w:p>
-    <w:p>
-      <w:pPr>
-        <w:spacing w:before="0" w:after="0" w:line="283" w:lineRule="auto"/>
-        <w:shd w:val="clear" w:color="auto" w:fill="F3F7F4"/>
-        <w:pBdr>
-          <w:top w:val="single" w:sz="8" w:space="8" w:color="CFE7DB"/>
-          <w:bottom w:val="single" w:sz="8" w:space="8" w:color="CFE7DB"/>
-          <w:left w:val="single" w:sz="8" w:space="8" w:color="CFE7DB"/>
-          <w:right w:val="single" w:sz="8" w:space="8" w:color="CFE7DB"/>
-        </w:pBdr>
-      </w:pPr>
-      <w:r>
-        <w:rPr>
-          <w:rFonts w:ascii="Consolas" w:hAnsi="Consolas"/>
-          <w:b w:val="0"/>
-          <w:color w:val="16211D"/>
-          <w:sz w:val="19"/>
-        </w:rPr>
-        <w:t>Memory mode hides the numbers until you simulate. Rivaldo (BRA), 1998: a midfielder with 7 appearances that World Cup — in the wcdraft pool. https://www.wcdraft.com/play</w:t>
-      </w:r>
-    </w:p>
-    <w:p>
-      <w:pPr>
-        <w:spacing w:before="40" w:after="200"/>
-      </w:pPr>
-      <w:r>
-        <w:rPr>
-          <w:rFonts w:ascii="Calibri" w:hAnsi="Calibri"/>
-          <w:b/>
-          <w:color w:val="F5B62A"/>
-          <w:sz w:val="17"/>
-        </w:rPr>
-        <w:t>164/280 chars</w:t>
+        <w:t>165/280 chars</w:t>
       </w:r>
     </w:p>
     <w:p>
@@ -2451,7 +2451,7 @@
           <w:color w:val="16211D"/>
           <w:sz w:val="19"/>
         </w:rPr>
-        <w:t>Every run gets a shareable link that replays the exact same draft and result in any browser — same seed, same outcome. Career peak or current form — you pick the rating basis. https://www.wcdraft.com/play</w:t>
+        <w:t>Post your run to a season-keyed ranked leaderboard and see where your XI lands. https://www.wcdraft.com/play</w:t>
       </w:r>
     </w:p>
     <w:p>
@@ -2465,7 +2465,7 @@
           <w:color w:val="F5B62A"/>
           <w:sz w:val="17"/>
         </w:rPr>
-        <w:t>199/280 chars</w:t>
+        <w:t>103/280 chars</w:t>
       </w:r>
     </w:p>
     <w:p>
@@ -2500,7 +2500,7 @@
           <w:color w:val="16211D"/>
           <w:sz w:val="19"/>
         </w:rPr>
-        <w:t>Classic, or Memory — ratings hidden until the reveal. Today's seed: Argentina 1982 — spin it and pick. https://www.wcdraft.com/play</w:t>
+        <w:t>Tomorrow's Group I double-header is France v Iraq and Norway v Senegal. Draft one of those nations tonight; reveal only after the sim. https://www.wcdraft.com/play</w:t>
       </w:r>
     </w:p>
     <w:p>
@@ -2514,7 +2514,7 @@
           <w:color w:val="F5B62A"/>
           <w:sz w:val="17"/>
         </w:rPr>
-        <w:t>126/280 chars</w:t>
+        <w:t>158/280 chars</w:t>
       </w:r>
     </w:p>
     <w:p>
@@ -2549,7 +2549,7 @@
           <w:color w:val="16211D"/>
           <w:sz w:val="19"/>
         </w:rPr>
-        <w:t>Ronaldo (BRA) — a wcdraft all-time legend from the 1998 World Cup squad, 4 goals that tournament. 17 spins, one pick each — 16 players and a manager. https://www.wcdraft.com/play</w:t>
+        <w:t>Classic, or Memory — ratings hidden until the reveal. Pirlo (ITA), 2010: a midfielder with 1 appearance that World Cup — in the wcdraft pool. https://www.wcdraft.com/play</w:t>
       </w:r>
     </w:p>
     <w:p>
@@ -2563,7 +2563,7 @@
           <w:color w:val="F5B62A"/>
           <w:sz w:val="17"/>
         </w:rPr>
-        <w:t>173/280 chars</w:t>
+        <w:t>165/280 chars</w:t>
       </w:r>
     </w:p>
     <w:p>
@@ -2598,7 +2598,7 @@
           <w:color w:val="16211D"/>
           <w:sz w:val="19"/>
         </w:rPr>
-        <w:t>Seventeen spins, one pick on each: sixteen players for your XI and bench, plus one manager. There's a season-keyed leaderboard — post your run. https://www.wcdraft.com/play</w:t>
+        <w:t>wcdraft is free and runs entirely in your browser — no app, no download, no account needed to play. Managers are a pick here — one of your 17 spins. https://www.wcdraft.com/play</w:t>
       </w:r>
     </w:p>
     <w:p>
@@ -2612,7 +2612,7 @@
           <w:color w:val="F5B62A"/>
           <w:sz w:val="17"/>
         </w:rPr>
-        <w:t>167/280 chars</w:t>
+        <w:t>172/280 chars</w:t>
       </w:r>
     </w:p>
     <w:p>
@@ -2647,7 +2647,7 @@
           <w:color w:val="16211D"/>
           <w:sz w:val="19"/>
         </w:rPr>
-        <w:t>Netherlands 1974 just rolled. One pick — who makes your all-time XI? 16 players + a manager, one spin at a time. https://www.wcdraft.com/play</w:t>
+        <w:t>England 1982 just rolled. One pick — who makes your all-time XI? No app store, no install — just open it and draft. https://www.wcdraft.com/play</w:t>
       </w:r>
     </w:p>
     <w:p>
@@ -2661,7 +2661,7 @@
           <w:color w:val="F5B62A"/>
           <w:sz w:val="17"/>
         </w:rPr>
-        <w:t>136/280 chars</w:t>
+        <w:t>139/280 chars</w:t>
       </w:r>
     </w:p>
     <w:p>
@@ -2696,7 +2696,7 @@
           <w:color w:val="16211D"/>
           <w:sz w:val="19"/>
         </w:rPr>
-        <w:t>There's a season-keyed leaderboard — post your run. Buffon (ITA) — a wcdraft all-time legend from the 1998 World Cup squad: a goalkeeper you can draft into your all-time XI. https://www.wcdraft.com/play</w:t>
+        <w:t>Nation Synergy rewards a connected XI. Drogba (CIV) — a wcdraft all-time legend from the 2014 World Cup squad: a forward you can draft into your all-time XI. https://www.wcdraft.com/play</w:t>
       </w:r>
     </w:p>
     <w:p>
@@ -2710,7 +2710,7 @@
           <w:color w:val="F5B62A"/>
           <w:sz w:val="17"/>
         </w:rPr>
-        <w:t>197/280 chars</w:t>
+        <w:t>181/280 chars</w:t>
       </w:r>
     </w:p>
     <w:p>
@@ -2742,63 +2742,6 @@
           <w:sz w:val="21"/>
         </w:rPr>
         <w:t>Post one only when you (or a player) have a genuinely strong real run. The record is computed from a real share token — never invented.</w:t>
-      </w:r>
-    </w:p>
-    <w:p>
-      <w:pPr>
-        <w:spacing w:before="160" w:after="40"/>
-      </w:pPr>
-      <w:r>
-        <w:rPr>
-          <w:rFonts w:ascii="Calibri" w:hAnsi="Calibri"/>
-          <w:b/>
-          <w:color w:val="5D6B64"/>
-          <w:sz w:val="18"/>
-        </w:rPr>
-        <w:t>Result spotlight · 1 · result spotlight</w:t>
-      </w:r>
-    </w:p>
-    <w:p>
-      <w:pPr>
-        <w:spacing w:before="0" w:after="0" w:line="283" w:lineRule="auto"/>
-        <w:shd w:val="clear" w:color="auto" w:fill="F3F7F4"/>
-        <w:pBdr>
-          <w:top w:val="single" w:sz="8" w:space="8" w:color="CFE7DB"/>
-          <w:bottom w:val="single" w:sz="8" w:space="8" w:color="CFE7DB"/>
-          <w:left w:val="single" w:sz="8" w:space="8" w:color="CFE7DB"/>
-          <w:right w:val="single" w:sz="8" w:space="8" w:color="CFE7DB"/>
-        </w:pBdr>
-      </w:pPr>
-      <w:r>
-        <w:rPr>
-          <w:rFonts w:ascii="Consolas" w:hAnsi="Consolas"/>
-          <w:b w:val="0"/>
-          <w:color w:val="16211D"/>
-          <w:sz w:val="19"/>
-        </w:rPr>
-        <w:t>Career peak or current form — you pick the rating basis. Azteca XI finished 2-0-2, 7 for / 7 against — same seed, same outcome, any browser: https://www.wcdraft.com/play/share?run=t2.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</w:t>
-      </w:r>
-    </w:p>
-    <w:p>
-      <w:pPr>
-        <w:spacing w:before="40" w:after="200"/>
-      </w:pPr>
-      <w:r>
-        <w:rPr>
-          <w:rFonts w:ascii="Calibri" w:hAnsi="Calibri"/>
-          <w:b/>
-          <w:color w:val="F5B62A"/>
-          <w:sz w:val="17"/>
-        </w:rPr>
-        <w:t>164/280 chars</w:t>
-      </w:r>
-      <w:r>
-        <w:rPr>
-          <w:i/>
-          <w:color w:val="5D6B64"/>
-          <w:sz w:val="17"/>
-        </w:rPr>
-        <w:t xml:space="preserve">   SAMPLE run — replace with your own strong run's share link before posting</w:t>
       </w:r>
     </w:p>
     <w:p>

</xml_diff>